<commit_message>
Manuals: AP fallback after three failed network boots, SSID list placeholder (RingClock/BitClock rev 5, WordClock 1-4 rev 2, WordClock 5 rev 5, Zev-7)
</commit_message>
<xml_diff>
--- a/WordClock 1-4 Operator Manual.docx
+++ b/WordClock 1-4 Operator Manual.docx
@@ -318,7 +318,7 @@
           <w:color w:val="000000"/>
           <w:sz w:val="24"/>
         </w:rPr>
-        <w:t>April 2026</w:t>
+        <w:t>October 2026</w:t>
       </w:r>
     </w:p>
     <w:p>
@@ -375,7 +375,7 @@
                 <w:rFonts w:ascii="Arial" w:hAnsi="Arial"/>
                 <w:sz w:val="21"/>
               </w:rPr>
-              <w:t>Initial release</w:t>
+              <w:t>Updated guide (Revision 2)</w:t>
             </w:r>
           </w:p>
         </w:tc>
@@ -408,7 +408,7 @@
                 <w:rFonts w:ascii="Arial" w:hAnsi="Arial"/>
                 <w:sz w:val="21"/>
               </w:rPr>
-              <w:t>V9.0.13</w:t>
+              <w:t>V3.7</w:t>
             </w:r>
           </w:p>
         </w:tc>
@@ -465,8 +465,8 @@
     <w:p>
       <w:pPr>
         <w:sectPr>
-          <w:headerReference w:type="default" r:id="rId99"/>
-          <w:footerReference w:type="default" r:id="rId100"/>
+          <w:headerReference w:type="default" r:id="rId141"/>
+          <w:footerReference w:type="default" r:id="rId142"/>
           <w:pgSz w:w="12240" w:h="15840"/>
           <w:pgMar w:top="1440" w:right="1800" w:bottom="1440" w:left="1800" w:header="720" w:footer="720" w:gutter="0"/>
           <w:cols w:space="720"/>
@@ -1104,8 +1104,8 @@
     <w:p>
       <w:pPr>
         <w:sectPr>
-          <w:headerReference w:type="default" r:id="rId101"/>
-          <w:footerReference w:type="default" r:id="rId102"/>
+          <w:headerReference w:type="default" r:id="rId143"/>
+          <w:footerReference w:type="default" r:id="rId144"/>
           <w:pgSz w:w="12240" w:h="15840"/>
           <w:pgMar w:top="1440" w:right="1800" w:bottom="1440" w:left="1800" w:header="720" w:footer="720" w:gutter="0"/>
           <w:cols w:space="720"/>
@@ -1256,7 +1256,7 @@
           <w:rFonts w:ascii="Arial" w:hAnsi="Arial"/>
           <w:sz w:val="22"/>
         </w:rPr>
-        <w:t>On the Setup page, select the home WiFi network from the SSID list and enter the password.</w:t>
+        <w:t>On the Setup page, select the home WiFi network from the SSID list and enter the password. On a clock with no saved network the list starts on "-- select your network --"; select the home network before pressing Start.</w:t>
       </w:r>
     </w:p>
     <w:p>
@@ -1322,6 +1322,15 @@
       </w:r>
     </w:p>
     <w:p>
+      <w:r>
+        <w:rPr>
+          <w:rFonts w:ascii="Arial" w:hAnsi="Arial"/>
+          <w:sz w:val="22"/>
+        </w:rPr>
+        <w:t>If the Wi-Fi connection and NTP sync have not both completed within about two minutes, the clock reboots and tries again. After three failed boots in a row (for example a wrong Wi-Fi password or a renamed network), the next boot starts AP mode instead, so the Wi-Fi settings can be corrected at 192.168.4.1. Because each attempt allows about two minutes, this takes several minutes. This forced AP mode lasts for that one boot only: correct the settings and press Start to save them and reboot into normal operation. Pressing Save without Start stores the settings but does not keep the clock in AP mode; the next power-cycle tries the saved network again. If the network was only temporarily down (router rebooting, internet outage), power-cycling the clock returns it to normal operation.</w:t>
+      </w:r>
+    </w:p>
+    <w:p>
       <w:pPr>
         <w:pStyle w:val="Heading2"/>
         <w:keepNext/>
@@ -1628,8 +1637,8 @@
     <w:p>
       <w:pPr>
         <w:sectPr>
-          <w:headerReference w:type="default" r:id="rId103"/>
-          <w:footerReference w:type="default" r:id="rId104"/>
+          <w:headerReference w:type="default" r:id="rId145"/>
+          <w:footerReference w:type="default" r:id="rId146"/>
           <w:pgSz w:w="12240" w:h="15840"/>
           <w:pgMar w:top="1440" w:right="1800" w:bottom="1440" w:left="1800" w:header="720" w:footer="720" w:gutter="0"/>
           <w:cols w:space="720"/>
@@ -1723,8 +1732,8 @@
     <w:p>
       <w:pPr>
         <w:sectPr>
-          <w:headerReference w:type="default" r:id="rId105"/>
-          <w:footerReference w:type="default" r:id="rId106"/>
+          <w:headerReference w:type="default" r:id="rId147"/>
+          <w:footerReference w:type="default" r:id="rId148"/>
           <w:pgSz w:w="12240" w:h="15840"/>
           <w:pgMar w:top="1440" w:right="1800" w:bottom="1440" w:left="1800" w:header="720" w:footer="720" w:gutter="0"/>
           <w:cols w:space="720"/>
@@ -2522,8 +2531,8 @@
     <w:p>
       <w:pPr>
         <w:sectPr>
-          <w:headerReference w:type="default" r:id="rId107"/>
-          <w:footerReference w:type="default" r:id="rId108"/>
+          <w:headerReference w:type="default" r:id="rId149"/>
+          <w:footerReference w:type="default" r:id="rId150"/>
           <w:pgSz w:w="12240" w:h="15840"/>
           <w:pgMar w:top="1440" w:right="1800" w:bottom="1440" w:left="1800" w:header="720" w:footer="720" w:gutter="0"/>
           <w:cols w:space="720"/>
@@ -2599,8 +2608,8 @@
     <w:p>
       <w:pPr>
         <w:sectPr>
-          <w:headerReference w:type="default" r:id="rId109"/>
-          <w:footerReference w:type="default" r:id="rId110"/>
+          <w:headerReference w:type="default" r:id="rId151"/>
+          <w:footerReference w:type="default" r:id="rId152"/>
           <w:pgSz w:w="12240" w:h="15840"/>
           <w:pgMar w:top="1440" w:right="1800" w:bottom="1440" w:left="1800" w:header="720" w:footer="720" w:gutter="0"/>
           <w:cols w:space="720"/>
@@ -3003,8 +3012,8 @@
     <w:p>
       <w:pPr>
         <w:sectPr>
-          <w:headerReference w:type="default" r:id="rId111"/>
-          <w:footerReference w:type="default" r:id="rId112"/>
+          <w:headerReference w:type="default" r:id="rId153"/>
+          <w:footerReference w:type="default" r:id="rId154"/>
           <w:pgSz w:w="12240" w:h="15840"/>
           <w:pgMar w:top="1440" w:right="1800" w:bottom="1440" w:left="1800" w:header="720" w:footer="720" w:gutter="0"/>
           <w:cols w:space="720"/>
@@ -3200,8 +3209,8 @@
     <w:p>
       <w:pPr>
         <w:sectPr>
-          <w:headerReference w:type="default" r:id="rId113"/>
-          <w:footerReference w:type="default" r:id="rId114"/>
+          <w:headerReference w:type="default" r:id="rId155"/>
+          <w:footerReference w:type="default" r:id="rId156"/>
           <w:pgSz w:w="12240" w:h="15840"/>
           <w:pgMar w:top="1440" w:right="1800" w:bottom="1440" w:left="1800" w:header="720" w:footer="720" w:gutter="0"/>
           <w:cols w:space="720"/>
@@ -3300,7 +3309,19 @@
           <w:rFonts w:ascii="Arial" w:hAnsi="Arial"/>
           <w:sz w:val="22"/>
         </w:rPr>
-        <w:t>Power on a brand-new clock — it boots directly into AP mode</w:t>
+        <w:t>Power on a brand-new clock — it boots directly into AP mode, OR</w:t>
+      </w:r>
+    </w:p>
+    <w:p>
+      <w:pPr>
+        <w:pStyle w:val="ListBullet"/>
+      </w:pPr>
+      <w:r>
+        <w:rPr>
+          <w:rFonts w:ascii="Arial" w:hAnsi="Arial"/>
+          <w:sz w:val="22"/>
+        </w:rPr>
+        <w:t>After three boots in a row that fail to connect to Wi-Fi and sync the time, the next boot starts AP mode for that one boot (see Quick Start, step 4). Press Start after correcting the settings; power-cycling instead retries the saved network.</w:t>
       </w:r>
     </w:p>
     <w:p>
@@ -6523,8 +6544,8 @@
     <w:p>
       <w:pPr>
         <w:sectPr>
-          <w:headerReference w:type="default" r:id="rId115"/>
-          <w:footerReference w:type="default" r:id="rId116"/>
+          <w:headerReference w:type="default" r:id="rId157"/>
+          <w:footerReference w:type="default" r:id="rId158"/>
           <w:pgSz w:w="12240" w:h="15840"/>
           <w:pgMar w:top="1440" w:right="1800" w:bottom="1440" w:left="1800" w:header="720" w:footer="720" w:gutter="0"/>
           <w:cols w:space="720"/>
@@ -7001,8 +7022,8 @@
     <w:p>
       <w:pPr>
         <w:sectPr>
-          <w:headerReference w:type="default" r:id="rId117"/>
-          <w:footerReference w:type="default" r:id="rId118"/>
+          <w:headerReference w:type="default" r:id="rId159"/>
+          <w:footerReference w:type="default" r:id="rId160"/>
           <w:pgSz w:w="12240" w:h="15840"/>
           <w:pgMar w:top="1440" w:right="1800" w:bottom="1440" w:left="1800" w:header="720" w:footer="720" w:gutter="0"/>
           <w:cols w:space="720"/>
@@ -7384,8 +7405,8 @@
     <w:p>
       <w:pPr>
         <w:sectPr>
-          <w:headerReference w:type="default" r:id="rId119"/>
-          <w:footerReference w:type="default" r:id="rId120"/>
+          <w:headerReference w:type="default" r:id="rId161"/>
+          <w:footerReference w:type="default" r:id="rId162"/>
           <w:pgSz w:w="12240" w:h="15840"/>
           <w:pgMar w:top="1440" w:right="1800" w:bottom="1440" w:left="1800" w:header="720" w:footer="720" w:gutter="0"/>
           <w:cols w:space="720"/>
@@ -8143,8 +8164,8 @@
     <w:p>
       <w:pPr>
         <w:sectPr>
-          <w:headerReference w:type="default" r:id="rId121"/>
-          <w:footerReference w:type="default" r:id="rId122"/>
+          <w:headerReference w:type="default" r:id="rId163"/>
+          <w:footerReference w:type="default" r:id="rId164"/>
           <w:pgSz w:w="12240" w:h="15840"/>
           <w:pgMar w:top="1440" w:right="1800" w:bottom="1440" w:left="1800" w:header="720" w:footer="720" w:gutter="0"/>
           <w:cols w:space="720"/>
@@ -8746,8 +8767,8 @@
     <w:p>
       <w:pPr>
         <w:sectPr>
-          <w:headerReference w:type="default" r:id="rId123"/>
-          <w:footerReference w:type="default" r:id="rId124"/>
+          <w:headerReference w:type="default" r:id="rId165"/>
+          <w:footerReference w:type="default" r:id="rId166"/>
           <w:pgSz w:w="12240" w:h="15840"/>
           <w:pgMar w:top="1440" w:right="1800" w:bottom="1440" w:left="1800" w:header="720" w:footer="720" w:gutter="0"/>
           <w:cols w:space="720"/>
@@ -8937,8 +8958,8 @@
     <w:p>
       <w:pPr>
         <w:sectPr>
-          <w:headerReference w:type="default" r:id="rId125"/>
-          <w:footerReference w:type="default" r:id="rId126"/>
+          <w:headerReference w:type="default" r:id="rId167"/>
+          <w:footerReference w:type="default" r:id="rId168"/>
           <w:pgSz w:w="12240" w:h="15840"/>
           <w:pgMar w:top="1440" w:right="1800" w:bottom="1440" w:left="1800" w:header="720" w:footer="720" w:gutter="0"/>
           <w:cols w:space="720"/>
@@ -9374,8 +9395,8 @@
     <w:p>
       <w:pPr>
         <w:sectPr>
-          <w:headerReference w:type="default" r:id="rId127"/>
-          <w:footerReference w:type="default" r:id="rId128"/>
+          <w:headerReference w:type="default" r:id="rId169"/>
+          <w:footerReference w:type="default" r:id="rId170"/>
           <w:pgSz w:w="12240" w:h="15840"/>
           <w:pgMar w:top="1440" w:right="1800" w:bottom="1440" w:left="1800" w:header="720" w:footer="720" w:gutter="0"/>
           <w:cols w:space="720"/>
@@ -9529,8 +9550,8 @@
     <w:p>
       <w:pPr>
         <w:sectPr>
-          <w:headerReference w:type="default" r:id="rId129"/>
-          <w:footerReference w:type="default" r:id="rId130"/>
+          <w:headerReference w:type="default" r:id="rId171"/>
+          <w:footerReference w:type="default" r:id="rId172"/>
           <w:pgSz w:w="12240" w:h="15840"/>
           <w:pgMar w:top="1440" w:right="1800" w:bottom="1440" w:left="1800" w:header="720" w:footer="720" w:gutter="0"/>
           <w:cols w:space="720"/>
@@ -9684,8 +9705,8 @@
     <w:p>
       <w:pPr>
         <w:sectPr>
-          <w:headerReference w:type="default" r:id="rId131"/>
-          <w:footerReference w:type="default" r:id="rId132"/>
+          <w:headerReference w:type="default" r:id="rId173"/>
+          <w:footerReference w:type="default" r:id="rId174"/>
           <w:pgSz w:w="12240" w:h="15840"/>
           <w:pgMar w:top="1440" w:right="1800" w:bottom="1440" w:left="1800" w:header="720" w:footer="720" w:gutter="0"/>
           <w:cols w:space="720"/>
@@ -10242,8 +10263,8 @@
     <w:p>
       <w:pPr>
         <w:sectPr>
-          <w:headerReference w:type="default" r:id="rId133"/>
-          <w:footerReference w:type="default" r:id="rId134"/>
+          <w:headerReference w:type="default" r:id="rId175"/>
+          <w:footerReference w:type="default" r:id="rId176"/>
           <w:pgSz w:w="12240" w:h="15840"/>
           <w:pgMar w:top="1440" w:right="1800" w:bottom="1440" w:left="1800" w:header="720" w:footer="720" w:gutter="0"/>
           <w:cols w:space="720"/>
@@ -10364,8 +10385,8 @@
     <w:p>
       <w:pPr>
         <w:sectPr>
-          <w:headerReference w:type="default" r:id="rId135"/>
-          <w:footerReference w:type="default" r:id="rId136"/>
+          <w:headerReference w:type="default" r:id="rId177"/>
+          <w:footerReference w:type="default" r:id="rId178"/>
           <w:pgSz w:w="12240" w:h="15840"/>
           <w:pgMar w:top="1440" w:right="1800" w:bottom="1440" w:left="1800" w:header="720" w:footer="720" w:gutter="0"/>
           <w:cols w:space="720"/>
@@ -11070,8 +11091,8 @@
     <w:p>
       <w:pPr>
         <w:sectPr>
-          <w:headerReference w:type="default" r:id="rId137"/>
-          <w:footerReference w:type="default" r:id="rId138"/>
+          <w:headerReference w:type="default" r:id="rId179"/>
+          <w:footerReference w:type="default" r:id="rId180"/>
           <w:pgSz w:w="12240" w:h="15840"/>
           <w:pgMar w:top="1440" w:right="1800" w:bottom="1440" w:left="1800" w:header="720" w:footer="720" w:gutter="0"/>
           <w:cols w:space="720"/>
@@ -11500,6 +11521,50 @@
                 <w:rFonts w:ascii="Arial" w:hAnsi="Arial"/>
                 <w:sz w:val="20"/>
               </w:rPr>
+              <w:t>Clock shows "AP" after a Wi-Fi password change or network rename</w:t>
+            </w:r>
+          </w:p>
+        </w:tc>
+        <w:tc>
+          <w:tcPr>
+            <w:tcW w:type="dxa" w:w="2880"/>
+          </w:tcPr>
+          <w:p>
+            <w:r>
+              <w:rPr>
+                <w:rFonts w:ascii="Arial" w:hAnsi="Arial"/>
+                <w:sz w:val="20"/>
+              </w:rPr>
+              <w:t>Three boots in a row failed to connect to Wi-Fi and sync the time</w:t>
+            </w:r>
+          </w:p>
+        </w:tc>
+        <w:tc>
+          <w:tcPr>
+            <w:tcW w:type="dxa" w:w="2880"/>
+          </w:tcPr>
+          <w:p>
+            <w:r>
+              <w:rPr>
+                <w:rFonts w:ascii="Arial" w:hAnsi="Arial"/>
+                <w:sz w:val="20"/>
+              </w:rPr>
+              <w:t>Connect to the WordClock-X-X Wi-Fi, correct the SSID and password at 192.168.4.1, and press Start. If the network was only temporarily down (router reboot or internet outage), power-cycle the clock instead; it retries the saved network.</w:t>
+            </w:r>
+          </w:p>
+        </w:tc>
+      </w:tr>
+      <w:tr>
+        <w:tc>
+          <w:tcPr>
+            <w:tcW w:type="dxa" w:w="2880"/>
+          </w:tcPr>
+          <w:p>
+            <w:r>
+              <w:rPr>
+                <w:rFonts w:ascii="Arial" w:hAnsi="Arial"/>
+                <w:sz w:val="20"/>
+              </w:rPr>
               <w:t>Time is wrong by a whole hour</w:t>
             </w:r>
           </w:p>
@@ -12066,8 +12131,8 @@
     <w:p>
       <w:pPr>
         <w:sectPr>
-          <w:headerReference w:type="default" r:id="rId139"/>
-          <w:footerReference w:type="default" r:id="rId140"/>
+          <w:headerReference w:type="default" r:id="rId181"/>
+          <w:footerReference w:type="default" r:id="rId182"/>
           <w:pgSz w:w="12240" w:h="15840"/>
           <w:pgMar w:top="1440" w:right="1800" w:bottom="1440" w:left="1800" w:header="720" w:footer="720" w:gutter="0"/>
           <w:cols w:space="720"/>
@@ -12159,8 +12224,8 @@
       </w:r>
     </w:p>
     <w:sectPr>
-      <w:headerReference w:type="default" r:id="rId141"/>
-      <w:footerReference w:type="default" r:id="rId142"/>
+      <w:headerReference w:type="default" r:id="rId183"/>
+      <w:footerReference w:type="default" r:id="rId184"/>
       <w:pgSz w:w="12240" w:h="15840"/>
       <w:pgMar w:top="1440" w:right="1800" w:bottom="1440" w:left="1800" w:header="720" w:footer="720" w:gutter="0"/>
       <w:cols w:space="720"/>
@@ -15109,13 +15174,252 @@
       </w:pBdr>
     </w:pPr>
     <w:r/>
+  </w:p>
+</w:ftr>
+</file>
+
+<file path=word/footer65.xml><?xml version="1.0" encoding="utf-8"?>
+<w:ftr xmlns:m="http://schemas.openxmlformats.org/officeDocument/2006/math" xmlns:mc="http://schemas.openxmlformats.org/markup-compatibility/2006" xmlns:mo="http://schemas.microsoft.com/office/mac/office/2008/main" xmlns:mv="urn:schemas-microsoft-com:mac:vml" xmlns:o="urn:schemas-microsoft-com:office:office" xmlns:r="http://schemas.openxmlformats.org/officeDocument/2006/relationships" xmlns:v="urn:schemas-microsoft-com:vml" xmlns:w10="urn:schemas-microsoft-com:office:word" xmlns:w14="http://schemas.microsoft.com/office/word/2010/wordml" xmlns:w="http://schemas.openxmlformats.org/wordprocessingml/2006/main" xmlns:wne="http://schemas.microsoft.com/office/word/2006/wordml" xmlns:wp14="http://schemas.microsoft.com/office/word/2010/wordprocessingDrawing" xmlns:wp="http://schemas.openxmlformats.org/drawingml/2006/wordprocessingDrawing" xmlns:wpc="http://schemas.microsoft.com/office/word/2010/wordprocessingCanvas" xmlns:wpg="http://schemas.microsoft.com/office/word/2010/wordprocessingGroup" xmlns:wpi="http://schemas.microsoft.com/office/word/2010/wordprocessingInk" xmlns:wps="http://schemas.microsoft.com/office/word/2010/wordprocessingShape" mc:Ignorable="w14 wp14">
+  <w:p>
+    <w:pPr>
+      <w:pStyle w:val="Footer"/>
+      <w:spacing w:before="40"/>
+      <w:jc w:val="left"/>
+      <w:pBdr>
+        <w:top w:val="single" w:sz="4" w:space="2" w:color="808080"/>
+      </w:pBdr>
+    </w:pPr>
+    <w:r/>
     <w:r>
       <w:rPr>
         <w:rFonts w:ascii="Arial" w:hAnsi="Arial"/>
         <w:color w:val="555555"/>
         <w:sz w:val="20"/>
       </w:rPr>
-      <w:t>Revision 1 — April 2026</w:t>
+      <w:t>Revision 2 — October 2026</w:t>
+    </w:r>
+    <w:r>
+      <w:rPr>
+        <w:rFonts w:ascii="Arial" w:hAnsi="Arial"/>
+      </w:rPr>
+      <w:tab/>
+      <w:tab/>
+    </w:r>
+    <w:r>
+      <w:rPr>
+        <w:rFonts w:ascii="Arial" w:hAnsi="Arial"/>
+        <w:color w:val="555555"/>
+        <w:sz w:val="20"/>
+      </w:rPr>
+      <w:fldChar w:fldCharType="begin"/>
+      <w:instrText xml:space="preserve"> PAGE </w:instrText>
+      <w:fldChar w:fldCharType="separate"/>
+      <w:t>1</w:t>
+      <w:fldChar w:fldCharType="end"/>
+    </w:r>
+  </w:p>
+</w:ftr>
+</file>
+
+<file path=word/footer66.xml><?xml version="1.0" encoding="utf-8"?>
+<w:ftr xmlns:m="http://schemas.openxmlformats.org/officeDocument/2006/math" xmlns:mc="http://schemas.openxmlformats.org/markup-compatibility/2006" xmlns:mo="http://schemas.microsoft.com/office/mac/office/2008/main" xmlns:mv="urn:schemas-microsoft-com:mac:vml" xmlns:o="urn:schemas-microsoft-com:office:office" xmlns:r="http://schemas.openxmlformats.org/officeDocument/2006/relationships" xmlns:v="urn:schemas-microsoft-com:vml" xmlns:w10="urn:schemas-microsoft-com:office:word" xmlns:w14="http://schemas.microsoft.com/office/word/2010/wordml" xmlns:w="http://schemas.openxmlformats.org/wordprocessingml/2006/main" xmlns:wne="http://schemas.microsoft.com/office/word/2006/wordml" xmlns:wp14="http://schemas.microsoft.com/office/word/2010/wordprocessingDrawing" xmlns:wp="http://schemas.openxmlformats.org/drawingml/2006/wordprocessingDrawing" xmlns:wpc="http://schemas.microsoft.com/office/word/2010/wordprocessingCanvas" xmlns:wpg="http://schemas.microsoft.com/office/word/2010/wordprocessingGroup" xmlns:wpi="http://schemas.microsoft.com/office/word/2010/wordprocessingInk" xmlns:wps="http://schemas.microsoft.com/office/word/2010/wordprocessingShape" mc:Ignorable="w14 wp14">
+  <w:p>
+    <w:pPr>
+      <w:pStyle w:val="Footer"/>
+      <w:spacing w:before="40"/>
+      <w:jc w:val="left"/>
+      <w:pBdr>
+        <w:top w:val="single" w:sz="4" w:space="2" w:color="808080"/>
+      </w:pBdr>
+    </w:pPr>
+    <w:r/>
+    <w:r>
+      <w:rPr>
+        <w:rFonts w:ascii="Arial" w:hAnsi="Arial"/>
+        <w:color w:val="555555"/>
+        <w:sz w:val="20"/>
+      </w:rPr>
+      <w:t>Revision 2 — October 2026</w:t>
+    </w:r>
+    <w:r>
+      <w:rPr>
+        <w:rFonts w:ascii="Arial" w:hAnsi="Arial"/>
+      </w:rPr>
+      <w:tab/>
+      <w:tab/>
+    </w:r>
+    <w:r>
+      <w:rPr>
+        <w:rFonts w:ascii="Arial" w:hAnsi="Arial"/>
+        <w:color w:val="555555"/>
+        <w:sz w:val="20"/>
+      </w:rPr>
+      <w:t>QS-</w:t>
+    </w:r>
+    <w:r>
+      <w:rPr>
+        <w:rFonts w:ascii="Arial" w:hAnsi="Arial"/>
+        <w:color w:val="555555"/>
+        <w:sz w:val="20"/>
+      </w:rPr>
+      <w:fldChar w:fldCharType="begin"/>
+      <w:instrText xml:space="preserve"> PAGE </w:instrText>
+      <w:fldChar w:fldCharType="separate"/>
+      <w:t>1</w:t>
+      <w:fldChar w:fldCharType="end"/>
+    </w:r>
+  </w:p>
+</w:ftr>
+</file>
+
+<file path=word/footer67.xml><?xml version="1.0" encoding="utf-8"?>
+<w:ftr xmlns:m="http://schemas.openxmlformats.org/officeDocument/2006/math" xmlns:mc="http://schemas.openxmlformats.org/markup-compatibility/2006" xmlns:mo="http://schemas.microsoft.com/office/mac/office/2008/main" xmlns:mv="urn:schemas-microsoft-com:mac:vml" xmlns:o="urn:schemas-microsoft-com:office:office" xmlns:r="http://schemas.openxmlformats.org/officeDocument/2006/relationships" xmlns:v="urn:schemas-microsoft-com:vml" xmlns:w10="urn:schemas-microsoft-com:office:word" xmlns:w14="http://schemas.microsoft.com/office/word/2010/wordml" xmlns:w="http://schemas.openxmlformats.org/wordprocessingml/2006/main" xmlns:wne="http://schemas.microsoft.com/office/word/2006/wordml" xmlns:wp14="http://schemas.microsoft.com/office/word/2010/wordprocessingDrawing" xmlns:wp="http://schemas.openxmlformats.org/drawingml/2006/wordprocessingDrawing" xmlns:wpc="http://schemas.microsoft.com/office/word/2010/wordprocessingCanvas" xmlns:wpg="http://schemas.microsoft.com/office/word/2010/wordprocessingGroup" xmlns:wpi="http://schemas.microsoft.com/office/word/2010/wordprocessingInk" xmlns:wps="http://schemas.microsoft.com/office/word/2010/wordprocessingShape" mc:Ignorable="w14 wp14">
+  <w:p>
+    <w:pPr>
+      <w:pStyle w:val="Footer"/>
+      <w:spacing w:before="40"/>
+      <w:jc w:val="left"/>
+      <w:pBdr>
+        <w:top w:val="single" w:sz="4" w:space="2" w:color="808080"/>
+      </w:pBdr>
+    </w:pPr>
+    <w:r/>
+    <w:r>
+      <w:rPr>
+        <w:rFonts w:ascii="Arial" w:hAnsi="Arial"/>
+        <w:color w:val="555555"/>
+        <w:sz w:val="20"/>
+      </w:rPr>
+      <w:t>Revision 2 — October 2026</w:t>
+    </w:r>
+    <w:r>
+      <w:rPr>
+        <w:rFonts w:ascii="Arial" w:hAnsi="Arial"/>
+      </w:rPr>
+      <w:tab/>
+      <w:tab/>
+    </w:r>
+    <w:r>
+      <w:rPr>
+        <w:rFonts w:ascii="Arial" w:hAnsi="Arial"/>
+        <w:color w:val="555555"/>
+        <w:sz w:val="20"/>
+      </w:rPr>
+      <w:t>1-</w:t>
+    </w:r>
+    <w:r>
+      <w:rPr>
+        <w:rFonts w:ascii="Arial" w:hAnsi="Arial"/>
+        <w:color w:val="555555"/>
+        <w:sz w:val="20"/>
+      </w:rPr>
+      <w:fldChar w:fldCharType="begin"/>
+      <w:instrText xml:space="preserve"> PAGE </w:instrText>
+      <w:fldChar w:fldCharType="separate"/>
+      <w:t>1</w:t>
+      <w:fldChar w:fldCharType="end"/>
+    </w:r>
+  </w:p>
+</w:ftr>
+</file>
+
+<file path=word/footer68.xml><?xml version="1.0" encoding="utf-8"?>
+<w:ftr xmlns:m="http://schemas.openxmlformats.org/officeDocument/2006/math" xmlns:mc="http://schemas.openxmlformats.org/markup-compatibility/2006" xmlns:mo="http://schemas.microsoft.com/office/mac/office/2008/main" xmlns:mv="urn:schemas-microsoft-com:mac:vml" xmlns:o="urn:schemas-microsoft-com:office:office" xmlns:r="http://schemas.openxmlformats.org/officeDocument/2006/relationships" xmlns:v="urn:schemas-microsoft-com:vml" xmlns:w10="urn:schemas-microsoft-com:office:word" xmlns:w14="http://schemas.microsoft.com/office/word/2010/wordml" xmlns:w="http://schemas.openxmlformats.org/wordprocessingml/2006/main" xmlns:wne="http://schemas.microsoft.com/office/word/2006/wordml" xmlns:wp14="http://schemas.microsoft.com/office/word/2010/wordprocessingDrawing" xmlns:wp="http://schemas.openxmlformats.org/drawingml/2006/wordprocessingDrawing" xmlns:wpc="http://schemas.microsoft.com/office/word/2010/wordprocessingCanvas" xmlns:wpg="http://schemas.microsoft.com/office/word/2010/wordprocessingGroup" xmlns:wpi="http://schemas.microsoft.com/office/word/2010/wordprocessingInk" xmlns:wps="http://schemas.microsoft.com/office/word/2010/wordprocessingShape" mc:Ignorable="w14 wp14">
+  <w:p>
+    <w:pPr>
+      <w:pStyle w:val="Footer"/>
+      <w:spacing w:before="40"/>
+      <w:jc w:val="left"/>
+      <w:pBdr>
+        <w:top w:val="single" w:sz="4" w:space="2" w:color="808080"/>
+      </w:pBdr>
+    </w:pPr>
+    <w:r/>
+    <w:r>
+      <w:rPr>
+        <w:rFonts w:ascii="Arial" w:hAnsi="Arial"/>
+        <w:color w:val="555555"/>
+        <w:sz w:val="20"/>
+      </w:rPr>
+      <w:t>Revision 2 — October 2026</w:t>
+    </w:r>
+    <w:r>
+      <w:rPr>
+        <w:rFonts w:ascii="Arial" w:hAnsi="Arial"/>
+      </w:rPr>
+      <w:tab/>
+      <w:tab/>
+    </w:r>
+    <w:r>
+      <w:rPr>
+        <w:rFonts w:ascii="Arial" w:hAnsi="Arial"/>
+        <w:color w:val="555555"/>
+        <w:sz w:val="20"/>
+      </w:rPr>
+      <w:t>2-</w:t>
+    </w:r>
+    <w:r>
+      <w:rPr>
+        <w:rFonts w:ascii="Arial" w:hAnsi="Arial"/>
+        <w:color w:val="555555"/>
+        <w:sz w:val="20"/>
+      </w:rPr>
+      <w:fldChar w:fldCharType="begin"/>
+      <w:instrText xml:space="preserve"> PAGE </w:instrText>
+      <w:fldChar w:fldCharType="separate"/>
+      <w:t>1</w:t>
+      <w:fldChar w:fldCharType="end"/>
+    </w:r>
+  </w:p>
+</w:ftr>
+</file>
+
+<file path=word/footer69.xml><?xml version="1.0" encoding="utf-8"?>
+<w:ftr xmlns:m="http://schemas.openxmlformats.org/officeDocument/2006/math" xmlns:mc="http://schemas.openxmlformats.org/markup-compatibility/2006" xmlns:mo="http://schemas.microsoft.com/office/mac/office/2008/main" xmlns:mv="urn:schemas-microsoft-com:mac:vml" xmlns:o="urn:schemas-microsoft-com:office:office" xmlns:r="http://schemas.openxmlformats.org/officeDocument/2006/relationships" xmlns:v="urn:schemas-microsoft-com:vml" xmlns:w10="urn:schemas-microsoft-com:office:word" xmlns:w14="http://schemas.microsoft.com/office/word/2010/wordml" xmlns:w="http://schemas.openxmlformats.org/wordprocessingml/2006/main" xmlns:wne="http://schemas.microsoft.com/office/word/2006/wordml" xmlns:wp14="http://schemas.microsoft.com/office/word/2010/wordprocessingDrawing" xmlns:wp="http://schemas.openxmlformats.org/drawingml/2006/wordprocessingDrawing" xmlns:wpc="http://schemas.microsoft.com/office/word/2010/wordprocessingCanvas" xmlns:wpg="http://schemas.microsoft.com/office/word/2010/wordprocessingGroup" xmlns:wpi="http://schemas.microsoft.com/office/word/2010/wordprocessingInk" xmlns:wps="http://schemas.microsoft.com/office/word/2010/wordprocessingShape" mc:Ignorable="w14 wp14">
+  <w:p>
+    <w:pPr>
+      <w:pStyle w:val="Footer"/>
+      <w:spacing w:before="40"/>
+      <w:jc w:val="left"/>
+      <w:pBdr>
+        <w:top w:val="single" w:sz="4" w:space="2" w:color="808080"/>
+      </w:pBdr>
+    </w:pPr>
+    <w:r/>
+    <w:r>
+      <w:rPr>
+        <w:rFonts w:ascii="Arial" w:hAnsi="Arial"/>
+        <w:color w:val="555555"/>
+        <w:sz w:val="20"/>
+      </w:rPr>
+      <w:t>Revision 2 — October 2026</w:t>
+    </w:r>
+    <w:r>
+      <w:rPr>
+        <w:rFonts w:ascii="Arial" w:hAnsi="Arial"/>
+      </w:rPr>
+      <w:tab/>
+      <w:tab/>
+    </w:r>
+    <w:r>
+      <w:rPr>
+        <w:rFonts w:ascii="Arial" w:hAnsi="Arial"/>
+        <w:color w:val="555555"/>
+        <w:sz w:val="20"/>
+      </w:rPr>
+      <w:t>3-</w:t>
+    </w:r>
+    <w:r>
+      <w:rPr>
+        <w:rFonts w:ascii="Arial" w:hAnsi="Arial"/>
+        <w:color w:val="555555"/>
+        <w:sz w:val="20"/>
+      </w:rPr>
+      <w:fldChar w:fldCharType="begin"/>
+      <w:instrText xml:space="preserve"> PAGE </w:instrText>
+      <w:fldChar w:fldCharType="separate"/>
+      <w:t>1</w:t>
+      <w:fldChar w:fldCharType="end"/>
     </w:r>
   </w:p>
 </w:ftr>
@@ -15155,6 +15459,516 @@
         <w:sz w:val="20"/>
       </w:rPr>
       <w:t>4-</w:t>
+    </w:r>
+    <w:r>
+      <w:rPr>
+        <w:rFonts w:ascii="Arial" w:hAnsi="Arial"/>
+        <w:color w:val="555555"/>
+        <w:sz w:val="20"/>
+      </w:rPr>
+      <w:fldChar w:fldCharType="begin"/>
+      <w:instrText xml:space="preserve"> PAGE </w:instrText>
+      <w:fldChar w:fldCharType="separate"/>
+      <w:t>1</w:t>
+      <w:fldChar w:fldCharType="end"/>
+    </w:r>
+  </w:p>
+</w:ftr>
+</file>
+
+<file path=word/footer70.xml><?xml version="1.0" encoding="utf-8"?>
+<w:ftr xmlns:m="http://schemas.openxmlformats.org/officeDocument/2006/math" xmlns:mc="http://schemas.openxmlformats.org/markup-compatibility/2006" xmlns:mo="http://schemas.microsoft.com/office/mac/office/2008/main" xmlns:mv="urn:schemas-microsoft-com:mac:vml" xmlns:o="urn:schemas-microsoft-com:office:office" xmlns:r="http://schemas.openxmlformats.org/officeDocument/2006/relationships" xmlns:v="urn:schemas-microsoft-com:vml" xmlns:w10="urn:schemas-microsoft-com:office:word" xmlns:w14="http://schemas.microsoft.com/office/word/2010/wordml" xmlns:w="http://schemas.openxmlformats.org/wordprocessingml/2006/main" xmlns:wne="http://schemas.microsoft.com/office/word/2006/wordml" xmlns:wp14="http://schemas.microsoft.com/office/word/2010/wordprocessingDrawing" xmlns:wp="http://schemas.openxmlformats.org/drawingml/2006/wordprocessingDrawing" xmlns:wpc="http://schemas.microsoft.com/office/word/2010/wordprocessingCanvas" xmlns:wpg="http://schemas.microsoft.com/office/word/2010/wordprocessingGroup" xmlns:wpi="http://schemas.microsoft.com/office/word/2010/wordprocessingInk" xmlns:wps="http://schemas.microsoft.com/office/word/2010/wordprocessingShape" mc:Ignorable="w14 wp14">
+  <w:p>
+    <w:pPr>
+      <w:pStyle w:val="Footer"/>
+      <w:spacing w:before="40"/>
+      <w:jc w:val="left"/>
+      <w:pBdr>
+        <w:top w:val="single" w:sz="4" w:space="2" w:color="808080"/>
+      </w:pBdr>
+    </w:pPr>
+    <w:r/>
+    <w:r>
+      <w:rPr>
+        <w:rFonts w:ascii="Arial" w:hAnsi="Arial"/>
+        <w:color w:val="555555"/>
+        <w:sz w:val="20"/>
+      </w:rPr>
+      <w:t>Revision 2 — October 2026</w:t>
+    </w:r>
+    <w:r>
+      <w:rPr>
+        <w:rFonts w:ascii="Arial" w:hAnsi="Arial"/>
+      </w:rPr>
+      <w:tab/>
+      <w:tab/>
+    </w:r>
+    <w:r>
+      <w:rPr>
+        <w:rFonts w:ascii="Arial" w:hAnsi="Arial"/>
+        <w:color w:val="555555"/>
+        <w:sz w:val="20"/>
+      </w:rPr>
+      <w:t>4-</w:t>
+    </w:r>
+    <w:r>
+      <w:rPr>
+        <w:rFonts w:ascii="Arial" w:hAnsi="Arial"/>
+        <w:color w:val="555555"/>
+        <w:sz w:val="20"/>
+      </w:rPr>
+      <w:fldChar w:fldCharType="begin"/>
+      <w:instrText xml:space="preserve"> PAGE </w:instrText>
+      <w:fldChar w:fldCharType="separate"/>
+      <w:t>1</w:t>
+      <w:fldChar w:fldCharType="end"/>
+    </w:r>
+  </w:p>
+</w:ftr>
+</file>
+
+<file path=word/footer71.xml><?xml version="1.0" encoding="utf-8"?>
+<w:ftr xmlns:m="http://schemas.openxmlformats.org/officeDocument/2006/math" xmlns:mc="http://schemas.openxmlformats.org/markup-compatibility/2006" xmlns:mo="http://schemas.microsoft.com/office/mac/office/2008/main" xmlns:mv="urn:schemas-microsoft-com:mac:vml" xmlns:o="urn:schemas-microsoft-com:office:office" xmlns:r="http://schemas.openxmlformats.org/officeDocument/2006/relationships" xmlns:v="urn:schemas-microsoft-com:vml" xmlns:w10="urn:schemas-microsoft-com:office:word" xmlns:w14="http://schemas.microsoft.com/office/word/2010/wordml" xmlns:w="http://schemas.openxmlformats.org/wordprocessingml/2006/main" xmlns:wne="http://schemas.microsoft.com/office/word/2006/wordml" xmlns:wp14="http://schemas.microsoft.com/office/word/2010/wordprocessingDrawing" xmlns:wp="http://schemas.openxmlformats.org/drawingml/2006/wordprocessingDrawing" xmlns:wpc="http://schemas.microsoft.com/office/word/2010/wordprocessingCanvas" xmlns:wpg="http://schemas.microsoft.com/office/word/2010/wordprocessingGroup" xmlns:wpi="http://schemas.microsoft.com/office/word/2010/wordprocessingInk" xmlns:wps="http://schemas.microsoft.com/office/word/2010/wordprocessingShape" mc:Ignorable="w14 wp14">
+  <w:p>
+    <w:pPr>
+      <w:pStyle w:val="Footer"/>
+      <w:spacing w:before="40"/>
+      <w:jc w:val="left"/>
+      <w:pBdr>
+        <w:top w:val="single" w:sz="4" w:space="2" w:color="808080"/>
+      </w:pBdr>
+    </w:pPr>
+    <w:r/>
+    <w:r>
+      <w:rPr>
+        <w:rFonts w:ascii="Arial" w:hAnsi="Arial"/>
+        <w:color w:val="555555"/>
+        <w:sz w:val="20"/>
+      </w:rPr>
+      <w:t>Revision 2 — October 2026</w:t>
+    </w:r>
+    <w:r>
+      <w:rPr>
+        <w:rFonts w:ascii="Arial" w:hAnsi="Arial"/>
+      </w:rPr>
+      <w:tab/>
+      <w:tab/>
+    </w:r>
+    <w:r>
+      <w:rPr>
+        <w:rFonts w:ascii="Arial" w:hAnsi="Arial"/>
+        <w:color w:val="555555"/>
+        <w:sz w:val="20"/>
+      </w:rPr>
+      <w:t>5-</w:t>
+    </w:r>
+    <w:r>
+      <w:rPr>
+        <w:rFonts w:ascii="Arial" w:hAnsi="Arial"/>
+        <w:color w:val="555555"/>
+        <w:sz w:val="20"/>
+      </w:rPr>
+      <w:fldChar w:fldCharType="begin"/>
+      <w:instrText xml:space="preserve"> PAGE </w:instrText>
+      <w:fldChar w:fldCharType="separate"/>
+      <w:t>1</w:t>
+      <w:fldChar w:fldCharType="end"/>
+    </w:r>
+  </w:p>
+</w:ftr>
+</file>
+
+<file path=word/footer72.xml><?xml version="1.0" encoding="utf-8"?>
+<w:ftr xmlns:m="http://schemas.openxmlformats.org/officeDocument/2006/math" xmlns:mc="http://schemas.openxmlformats.org/markup-compatibility/2006" xmlns:mo="http://schemas.microsoft.com/office/mac/office/2008/main" xmlns:mv="urn:schemas-microsoft-com:mac:vml" xmlns:o="urn:schemas-microsoft-com:office:office" xmlns:r="http://schemas.openxmlformats.org/officeDocument/2006/relationships" xmlns:v="urn:schemas-microsoft-com:vml" xmlns:w10="urn:schemas-microsoft-com:office:word" xmlns:w14="http://schemas.microsoft.com/office/word/2010/wordml" xmlns:w="http://schemas.openxmlformats.org/wordprocessingml/2006/main" xmlns:wne="http://schemas.microsoft.com/office/word/2006/wordml" xmlns:wp14="http://schemas.microsoft.com/office/word/2010/wordprocessingDrawing" xmlns:wp="http://schemas.openxmlformats.org/drawingml/2006/wordprocessingDrawing" xmlns:wpc="http://schemas.microsoft.com/office/word/2010/wordprocessingCanvas" xmlns:wpg="http://schemas.microsoft.com/office/word/2010/wordprocessingGroup" xmlns:wpi="http://schemas.microsoft.com/office/word/2010/wordprocessingInk" xmlns:wps="http://schemas.microsoft.com/office/word/2010/wordprocessingShape" mc:Ignorable="w14 wp14">
+  <w:p>
+    <w:pPr>
+      <w:pStyle w:val="Footer"/>
+      <w:spacing w:before="40"/>
+      <w:jc w:val="left"/>
+      <w:pBdr>
+        <w:top w:val="single" w:sz="4" w:space="2" w:color="808080"/>
+      </w:pBdr>
+    </w:pPr>
+    <w:r/>
+    <w:r>
+      <w:rPr>
+        <w:rFonts w:ascii="Arial" w:hAnsi="Arial"/>
+        <w:color w:val="555555"/>
+        <w:sz w:val="20"/>
+      </w:rPr>
+      <w:t>Revision 2 — October 2026</w:t>
+    </w:r>
+    <w:r>
+      <w:rPr>
+        <w:rFonts w:ascii="Arial" w:hAnsi="Arial"/>
+      </w:rPr>
+      <w:tab/>
+      <w:tab/>
+    </w:r>
+    <w:r>
+      <w:rPr>
+        <w:rFonts w:ascii="Arial" w:hAnsi="Arial"/>
+        <w:color w:val="555555"/>
+        <w:sz w:val="20"/>
+      </w:rPr>
+      <w:t>6-</w:t>
+    </w:r>
+    <w:r>
+      <w:rPr>
+        <w:rFonts w:ascii="Arial" w:hAnsi="Arial"/>
+        <w:color w:val="555555"/>
+        <w:sz w:val="20"/>
+      </w:rPr>
+      <w:fldChar w:fldCharType="begin"/>
+      <w:instrText xml:space="preserve"> PAGE </w:instrText>
+      <w:fldChar w:fldCharType="separate"/>
+      <w:t>1</w:t>
+      <w:fldChar w:fldCharType="end"/>
+    </w:r>
+  </w:p>
+</w:ftr>
+</file>
+
+<file path=word/footer73.xml><?xml version="1.0" encoding="utf-8"?>
+<w:ftr xmlns:m="http://schemas.openxmlformats.org/officeDocument/2006/math" xmlns:mc="http://schemas.openxmlformats.org/markup-compatibility/2006" xmlns:mo="http://schemas.microsoft.com/office/mac/office/2008/main" xmlns:mv="urn:schemas-microsoft-com:mac:vml" xmlns:o="urn:schemas-microsoft-com:office:office" xmlns:r="http://schemas.openxmlformats.org/officeDocument/2006/relationships" xmlns:v="urn:schemas-microsoft-com:vml" xmlns:w10="urn:schemas-microsoft-com:office:word" xmlns:w14="http://schemas.microsoft.com/office/word/2010/wordml" xmlns:w="http://schemas.openxmlformats.org/wordprocessingml/2006/main" xmlns:wne="http://schemas.microsoft.com/office/word/2006/wordml" xmlns:wp14="http://schemas.microsoft.com/office/word/2010/wordprocessingDrawing" xmlns:wp="http://schemas.openxmlformats.org/drawingml/2006/wordprocessingDrawing" xmlns:wpc="http://schemas.microsoft.com/office/word/2010/wordprocessingCanvas" xmlns:wpg="http://schemas.microsoft.com/office/word/2010/wordprocessingGroup" xmlns:wpi="http://schemas.microsoft.com/office/word/2010/wordprocessingInk" xmlns:wps="http://schemas.microsoft.com/office/word/2010/wordprocessingShape" mc:Ignorable="w14 wp14">
+  <w:p>
+    <w:pPr>
+      <w:pStyle w:val="Footer"/>
+      <w:spacing w:before="40"/>
+      <w:jc w:val="left"/>
+      <w:pBdr>
+        <w:top w:val="single" w:sz="4" w:space="2" w:color="808080"/>
+      </w:pBdr>
+    </w:pPr>
+    <w:r/>
+    <w:r>
+      <w:rPr>
+        <w:rFonts w:ascii="Arial" w:hAnsi="Arial"/>
+        <w:color w:val="555555"/>
+        <w:sz w:val="20"/>
+      </w:rPr>
+      <w:t>Revision 2 — October 2026</w:t>
+    </w:r>
+    <w:r>
+      <w:rPr>
+        <w:rFonts w:ascii="Arial" w:hAnsi="Arial"/>
+      </w:rPr>
+      <w:tab/>
+      <w:tab/>
+    </w:r>
+    <w:r>
+      <w:rPr>
+        <w:rFonts w:ascii="Arial" w:hAnsi="Arial"/>
+        <w:color w:val="555555"/>
+        <w:sz w:val="20"/>
+      </w:rPr>
+      <w:t>7-</w:t>
+    </w:r>
+    <w:r>
+      <w:rPr>
+        <w:rFonts w:ascii="Arial" w:hAnsi="Arial"/>
+        <w:color w:val="555555"/>
+        <w:sz w:val="20"/>
+      </w:rPr>
+      <w:fldChar w:fldCharType="begin"/>
+      <w:instrText xml:space="preserve"> PAGE </w:instrText>
+      <w:fldChar w:fldCharType="separate"/>
+      <w:t>1</w:t>
+      <w:fldChar w:fldCharType="end"/>
+    </w:r>
+  </w:p>
+</w:ftr>
+</file>
+
+<file path=word/footer74.xml><?xml version="1.0" encoding="utf-8"?>
+<w:ftr xmlns:m="http://schemas.openxmlformats.org/officeDocument/2006/math" xmlns:mc="http://schemas.openxmlformats.org/markup-compatibility/2006" xmlns:mo="http://schemas.microsoft.com/office/mac/office/2008/main" xmlns:mv="urn:schemas-microsoft-com:mac:vml" xmlns:o="urn:schemas-microsoft-com:office:office" xmlns:r="http://schemas.openxmlformats.org/officeDocument/2006/relationships" xmlns:v="urn:schemas-microsoft-com:vml" xmlns:w10="urn:schemas-microsoft-com:office:word" xmlns:w14="http://schemas.microsoft.com/office/word/2010/wordml" xmlns:w="http://schemas.openxmlformats.org/wordprocessingml/2006/main" xmlns:wne="http://schemas.microsoft.com/office/word/2006/wordml" xmlns:wp14="http://schemas.microsoft.com/office/word/2010/wordprocessingDrawing" xmlns:wp="http://schemas.openxmlformats.org/drawingml/2006/wordprocessingDrawing" xmlns:wpc="http://schemas.microsoft.com/office/word/2010/wordprocessingCanvas" xmlns:wpg="http://schemas.microsoft.com/office/word/2010/wordprocessingGroup" xmlns:wpi="http://schemas.microsoft.com/office/word/2010/wordprocessingInk" xmlns:wps="http://schemas.microsoft.com/office/word/2010/wordprocessingShape" mc:Ignorable="w14 wp14">
+  <w:p>
+    <w:pPr>
+      <w:pStyle w:val="Footer"/>
+      <w:spacing w:before="40"/>
+      <w:jc w:val="left"/>
+      <w:pBdr>
+        <w:top w:val="single" w:sz="4" w:space="2" w:color="808080"/>
+      </w:pBdr>
+    </w:pPr>
+    <w:r/>
+    <w:r>
+      <w:rPr>
+        <w:rFonts w:ascii="Arial" w:hAnsi="Arial"/>
+        <w:color w:val="555555"/>
+        <w:sz w:val="20"/>
+      </w:rPr>
+      <w:t>Revision 2 — October 2026</w:t>
+    </w:r>
+    <w:r>
+      <w:rPr>
+        <w:rFonts w:ascii="Arial" w:hAnsi="Arial"/>
+      </w:rPr>
+      <w:tab/>
+      <w:tab/>
+    </w:r>
+    <w:r>
+      <w:rPr>
+        <w:rFonts w:ascii="Arial" w:hAnsi="Arial"/>
+        <w:color w:val="555555"/>
+        <w:sz w:val="20"/>
+      </w:rPr>
+      <w:t>8-</w:t>
+    </w:r>
+    <w:r>
+      <w:rPr>
+        <w:rFonts w:ascii="Arial" w:hAnsi="Arial"/>
+        <w:color w:val="555555"/>
+        <w:sz w:val="20"/>
+      </w:rPr>
+      <w:fldChar w:fldCharType="begin"/>
+      <w:instrText xml:space="preserve"> PAGE </w:instrText>
+      <w:fldChar w:fldCharType="separate"/>
+      <w:t>1</w:t>
+      <w:fldChar w:fldCharType="end"/>
+    </w:r>
+  </w:p>
+</w:ftr>
+</file>
+
+<file path=word/footer75.xml><?xml version="1.0" encoding="utf-8"?>
+<w:ftr xmlns:m="http://schemas.openxmlformats.org/officeDocument/2006/math" xmlns:mc="http://schemas.openxmlformats.org/markup-compatibility/2006" xmlns:mo="http://schemas.microsoft.com/office/mac/office/2008/main" xmlns:mv="urn:schemas-microsoft-com:mac:vml" xmlns:o="urn:schemas-microsoft-com:office:office" xmlns:r="http://schemas.openxmlformats.org/officeDocument/2006/relationships" xmlns:v="urn:schemas-microsoft-com:vml" xmlns:w10="urn:schemas-microsoft-com:office:word" xmlns:w14="http://schemas.microsoft.com/office/word/2010/wordml" xmlns:w="http://schemas.openxmlformats.org/wordprocessingml/2006/main" xmlns:wne="http://schemas.microsoft.com/office/word/2006/wordml" xmlns:wp14="http://schemas.microsoft.com/office/word/2010/wordprocessingDrawing" xmlns:wp="http://schemas.openxmlformats.org/drawingml/2006/wordprocessingDrawing" xmlns:wpc="http://schemas.microsoft.com/office/word/2010/wordprocessingCanvas" xmlns:wpg="http://schemas.microsoft.com/office/word/2010/wordprocessingGroup" xmlns:wpi="http://schemas.microsoft.com/office/word/2010/wordprocessingInk" xmlns:wps="http://schemas.microsoft.com/office/word/2010/wordprocessingShape" mc:Ignorable="w14 wp14">
+  <w:p>
+    <w:pPr>
+      <w:pStyle w:val="Footer"/>
+      <w:spacing w:before="40"/>
+      <w:jc w:val="left"/>
+      <w:pBdr>
+        <w:top w:val="single" w:sz="4" w:space="2" w:color="808080"/>
+      </w:pBdr>
+    </w:pPr>
+    <w:r/>
+    <w:r>
+      <w:rPr>
+        <w:rFonts w:ascii="Arial" w:hAnsi="Arial"/>
+        <w:color w:val="555555"/>
+        <w:sz w:val="20"/>
+      </w:rPr>
+      <w:t>Revision 2 — October 2026</w:t>
+    </w:r>
+    <w:r>
+      <w:rPr>
+        <w:rFonts w:ascii="Arial" w:hAnsi="Arial"/>
+      </w:rPr>
+      <w:tab/>
+      <w:tab/>
+    </w:r>
+    <w:r>
+      <w:rPr>
+        <w:rFonts w:ascii="Arial" w:hAnsi="Arial"/>
+        <w:color w:val="555555"/>
+        <w:sz w:val="20"/>
+      </w:rPr>
+      <w:t>9-</w:t>
+    </w:r>
+    <w:r>
+      <w:rPr>
+        <w:rFonts w:ascii="Arial" w:hAnsi="Arial"/>
+        <w:color w:val="555555"/>
+        <w:sz w:val="20"/>
+      </w:rPr>
+      <w:fldChar w:fldCharType="begin"/>
+      <w:instrText xml:space="preserve"> PAGE </w:instrText>
+      <w:fldChar w:fldCharType="separate"/>
+      <w:t>1</w:t>
+      <w:fldChar w:fldCharType="end"/>
+    </w:r>
+  </w:p>
+</w:ftr>
+</file>
+
+<file path=word/footer76.xml><?xml version="1.0" encoding="utf-8"?>
+<w:ftr xmlns:m="http://schemas.openxmlformats.org/officeDocument/2006/math" xmlns:mc="http://schemas.openxmlformats.org/markup-compatibility/2006" xmlns:mo="http://schemas.microsoft.com/office/mac/office/2008/main" xmlns:mv="urn:schemas-microsoft-com:mac:vml" xmlns:o="urn:schemas-microsoft-com:office:office" xmlns:r="http://schemas.openxmlformats.org/officeDocument/2006/relationships" xmlns:v="urn:schemas-microsoft-com:vml" xmlns:w10="urn:schemas-microsoft-com:office:word" xmlns:w14="http://schemas.microsoft.com/office/word/2010/wordml" xmlns:w="http://schemas.openxmlformats.org/wordprocessingml/2006/main" xmlns:wne="http://schemas.microsoft.com/office/word/2006/wordml" xmlns:wp14="http://schemas.microsoft.com/office/word/2010/wordprocessingDrawing" xmlns:wp="http://schemas.openxmlformats.org/drawingml/2006/wordprocessingDrawing" xmlns:wpc="http://schemas.microsoft.com/office/word/2010/wordprocessingCanvas" xmlns:wpg="http://schemas.microsoft.com/office/word/2010/wordprocessingGroup" xmlns:wpi="http://schemas.microsoft.com/office/word/2010/wordprocessingInk" xmlns:wps="http://schemas.microsoft.com/office/word/2010/wordprocessingShape" mc:Ignorable="w14 wp14">
+  <w:p>
+    <w:pPr>
+      <w:pStyle w:val="Footer"/>
+      <w:spacing w:before="40"/>
+      <w:jc w:val="left"/>
+      <w:pBdr>
+        <w:top w:val="single" w:sz="4" w:space="2" w:color="808080"/>
+      </w:pBdr>
+    </w:pPr>
+    <w:r/>
+    <w:r>
+      <w:rPr>
+        <w:rFonts w:ascii="Arial" w:hAnsi="Arial"/>
+        <w:color w:val="555555"/>
+        <w:sz w:val="20"/>
+      </w:rPr>
+      <w:t>Revision 2 — October 2026</w:t>
+    </w:r>
+    <w:r>
+      <w:rPr>
+        <w:rFonts w:ascii="Arial" w:hAnsi="Arial"/>
+      </w:rPr>
+      <w:tab/>
+      <w:tab/>
+    </w:r>
+    <w:r>
+      <w:rPr>
+        <w:rFonts w:ascii="Arial" w:hAnsi="Arial"/>
+        <w:color w:val="555555"/>
+        <w:sz w:val="20"/>
+      </w:rPr>
+      <w:t>10-</w:t>
+    </w:r>
+    <w:r>
+      <w:rPr>
+        <w:rFonts w:ascii="Arial" w:hAnsi="Arial"/>
+        <w:color w:val="555555"/>
+        <w:sz w:val="20"/>
+      </w:rPr>
+      <w:fldChar w:fldCharType="begin"/>
+      <w:instrText xml:space="preserve"> PAGE </w:instrText>
+      <w:fldChar w:fldCharType="separate"/>
+      <w:t>1</w:t>
+      <w:fldChar w:fldCharType="end"/>
+    </w:r>
+  </w:p>
+</w:ftr>
+</file>
+
+<file path=word/footer77.xml><?xml version="1.0" encoding="utf-8"?>
+<w:ftr xmlns:m="http://schemas.openxmlformats.org/officeDocument/2006/math" xmlns:mc="http://schemas.openxmlformats.org/markup-compatibility/2006" xmlns:mo="http://schemas.microsoft.com/office/mac/office/2008/main" xmlns:mv="urn:schemas-microsoft-com:mac:vml" xmlns:o="urn:schemas-microsoft-com:office:office" xmlns:r="http://schemas.openxmlformats.org/officeDocument/2006/relationships" xmlns:v="urn:schemas-microsoft-com:vml" xmlns:w10="urn:schemas-microsoft-com:office:word" xmlns:w14="http://schemas.microsoft.com/office/word/2010/wordml" xmlns:w="http://schemas.openxmlformats.org/wordprocessingml/2006/main" xmlns:wne="http://schemas.microsoft.com/office/word/2006/wordml" xmlns:wp14="http://schemas.microsoft.com/office/word/2010/wordprocessingDrawing" xmlns:wp="http://schemas.openxmlformats.org/drawingml/2006/wordprocessingDrawing" xmlns:wpc="http://schemas.microsoft.com/office/word/2010/wordprocessingCanvas" xmlns:wpg="http://schemas.microsoft.com/office/word/2010/wordprocessingGroup" xmlns:wpi="http://schemas.microsoft.com/office/word/2010/wordprocessingInk" xmlns:wps="http://schemas.microsoft.com/office/word/2010/wordprocessingShape" mc:Ignorable="w14 wp14">
+  <w:p>
+    <w:pPr>
+      <w:pStyle w:val="Footer"/>
+      <w:spacing w:before="40"/>
+      <w:jc w:val="left"/>
+      <w:pBdr>
+        <w:top w:val="single" w:sz="4" w:space="2" w:color="808080"/>
+      </w:pBdr>
+    </w:pPr>
+    <w:r/>
+    <w:r>
+      <w:rPr>
+        <w:rFonts w:ascii="Arial" w:hAnsi="Arial"/>
+        <w:color w:val="555555"/>
+        <w:sz w:val="20"/>
+      </w:rPr>
+      <w:t>Revision 2 — October 2026</w:t>
+    </w:r>
+    <w:r>
+      <w:rPr>
+        <w:rFonts w:ascii="Arial" w:hAnsi="Arial"/>
+      </w:rPr>
+      <w:tab/>
+      <w:tab/>
+    </w:r>
+    <w:r>
+      <w:rPr>
+        <w:rFonts w:ascii="Arial" w:hAnsi="Arial"/>
+        <w:color w:val="555555"/>
+        <w:sz w:val="20"/>
+      </w:rPr>
+      <w:t>11-</w:t>
+    </w:r>
+    <w:r>
+      <w:rPr>
+        <w:rFonts w:ascii="Arial" w:hAnsi="Arial"/>
+        <w:color w:val="555555"/>
+        <w:sz w:val="20"/>
+      </w:rPr>
+      <w:fldChar w:fldCharType="begin"/>
+      <w:instrText xml:space="preserve"> PAGE </w:instrText>
+      <w:fldChar w:fldCharType="separate"/>
+      <w:t>1</w:t>
+      <w:fldChar w:fldCharType="end"/>
+    </w:r>
+  </w:p>
+</w:ftr>
+</file>
+
+<file path=word/footer78.xml><?xml version="1.0" encoding="utf-8"?>
+<w:ftr xmlns:m="http://schemas.openxmlformats.org/officeDocument/2006/math" xmlns:mc="http://schemas.openxmlformats.org/markup-compatibility/2006" xmlns:mo="http://schemas.microsoft.com/office/mac/office/2008/main" xmlns:mv="urn:schemas-microsoft-com:mac:vml" xmlns:o="urn:schemas-microsoft-com:office:office" xmlns:r="http://schemas.openxmlformats.org/officeDocument/2006/relationships" xmlns:v="urn:schemas-microsoft-com:vml" xmlns:w10="urn:schemas-microsoft-com:office:word" xmlns:w14="http://schemas.microsoft.com/office/word/2010/wordml" xmlns:w="http://schemas.openxmlformats.org/wordprocessingml/2006/main" xmlns:wne="http://schemas.microsoft.com/office/word/2006/wordml" xmlns:wp14="http://schemas.microsoft.com/office/word/2010/wordprocessingDrawing" xmlns:wp="http://schemas.openxmlformats.org/drawingml/2006/wordprocessingDrawing" xmlns:wpc="http://schemas.microsoft.com/office/word/2010/wordprocessingCanvas" xmlns:wpg="http://schemas.microsoft.com/office/word/2010/wordprocessingGroup" xmlns:wpi="http://schemas.microsoft.com/office/word/2010/wordprocessingInk" xmlns:wps="http://schemas.microsoft.com/office/word/2010/wordprocessingShape" mc:Ignorable="w14 wp14">
+  <w:p>
+    <w:pPr>
+      <w:pStyle w:val="Footer"/>
+      <w:spacing w:before="40"/>
+      <w:jc w:val="left"/>
+      <w:pBdr>
+        <w:top w:val="single" w:sz="4" w:space="2" w:color="808080"/>
+      </w:pBdr>
+    </w:pPr>
+    <w:r/>
+    <w:r>
+      <w:rPr>
+        <w:rFonts w:ascii="Arial" w:hAnsi="Arial"/>
+        <w:color w:val="555555"/>
+        <w:sz w:val="20"/>
+      </w:rPr>
+      <w:t>Revision 2 — October 2026</w:t>
+    </w:r>
+    <w:r>
+      <w:rPr>
+        <w:rFonts w:ascii="Arial" w:hAnsi="Arial"/>
+      </w:rPr>
+      <w:tab/>
+      <w:tab/>
+    </w:r>
+    <w:r>
+      <w:rPr>
+        <w:rFonts w:ascii="Arial" w:hAnsi="Arial"/>
+        <w:color w:val="555555"/>
+        <w:sz w:val="20"/>
+      </w:rPr>
+      <w:t>12-</w:t>
+    </w:r>
+    <w:r>
+      <w:rPr>
+        <w:rFonts w:ascii="Arial" w:hAnsi="Arial"/>
+        <w:color w:val="555555"/>
+        <w:sz w:val="20"/>
+      </w:rPr>
+      <w:fldChar w:fldCharType="begin"/>
+      <w:instrText xml:space="preserve"> PAGE </w:instrText>
+      <w:fldChar w:fldCharType="separate"/>
+      <w:t>1</w:t>
+      <w:fldChar w:fldCharType="end"/>
+    </w:r>
+  </w:p>
+</w:ftr>
+</file>
+
+<file path=word/footer79.xml><?xml version="1.0" encoding="utf-8"?>
+<w:ftr xmlns:m="http://schemas.openxmlformats.org/officeDocument/2006/math" xmlns:mc="http://schemas.openxmlformats.org/markup-compatibility/2006" xmlns:mo="http://schemas.microsoft.com/office/mac/office/2008/main" xmlns:mv="urn:schemas-microsoft-com:mac:vml" xmlns:o="urn:schemas-microsoft-com:office:office" xmlns:r="http://schemas.openxmlformats.org/officeDocument/2006/relationships" xmlns:v="urn:schemas-microsoft-com:vml" xmlns:w10="urn:schemas-microsoft-com:office:word" xmlns:w14="http://schemas.microsoft.com/office/word/2010/wordml" xmlns:w="http://schemas.openxmlformats.org/wordprocessingml/2006/main" xmlns:wne="http://schemas.microsoft.com/office/word/2006/wordml" xmlns:wp14="http://schemas.microsoft.com/office/word/2010/wordprocessingDrawing" xmlns:wp="http://schemas.openxmlformats.org/drawingml/2006/wordprocessingDrawing" xmlns:wpc="http://schemas.microsoft.com/office/word/2010/wordprocessingCanvas" xmlns:wpg="http://schemas.microsoft.com/office/word/2010/wordprocessingGroup" xmlns:wpi="http://schemas.microsoft.com/office/word/2010/wordprocessingInk" xmlns:wps="http://schemas.microsoft.com/office/word/2010/wordprocessingShape" mc:Ignorable="w14 wp14">
+  <w:p>
+    <w:pPr>
+      <w:pStyle w:val="Footer"/>
+      <w:spacing w:before="40"/>
+      <w:jc w:val="left"/>
+      <w:pBdr>
+        <w:top w:val="single" w:sz="4" w:space="2" w:color="808080"/>
+      </w:pBdr>
+    </w:pPr>
+    <w:r/>
+    <w:r>
+      <w:rPr>
+        <w:rFonts w:ascii="Arial" w:hAnsi="Arial"/>
+        <w:color w:val="555555"/>
+        <w:sz w:val="20"/>
+      </w:rPr>
+      <w:t>Revision 2 — October 2026</w:t>
+    </w:r>
+    <w:r>
+      <w:rPr>
+        <w:rFonts w:ascii="Arial" w:hAnsi="Arial"/>
+      </w:rPr>
+      <w:tab/>
+      <w:tab/>
+    </w:r>
+    <w:r>
+      <w:rPr>
+        <w:rFonts w:ascii="Arial" w:hAnsi="Arial"/>
+        <w:color w:val="555555"/>
+        <w:sz w:val="20"/>
+      </w:rPr>
+      <w:t>13-</w:t>
     </w:r>
     <w:r>
       <w:rPr>
@@ -15223,6 +16037,285 @@
 </w:ftr>
 </file>
 
+<file path=word/footer80.xml><?xml version="1.0" encoding="utf-8"?>
+<w:ftr xmlns:m="http://schemas.openxmlformats.org/officeDocument/2006/math" xmlns:mc="http://schemas.openxmlformats.org/markup-compatibility/2006" xmlns:mo="http://schemas.microsoft.com/office/mac/office/2008/main" xmlns:mv="urn:schemas-microsoft-com:mac:vml" xmlns:o="urn:schemas-microsoft-com:office:office" xmlns:r="http://schemas.openxmlformats.org/officeDocument/2006/relationships" xmlns:v="urn:schemas-microsoft-com:vml" xmlns:w10="urn:schemas-microsoft-com:office:word" xmlns:w14="http://schemas.microsoft.com/office/word/2010/wordml" xmlns:w="http://schemas.openxmlformats.org/wordprocessingml/2006/main" xmlns:wne="http://schemas.microsoft.com/office/word/2006/wordml" xmlns:wp14="http://schemas.microsoft.com/office/word/2010/wordprocessingDrawing" xmlns:wp="http://schemas.openxmlformats.org/drawingml/2006/wordprocessingDrawing" xmlns:wpc="http://schemas.microsoft.com/office/word/2010/wordprocessingCanvas" xmlns:wpg="http://schemas.microsoft.com/office/word/2010/wordprocessingGroup" xmlns:wpi="http://schemas.microsoft.com/office/word/2010/wordprocessingInk" xmlns:wps="http://schemas.microsoft.com/office/word/2010/wordprocessingShape" mc:Ignorable="w14 wp14">
+  <w:p>
+    <w:pPr>
+      <w:pStyle w:val="Footer"/>
+      <w:spacing w:before="40"/>
+      <w:jc w:val="left"/>
+      <w:pBdr>
+        <w:top w:val="single" w:sz="4" w:space="2" w:color="808080"/>
+      </w:pBdr>
+    </w:pPr>
+    <w:r/>
+    <w:r>
+      <w:rPr>
+        <w:rFonts w:ascii="Arial" w:hAnsi="Arial"/>
+        <w:color w:val="555555"/>
+        <w:sz w:val="20"/>
+      </w:rPr>
+      <w:t>Revision 2 — October 2026</w:t>
+    </w:r>
+    <w:r>
+      <w:rPr>
+        <w:rFonts w:ascii="Arial" w:hAnsi="Arial"/>
+      </w:rPr>
+      <w:tab/>
+      <w:tab/>
+    </w:r>
+    <w:r>
+      <w:rPr>
+        <w:rFonts w:ascii="Arial" w:hAnsi="Arial"/>
+        <w:color w:val="555555"/>
+        <w:sz w:val="20"/>
+      </w:rPr>
+      <w:t>14-</w:t>
+    </w:r>
+    <w:r>
+      <w:rPr>
+        <w:rFonts w:ascii="Arial" w:hAnsi="Arial"/>
+        <w:color w:val="555555"/>
+        <w:sz w:val="20"/>
+      </w:rPr>
+      <w:fldChar w:fldCharType="begin"/>
+      <w:instrText xml:space="preserve"> PAGE </w:instrText>
+      <w:fldChar w:fldCharType="separate"/>
+      <w:t>1</w:t>
+      <w:fldChar w:fldCharType="end"/>
+    </w:r>
+  </w:p>
+</w:ftr>
+</file>
+
+<file path=word/footer81.xml><?xml version="1.0" encoding="utf-8"?>
+<w:ftr xmlns:m="http://schemas.openxmlformats.org/officeDocument/2006/math" xmlns:mc="http://schemas.openxmlformats.org/markup-compatibility/2006" xmlns:mo="http://schemas.microsoft.com/office/mac/office/2008/main" xmlns:mv="urn:schemas-microsoft-com:mac:vml" xmlns:o="urn:schemas-microsoft-com:office:office" xmlns:r="http://schemas.openxmlformats.org/officeDocument/2006/relationships" xmlns:v="urn:schemas-microsoft-com:vml" xmlns:w10="urn:schemas-microsoft-com:office:word" xmlns:w14="http://schemas.microsoft.com/office/word/2010/wordml" xmlns:w="http://schemas.openxmlformats.org/wordprocessingml/2006/main" xmlns:wne="http://schemas.microsoft.com/office/word/2006/wordml" xmlns:wp14="http://schemas.microsoft.com/office/word/2010/wordprocessingDrawing" xmlns:wp="http://schemas.openxmlformats.org/drawingml/2006/wordprocessingDrawing" xmlns:wpc="http://schemas.microsoft.com/office/word/2010/wordprocessingCanvas" xmlns:wpg="http://schemas.microsoft.com/office/word/2010/wordprocessingGroup" xmlns:wpi="http://schemas.microsoft.com/office/word/2010/wordprocessingInk" xmlns:wps="http://schemas.microsoft.com/office/word/2010/wordprocessingShape" mc:Ignorable="w14 wp14">
+  <w:p>
+    <w:pPr>
+      <w:pStyle w:val="Footer"/>
+      <w:spacing w:before="40"/>
+      <w:jc w:val="left"/>
+      <w:pBdr>
+        <w:top w:val="single" w:sz="4" w:space="2" w:color="808080"/>
+      </w:pBdr>
+    </w:pPr>
+    <w:r/>
+    <w:r>
+      <w:rPr>
+        <w:rFonts w:ascii="Arial" w:hAnsi="Arial"/>
+        <w:color w:val="555555"/>
+        <w:sz w:val="20"/>
+      </w:rPr>
+      <w:t>Revision 2 — October 2026</w:t>
+    </w:r>
+    <w:r>
+      <w:rPr>
+        <w:rFonts w:ascii="Arial" w:hAnsi="Arial"/>
+      </w:rPr>
+      <w:tab/>
+      <w:tab/>
+    </w:r>
+    <w:r>
+      <w:rPr>
+        <w:rFonts w:ascii="Arial" w:hAnsi="Arial"/>
+        <w:color w:val="555555"/>
+        <w:sz w:val="20"/>
+      </w:rPr>
+      <w:t>15-</w:t>
+    </w:r>
+    <w:r>
+      <w:rPr>
+        <w:rFonts w:ascii="Arial" w:hAnsi="Arial"/>
+        <w:color w:val="555555"/>
+        <w:sz w:val="20"/>
+      </w:rPr>
+      <w:fldChar w:fldCharType="begin"/>
+      <w:instrText xml:space="preserve"> PAGE </w:instrText>
+      <w:fldChar w:fldCharType="separate"/>
+      <w:t>1</w:t>
+      <w:fldChar w:fldCharType="end"/>
+    </w:r>
+  </w:p>
+</w:ftr>
+</file>
+
+<file path=word/footer82.xml><?xml version="1.0" encoding="utf-8"?>
+<w:ftr xmlns:m="http://schemas.openxmlformats.org/officeDocument/2006/math" xmlns:mc="http://schemas.openxmlformats.org/markup-compatibility/2006" xmlns:mo="http://schemas.microsoft.com/office/mac/office/2008/main" xmlns:mv="urn:schemas-microsoft-com:mac:vml" xmlns:o="urn:schemas-microsoft-com:office:office" xmlns:r="http://schemas.openxmlformats.org/officeDocument/2006/relationships" xmlns:v="urn:schemas-microsoft-com:vml" xmlns:w10="urn:schemas-microsoft-com:office:word" xmlns:w14="http://schemas.microsoft.com/office/word/2010/wordml" xmlns:w="http://schemas.openxmlformats.org/wordprocessingml/2006/main" xmlns:wne="http://schemas.microsoft.com/office/word/2006/wordml" xmlns:wp14="http://schemas.microsoft.com/office/word/2010/wordprocessingDrawing" xmlns:wp="http://schemas.openxmlformats.org/drawingml/2006/wordprocessingDrawing" xmlns:wpc="http://schemas.microsoft.com/office/word/2010/wordprocessingCanvas" xmlns:wpg="http://schemas.microsoft.com/office/word/2010/wordprocessingGroup" xmlns:wpi="http://schemas.microsoft.com/office/word/2010/wordprocessingInk" xmlns:wps="http://schemas.microsoft.com/office/word/2010/wordprocessingShape" mc:Ignorable="w14 wp14">
+  <w:p>
+    <w:pPr>
+      <w:pStyle w:val="Footer"/>
+      <w:spacing w:before="40"/>
+      <w:jc w:val="left"/>
+      <w:pBdr>
+        <w:top w:val="single" w:sz="4" w:space="2" w:color="808080"/>
+      </w:pBdr>
+    </w:pPr>
+    <w:r/>
+    <w:r>
+      <w:rPr>
+        <w:rFonts w:ascii="Arial" w:hAnsi="Arial"/>
+        <w:color w:val="555555"/>
+        <w:sz w:val="20"/>
+      </w:rPr>
+      <w:t>Revision 2 — October 2026</w:t>
+    </w:r>
+    <w:r>
+      <w:rPr>
+        <w:rFonts w:ascii="Arial" w:hAnsi="Arial"/>
+      </w:rPr>
+      <w:tab/>
+      <w:tab/>
+    </w:r>
+    <w:r>
+      <w:rPr>
+        <w:rFonts w:ascii="Arial" w:hAnsi="Arial"/>
+        <w:color w:val="555555"/>
+        <w:sz w:val="20"/>
+      </w:rPr>
+      <w:t>16-</w:t>
+    </w:r>
+    <w:r>
+      <w:rPr>
+        <w:rFonts w:ascii="Arial" w:hAnsi="Arial"/>
+        <w:color w:val="555555"/>
+        <w:sz w:val="20"/>
+      </w:rPr>
+      <w:fldChar w:fldCharType="begin"/>
+      <w:instrText xml:space="preserve"> PAGE </w:instrText>
+      <w:fldChar w:fldCharType="separate"/>
+      <w:t>1</w:t>
+      <w:fldChar w:fldCharType="end"/>
+    </w:r>
+  </w:p>
+</w:ftr>
+</file>
+
+<file path=word/footer83.xml><?xml version="1.0" encoding="utf-8"?>
+<w:ftr xmlns:m="http://schemas.openxmlformats.org/officeDocument/2006/math" xmlns:mc="http://schemas.openxmlformats.org/markup-compatibility/2006" xmlns:mo="http://schemas.microsoft.com/office/mac/office/2008/main" xmlns:mv="urn:schemas-microsoft-com:mac:vml" xmlns:o="urn:schemas-microsoft-com:office:office" xmlns:r="http://schemas.openxmlformats.org/officeDocument/2006/relationships" xmlns:v="urn:schemas-microsoft-com:vml" xmlns:w10="urn:schemas-microsoft-com:office:word" xmlns:w14="http://schemas.microsoft.com/office/word/2010/wordml" xmlns:w="http://schemas.openxmlformats.org/wordprocessingml/2006/main" xmlns:wne="http://schemas.microsoft.com/office/word/2006/wordml" xmlns:wp14="http://schemas.microsoft.com/office/word/2010/wordprocessingDrawing" xmlns:wp="http://schemas.openxmlformats.org/drawingml/2006/wordprocessingDrawing" xmlns:wpc="http://schemas.microsoft.com/office/word/2010/wordprocessingCanvas" xmlns:wpg="http://schemas.microsoft.com/office/word/2010/wordprocessingGroup" xmlns:wpi="http://schemas.microsoft.com/office/word/2010/wordprocessingInk" xmlns:wps="http://schemas.microsoft.com/office/word/2010/wordprocessingShape" mc:Ignorable="w14 wp14">
+  <w:p>
+    <w:pPr>
+      <w:pStyle w:val="Footer"/>
+      <w:spacing w:before="40"/>
+      <w:jc w:val="left"/>
+      <w:pBdr>
+        <w:top w:val="single" w:sz="4" w:space="2" w:color="808080"/>
+      </w:pBdr>
+    </w:pPr>
+    <w:r/>
+    <w:r>
+      <w:rPr>
+        <w:rFonts w:ascii="Arial" w:hAnsi="Arial"/>
+        <w:color w:val="555555"/>
+        <w:sz w:val="20"/>
+      </w:rPr>
+      <w:t>Revision 2 — October 2026</w:t>
+    </w:r>
+    <w:r>
+      <w:rPr>
+        <w:rFonts w:ascii="Arial" w:hAnsi="Arial"/>
+      </w:rPr>
+      <w:tab/>
+      <w:tab/>
+    </w:r>
+    <w:r>
+      <w:rPr>
+        <w:rFonts w:ascii="Arial" w:hAnsi="Arial"/>
+        <w:color w:val="555555"/>
+        <w:sz w:val="20"/>
+      </w:rPr>
+      <w:t>17-</w:t>
+    </w:r>
+    <w:r>
+      <w:rPr>
+        <w:rFonts w:ascii="Arial" w:hAnsi="Arial"/>
+        <w:color w:val="555555"/>
+        <w:sz w:val="20"/>
+      </w:rPr>
+      <w:fldChar w:fldCharType="begin"/>
+      <w:instrText xml:space="preserve"> PAGE </w:instrText>
+      <w:fldChar w:fldCharType="separate"/>
+      <w:t>1</w:t>
+      <w:fldChar w:fldCharType="end"/>
+    </w:r>
+  </w:p>
+</w:ftr>
+</file>
+
+<file path=word/footer84.xml><?xml version="1.0" encoding="utf-8"?>
+<w:ftr xmlns:m="http://schemas.openxmlformats.org/officeDocument/2006/math" xmlns:mc="http://schemas.openxmlformats.org/markup-compatibility/2006" xmlns:mo="http://schemas.microsoft.com/office/mac/office/2008/main" xmlns:mv="urn:schemas-microsoft-com:mac:vml" xmlns:o="urn:schemas-microsoft-com:office:office" xmlns:r="http://schemas.openxmlformats.org/officeDocument/2006/relationships" xmlns:v="urn:schemas-microsoft-com:vml" xmlns:w10="urn:schemas-microsoft-com:office:word" xmlns:w14="http://schemas.microsoft.com/office/word/2010/wordml" xmlns:w="http://schemas.openxmlformats.org/wordprocessingml/2006/main" xmlns:wne="http://schemas.microsoft.com/office/word/2006/wordml" xmlns:wp14="http://schemas.microsoft.com/office/word/2010/wordprocessingDrawing" xmlns:wp="http://schemas.openxmlformats.org/drawingml/2006/wordprocessingDrawing" xmlns:wpc="http://schemas.microsoft.com/office/word/2010/wordprocessingCanvas" xmlns:wpg="http://schemas.microsoft.com/office/word/2010/wordprocessingGroup" xmlns:wpi="http://schemas.microsoft.com/office/word/2010/wordprocessingInk" xmlns:wps="http://schemas.microsoft.com/office/word/2010/wordprocessingShape" mc:Ignorable="w14 wp14">
+  <w:p>
+    <w:pPr>
+      <w:pStyle w:val="Footer"/>
+      <w:spacing w:before="40"/>
+      <w:jc w:val="left"/>
+      <w:pBdr>
+        <w:top w:val="single" w:sz="4" w:space="2" w:color="808080"/>
+      </w:pBdr>
+    </w:pPr>
+    <w:r/>
+    <w:r>
+      <w:rPr>
+        <w:rFonts w:ascii="Arial" w:hAnsi="Arial"/>
+        <w:color w:val="555555"/>
+        <w:sz w:val="20"/>
+      </w:rPr>
+      <w:t>Revision 2 — October 2026</w:t>
+    </w:r>
+    <w:r>
+      <w:rPr>
+        <w:rFonts w:ascii="Arial" w:hAnsi="Arial"/>
+      </w:rPr>
+      <w:tab/>
+      <w:tab/>
+    </w:r>
+    <w:r>
+      <w:rPr>
+        <w:rFonts w:ascii="Arial" w:hAnsi="Arial"/>
+        <w:color w:val="555555"/>
+        <w:sz w:val="20"/>
+      </w:rPr>
+      <w:t>18-</w:t>
+    </w:r>
+    <w:r>
+      <w:rPr>
+        <w:rFonts w:ascii="Arial" w:hAnsi="Arial"/>
+        <w:color w:val="555555"/>
+        <w:sz w:val="20"/>
+      </w:rPr>
+      <w:fldChar w:fldCharType="begin"/>
+      <w:instrText xml:space="preserve"> PAGE </w:instrText>
+      <w:fldChar w:fldCharType="separate"/>
+      <w:t>1</w:t>
+      <w:fldChar w:fldCharType="end"/>
+    </w:r>
+  </w:p>
+</w:ftr>
+</file>
+
+<file path=word/footer85.xml><?xml version="1.0" encoding="utf-8"?>
+<w:ftr xmlns:m="http://schemas.openxmlformats.org/officeDocument/2006/math" xmlns:mc="http://schemas.openxmlformats.org/markup-compatibility/2006" xmlns:mo="http://schemas.microsoft.com/office/mac/office/2008/main" xmlns:mv="urn:schemas-microsoft-com:mac:vml" xmlns:o="urn:schemas-microsoft-com:office:office" xmlns:r="http://schemas.openxmlformats.org/officeDocument/2006/relationships" xmlns:v="urn:schemas-microsoft-com:vml" xmlns:w10="urn:schemas-microsoft-com:office:word" xmlns:w14="http://schemas.microsoft.com/office/word/2010/wordml" xmlns:w="http://schemas.openxmlformats.org/wordprocessingml/2006/main" xmlns:wne="http://schemas.microsoft.com/office/word/2006/wordml" xmlns:wp14="http://schemas.microsoft.com/office/word/2010/wordprocessingDrawing" xmlns:wp="http://schemas.openxmlformats.org/drawingml/2006/wordprocessingDrawing" xmlns:wpc="http://schemas.microsoft.com/office/word/2010/wordprocessingCanvas" xmlns:wpg="http://schemas.microsoft.com/office/word/2010/wordprocessingGroup" xmlns:wpi="http://schemas.microsoft.com/office/word/2010/wordprocessingInk" xmlns:wps="http://schemas.microsoft.com/office/word/2010/wordprocessingShape" mc:Ignorable="w14 wp14">
+  <w:p>
+    <w:pPr>
+      <w:pStyle w:val="Footer"/>
+      <w:spacing w:before="40"/>
+      <w:jc w:val="left"/>
+      <w:pBdr>
+        <w:top w:val="single" w:sz="4" w:space="2" w:color="808080"/>
+      </w:pBdr>
+    </w:pPr>
+    <w:r/>
+    <w:r>
+      <w:rPr>
+        <w:rFonts w:ascii="Arial" w:hAnsi="Arial"/>
+        <w:color w:val="555555"/>
+        <w:sz w:val="20"/>
+      </w:rPr>
+      <w:t>Revision 2 — October 2026</w:t>
+    </w:r>
+  </w:p>
+</w:ftr>
+</file>
+
 <file path=word/footer9.xml><?xml version="1.0" encoding="utf-8"?>
 <w:ftr xmlns:m="http://schemas.openxmlformats.org/officeDocument/2006/math" xmlns:mc="http://schemas.openxmlformats.org/markup-compatibility/2006" xmlns:mo="http://schemas.microsoft.com/office/mac/office/2008/main" xmlns:mv="urn:schemas-microsoft-com:mac:vml" xmlns:o="urn:schemas-microsoft-com:office:office" xmlns:r="http://schemas.openxmlformats.org/officeDocument/2006/relationships" xmlns:v="urn:schemas-microsoft-com:vml" xmlns:w10="urn:schemas-microsoft-com:office:word" xmlns:w14="http://schemas.microsoft.com/office/word/2010/wordml" xmlns:w="http://schemas.openxmlformats.org/wordprocessingml/2006/main" xmlns:wne="http://schemas.microsoft.com/office/word/2006/wordml" xmlns:wp14="http://schemas.microsoft.com/office/word/2010/wordprocessingDrawing" xmlns:wp="http://schemas.openxmlformats.org/drawingml/2006/wordprocessingDrawing" xmlns:wpc="http://schemas.microsoft.com/office/word/2010/wordprocessingCanvas" xmlns:wpg="http://schemas.microsoft.com/office/word/2010/wordprocessingGroup" xmlns:wpi="http://schemas.microsoft.com/office/word/2010/wordprocessingInk" xmlns:wps="http://schemas.microsoft.com/office/word/2010/wordprocessingShape" mc:Ignorable="w14 wp14">
   <w:p>
@@ -16754,6 +17847,22 @@
       </w:pBdr>
     </w:pPr>
     <w:r/>
+  </w:p>
+</w:hdr>
+</file>
+
+<file path=word/header65.xml><?xml version="1.0" encoding="utf-8"?>
+<w:hdr xmlns:m="http://schemas.openxmlformats.org/officeDocument/2006/math" xmlns:mc="http://schemas.openxmlformats.org/markup-compatibility/2006" xmlns:mo="http://schemas.microsoft.com/office/mac/office/2008/main" xmlns:mv="urn:schemas-microsoft-com:mac:vml" xmlns:o="urn:schemas-microsoft-com:office:office" xmlns:r="http://schemas.openxmlformats.org/officeDocument/2006/relationships" xmlns:v="urn:schemas-microsoft-com:vml" xmlns:w10="urn:schemas-microsoft-com:office:word" xmlns:w14="http://schemas.microsoft.com/office/word/2010/wordml" xmlns:w="http://schemas.openxmlformats.org/wordprocessingml/2006/main" xmlns:wne="http://schemas.microsoft.com/office/word/2006/wordml" xmlns:wp14="http://schemas.microsoft.com/office/word/2010/wordprocessingDrawing" xmlns:wp="http://schemas.openxmlformats.org/drawingml/2006/wordprocessingDrawing" xmlns:wpc="http://schemas.microsoft.com/office/word/2010/wordprocessingCanvas" xmlns:wpg="http://schemas.microsoft.com/office/word/2010/wordprocessingGroup" xmlns:wpi="http://schemas.microsoft.com/office/word/2010/wordprocessingInk" xmlns:wps="http://schemas.microsoft.com/office/word/2010/wordprocessingShape" mc:Ignorable="w14 wp14">
+  <w:p>
+    <w:pPr>
+      <w:pStyle w:val="Header"/>
+      <w:spacing w:after="40"/>
+      <w:jc w:val="right"/>
+      <w:pBdr>
+        <w:bottom w:val="single" w:sz="4" w:space="2" w:color="808080"/>
+      </w:pBdr>
+    </w:pPr>
+    <w:r/>
     <w:r>
       <w:rPr>
         <w:rFonts w:ascii="Arial" w:hAnsi="Arial"/>
@@ -16761,7 +17870,107 @@
         <w:color w:val="555555"/>
         <w:sz w:val="20"/>
       </w:rPr>
-      <w:t>Copyright and Disclaimer</w:t>
+      <w:t>Table of Contents</w:t>
+    </w:r>
+  </w:p>
+</w:hdr>
+</file>
+
+<file path=word/header66.xml><?xml version="1.0" encoding="utf-8"?>
+<w:hdr xmlns:m="http://schemas.openxmlformats.org/officeDocument/2006/math" xmlns:mc="http://schemas.openxmlformats.org/markup-compatibility/2006" xmlns:mo="http://schemas.microsoft.com/office/mac/office/2008/main" xmlns:mv="urn:schemas-microsoft-com:mac:vml" xmlns:o="urn:schemas-microsoft-com:office:office" xmlns:r="http://schemas.openxmlformats.org/officeDocument/2006/relationships" xmlns:v="urn:schemas-microsoft-com:vml" xmlns:w10="urn:schemas-microsoft-com:office:word" xmlns:w14="http://schemas.microsoft.com/office/word/2010/wordml" xmlns:w="http://schemas.openxmlformats.org/wordprocessingml/2006/main" xmlns:wne="http://schemas.microsoft.com/office/word/2006/wordml" xmlns:wp14="http://schemas.microsoft.com/office/word/2010/wordprocessingDrawing" xmlns:wp="http://schemas.openxmlformats.org/drawingml/2006/wordprocessingDrawing" xmlns:wpc="http://schemas.microsoft.com/office/word/2010/wordprocessingCanvas" xmlns:wpg="http://schemas.microsoft.com/office/word/2010/wordprocessingGroup" xmlns:wpi="http://schemas.microsoft.com/office/word/2010/wordprocessingInk" xmlns:wps="http://schemas.microsoft.com/office/word/2010/wordprocessingShape" mc:Ignorable="w14 wp14">
+  <w:p>
+    <w:pPr>
+      <w:pStyle w:val="Header"/>
+      <w:spacing w:after="40"/>
+      <w:jc w:val="right"/>
+      <w:pBdr>
+        <w:bottom w:val="single" w:sz="4" w:space="2" w:color="808080"/>
+      </w:pBdr>
+    </w:pPr>
+    <w:r/>
+    <w:r>
+      <w:rPr>
+        <w:rFonts w:ascii="Arial" w:hAnsi="Arial"/>
+        <w:b/>
+        <w:color w:val="555555"/>
+        <w:sz w:val="20"/>
+      </w:rPr>
+      <w:t>Quick Start</w:t>
+    </w:r>
+  </w:p>
+</w:hdr>
+</file>
+
+<file path=word/header67.xml><?xml version="1.0" encoding="utf-8"?>
+<w:hdr xmlns:m="http://schemas.openxmlformats.org/officeDocument/2006/math" xmlns:mc="http://schemas.openxmlformats.org/markup-compatibility/2006" xmlns:mo="http://schemas.microsoft.com/office/mac/office/2008/main" xmlns:mv="urn:schemas-microsoft-com:mac:vml" xmlns:o="urn:schemas-microsoft-com:office:office" xmlns:r="http://schemas.openxmlformats.org/officeDocument/2006/relationships" xmlns:v="urn:schemas-microsoft-com:vml" xmlns:w10="urn:schemas-microsoft-com:office:word" xmlns:w14="http://schemas.microsoft.com/office/word/2010/wordml" xmlns:w="http://schemas.openxmlformats.org/wordprocessingml/2006/main" xmlns:wne="http://schemas.microsoft.com/office/word/2006/wordml" xmlns:wp14="http://schemas.microsoft.com/office/word/2010/wordprocessingDrawing" xmlns:wp="http://schemas.openxmlformats.org/drawingml/2006/wordprocessingDrawing" xmlns:wpc="http://schemas.microsoft.com/office/word/2010/wordprocessingCanvas" xmlns:wpg="http://schemas.microsoft.com/office/word/2010/wordprocessingGroup" xmlns:wpi="http://schemas.microsoft.com/office/word/2010/wordprocessingInk" xmlns:wps="http://schemas.microsoft.com/office/word/2010/wordprocessingShape" mc:Ignorable="w14 wp14">
+  <w:p>
+    <w:pPr>
+      <w:pStyle w:val="Header"/>
+      <w:spacing w:after="40"/>
+      <w:jc w:val="right"/>
+      <w:pBdr>
+        <w:bottom w:val="single" w:sz="4" w:space="2" w:color="808080"/>
+      </w:pBdr>
+    </w:pPr>
+    <w:r/>
+    <w:r>
+      <w:rPr>
+        <w:rFonts w:ascii="Arial" w:hAnsi="Arial"/>
+        <w:b/>
+        <w:color w:val="555555"/>
+        <w:sz w:val="20"/>
+      </w:rPr>
+      <w:t>1. Overview</w:t>
+    </w:r>
+  </w:p>
+</w:hdr>
+</file>
+
+<file path=word/header68.xml><?xml version="1.0" encoding="utf-8"?>
+<w:hdr xmlns:m="http://schemas.openxmlformats.org/officeDocument/2006/math" xmlns:mc="http://schemas.openxmlformats.org/markup-compatibility/2006" xmlns:mo="http://schemas.microsoft.com/office/mac/office/2008/main" xmlns:mv="urn:schemas-microsoft-com:mac:vml" xmlns:o="urn:schemas-microsoft-com:office:office" xmlns:r="http://schemas.openxmlformats.org/officeDocument/2006/relationships" xmlns:v="urn:schemas-microsoft-com:vml" xmlns:w10="urn:schemas-microsoft-com:office:word" xmlns:w14="http://schemas.microsoft.com/office/word/2010/wordml" xmlns:w="http://schemas.openxmlformats.org/wordprocessingml/2006/main" xmlns:wne="http://schemas.microsoft.com/office/word/2006/wordml" xmlns:wp14="http://schemas.microsoft.com/office/word/2010/wordprocessingDrawing" xmlns:wp="http://schemas.openxmlformats.org/drawingml/2006/wordprocessingDrawing" xmlns:wpc="http://schemas.microsoft.com/office/word/2010/wordprocessingCanvas" xmlns:wpg="http://schemas.microsoft.com/office/word/2010/wordprocessingGroup" xmlns:wpi="http://schemas.microsoft.com/office/word/2010/wordprocessingInk" xmlns:wps="http://schemas.microsoft.com/office/word/2010/wordprocessingShape" mc:Ignorable="w14 wp14">
+  <w:p>
+    <w:pPr>
+      <w:pStyle w:val="Header"/>
+      <w:spacing w:after="40"/>
+      <w:jc w:val="right"/>
+      <w:pBdr>
+        <w:bottom w:val="single" w:sz="4" w:space="2" w:color="808080"/>
+      </w:pBdr>
+    </w:pPr>
+    <w:r/>
+    <w:r>
+      <w:rPr>
+        <w:rFonts w:ascii="Arial" w:hAnsi="Arial"/>
+        <w:b/>
+        <w:color w:val="555555"/>
+        <w:sz w:val="20"/>
+      </w:rPr>
+      <w:t>2. Models</w:t>
+    </w:r>
+  </w:p>
+</w:hdr>
+</file>
+
+<file path=word/header69.xml><?xml version="1.0" encoding="utf-8"?>
+<w:hdr xmlns:m="http://schemas.openxmlformats.org/officeDocument/2006/math" xmlns:mc="http://schemas.openxmlformats.org/markup-compatibility/2006" xmlns:mo="http://schemas.microsoft.com/office/mac/office/2008/main" xmlns:mv="urn:schemas-microsoft-com:mac:vml" xmlns:o="urn:schemas-microsoft-com:office:office" xmlns:r="http://schemas.openxmlformats.org/officeDocument/2006/relationships" xmlns:v="urn:schemas-microsoft-com:vml" xmlns:w10="urn:schemas-microsoft-com:office:word" xmlns:w14="http://schemas.microsoft.com/office/word/2010/wordml" xmlns:w="http://schemas.openxmlformats.org/wordprocessingml/2006/main" xmlns:wne="http://schemas.microsoft.com/office/word/2006/wordml" xmlns:wp14="http://schemas.microsoft.com/office/word/2010/wordprocessingDrawing" xmlns:wp="http://schemas.openxmlformats.org/drawingml/2006/wordprocessingDrawing" xmlns:wpc="http://schemas.microsoft.com/office/word/2010/wordprocessingCanvas" xmlns:wpg="http://schemas.microsoft.com/office/word/2010/wordprocessingGroup" xmlns:wpi="http://schemas.microsoft.com/office/word/2010/wordprocessingInk" xmlns:wps="http://schemas.microsoft.com/office/word/2010/wordprocessingShape" mc:Ignorable="w14 wp14">
+  <w:p>
+    <w:pPr>
+      <w:pStyle w:val="Header"/>
+      <w:spacing w:after="40"/>
+      <w:jc w:val="right"/>
+      <w:pBdr>
+        <w:bottom w:val="single" w:sz="4" w:space="2" w:color="808080"/>
+      </w:pBdr>
+    </w:pPr>
+    <w:r/>
+    <w:r>
+      <w:rPr>
+        <w:rFonts w:ascii="Arial" w:hAnsi="Arial"/>
+        <w:b/>
+        <w:color w:val="555555"/>
+        <w:sz w:val="20"/>
+      </w:rPr>
+      <w:t>3. Display</w:t>
     </w:r>
   </w:p>
 </w:hdr>
@@ -16792,7 +18001,7 @@
 </w:hdr>
 </file>
 
-<file path=word/header8.xml><?xml version="1.0" encoding="utf-8"?>
+<file path=word/header70.xml><?xml version="1.0" encoding="utf-8"?>
 <w:hdr xmlns:m="http://schemas.openxmlformats.org/officeDocument/2006/math" xmlns:mc="http://schemas.openxmlformats.org/markup-compatibility/2006" xmlns:mo="http://schemas.microsoft.com/office/mac/office/2008/main" xmlns:mv="urn:schemas-microsoft-com:mac:vml" xmlns:o="urn:schemas-microsoft-com:office:office" xmlns:r="http://schemas.openxmlformats.org/officeDocument/2006/relationships" xmlns:v="urn:schemas-microsoft-com:vml" xmlns:w10="urn:schemas-microsoft-com:office:word" xmlns:w14="http://schemas.microsoft.com/office/word/2010/wordml" xmlns:w="http://schemas.openxmlformats.org/wordprocessingml/2006/main" xmlns:wne="http://schemas.microsoft.com/office/word/2006/wordml" xmlns:wp14="http://schemas.microsoft.com/office/word/2010/wordprocessingDrawing" xmlns:wp="http://schemas.openxmlformats.org/drawingml/2006/wordprocessingDrawing" xmlns:wpc="http://schemas.microsoft.com/office/word/2010/wordprocessingCanvas" xmlns:wpg="http://schemas.microsoft.com/office/word/2010/wordprocessingGroup" xmlns:wpi="http://schemas.microsoft.com/office/word/2010/wordprocessingInk" xmlns:wps="http://schemas.microsoft.com/office/word/2010/wordprocessingShape" mc:Ignorable="w14 wp14">
   <w:p>
     <w:pPr>
@@ -16811,7 +18020,407 @@
         <w:color w:val="555555"/>
         <w:sz w:val="20"/>
       </w:rPr>
+      <w:t>4. Buttons</w:t>
+    </w:r>
+  </w:p>
+</w:hdr>
+</file>
+
+<file path=word/header71.xml><?xml version="1.0" encoding="utf-8"?>
+<w:hdr xmlns:m="http://schemas.openxmlformats.org/officeDocument/2006/math" xmlns:mc="http://schemas.openxmlformats.org/markup-compatibility/2006" xmlns:mo="http://schemas.microsoft.com/office/mac/office/2008/main" xmlns:mv="urn:schemas-microsoft-com:mac:vml" xmlns:o="urn:schemas-microsoft-com:office:office" xmlns:r="http://schemas.openxmlformats.org/officeDocument/2006/relationships" xmlns:v="urn:schemas-microsoft-com:vml" xmlns:w10="urn:schemas-microsoft-com:office:word" xmlns:w14="http://schemas.microsoft.com/office/word/2010/wordml" xmlns:w="http://schemas.openxmlformats.org/wordprocessingml/2006/main" xmlns:wne="http://schemas.microsoft.com/office/word/2006/wordml" xmlns:wp14="http://schemas.microsoft.com/office/word/2010/wordprocessingDrawing" xmlns:wp="http://schemas.openxmlformats.org/drawingml/2006/wordprocessingDrawing" xmlns:wpc="http://schemas.microsoft.com/office/word/2010/wordprocessingCanvas" xmlns:wpg="http://schemas.microsoft.com/office/word/2010/wordprocessingGroup" xmlns:wpi="http://schemas.microsoft.com/office/word/2010/wordprocessingInk" xmlns:wps="http://schemas.microsoft.com/office/word/2010/wordprocessingShape" mc:Ignorable="w14 wp14">
+  <w:p>
+    <w:pPr>
+      <w:pStyle w:val="Header"/>
+      <w:spacing w:after="40"/>
+      <w:jc w:val="right"/>
+      <w:pBdr>
+        <w:bottom w:val="single" w:sz="4" w:space="2" w:color="808080"/>
+      </w:pBdr>
+    </w:pPr>
+    <w:r/>
+    <w:r>
+      <w:rPr>
+        <w:rFonts w:ascii="Arial" w:hAnsi="Arial"/>
+        <w:b/>
+        <w:color w:val="555555"/>
+        <w:sz w:val="20"/>
+      </w:rPr>
       <w:t>5. Power-On Functions</w:t>
+    </w:r>
+  </w:p>
+</w:hdr>
+</file>
+
+<file path=word/header72.xml><?xml version="1.0" encoding="utf-8"?>
+<w:hdr xmlns:m="http://schemas.openxmlformats.org/officeDocument/2006/math" xmlns:mc="http://schemas.openxmlformats.org/markup-compatibility/2006" xmlns:mo="http://schemas.microsoft.com/office/mac/office/2008/main" xmlns:mv="urn:schemas-microsoft-com:mac:vml" xmlns:o="urn:schemas-microsoft-com:office:office" xmlns:r="http://schemas.openxmlformats.org/officeDocument/2006/relationships" xmlns:v="urn:schemas-microsoft-com:vml" xmlns:w10="urn:schemas-microsoft-com:office:word" xmlns:w14="http://schemas.microsoft.com/office/word/2010/wordml" xmlns:w="http://schemas.openxmlformats.org/wordprocessingml/2006/main" xmlns:wne="http://schemas.microsoft.com/office/word/2006/wordml" xmlns:wp14="http://schemas.microsoft.com/office/word/2010/wordprocessingDrawing" xmlns:wp="http://schemas.openxmlformats.org/drawingml/2006/wordprocessingDrawing" xmlns:wpc="http://schemas.microsoft.com/office/word/2010/wordprocessingCanvas" xmlns:wpg="http://schemas.microsoft.com/office/word/2010/wordprocessingGroup" xmlns:wpi="http://schemas.microsoft.com/office/word/2010/wordprocessingInk" xmlns:wps="http://schemas.microsoft.com/office/word/2010/wordprocessingShape" mc:Ignorable="w14 wp14">
+  <w:p>
+    <w:pPr>
+      <w:pStyle w:val="Header"/>
+      <w:spacing w:after="40"/>
+      <w:jc w:val="right"/>
+      <w:pBdr>
+        <w:bottom w:val="single" w:sz="4" w:space="2" w:color="808080"/>
+      </w:pBdr>
+    </w:pPr>
+    <w:r/>
+    <w:r>
+      <w:rPr>
+        <w:rFonts w:ascii="Arial" w:hAnsi="Arial"/>
+        <w:b/>
+        <w:color w:val="555555"/>
+        <w:sz w:val="20"/>
+      </w:rPr>
+      <w:t>6. AP Configuration Mode</w:t>
+    </w:r>
+  </w:p>
+</w:hdr>
+</file>
+
+<file path=word/header73.xml><?xml version="1.0" encoding="utf-8"?>
+<w:hdr xmlns:m="http://schemas.openxmlformats.org/officeDocument/2006/math" xmlns:mc="http://schemas.openxmlformats.org/markup-compatibility/2006" xmlns:mo="http://schemas.microsoft.com/office/mac/office/2008/main" xmlns:mv="urn:schemas-microsoft-com:mac:vml" xmlns:o="urn:schemas-microsoft-com:office:office" xmlns:r="http://schemas.openxmlformats.org/officeDocument/2006/relationships" xmlns:v="urn:schemas-microsoft-com:vml" xmlns:w10="urn:schemas-microsoft-com:office:word" xmlns:w14="http://schemas.microsoft.com/office/word/2010/wordml" xmlns:w="http://schemas.openxmlformats.org/wordprocessingml/2006/main" xmlns:wne="http://schemas.microsoft.com/office/word/2006/wordml" xmlns:wp14="http://schemas.microsoft.com/office/word/2010/wordprocessingDrawing" xmlns:wp="http://schemas.openxmlformats.org/drawingml/2006/wordprocessingDrawing" xmlns:wpc="http://schemas.microsoft.com/office/word/2010/wordprocessingCanvas" xmlns:wpg="http://schemas.microsoft.com/office/word/2010/wordprocessingGroup" xmlns:wpi="http://schemas.microsoft.com/office/word/2010/wordprocessingInk" xmlns:wps="http://schemas.microsoft.com/office/word/2010/wordprocessingShape" mc:Ignorable="w14 wp14">
+  <w:p>
+    <w:pPr>
+      <w:pStyle w:val="Header"/>
+      <w:spacing w:after="40"/>
+      <w:jc w:val="right"/>
+      <w:pBdr>
+        <w:bottom w:val="single" w:sz="4" w:space="2" w:color="808080"/>
+      </w:pBdr>
+    </w:pPr>
+    <w:r/>
+    <w:r>
+      <w:rPr>
+        <w:rFonts w:ascii="Arial" w:hAnsi="Arial"/>
+        <w:b/>
+        <w:color w:val="555555"/>
+        <w:sz w:val="20"/>
+      </w:rPr>
+      <w:t>7. Live Settings Web Interface</w:t>
+    </w:r>
+  </w:p>
+</w:hdr>
+</file>
+
+<file path=word/header74.xml><?xml version="1.0" encoding="utf-8"?>
+<w:hdr xmlns:m="http://schemas.openxmlformats.org/officeDocument/2006/math" xmlns:mc="http://schemas.openxmlformats.org/markup-compatibility/2006" xmlns:mo="http://schemas.microsoft.com/office/mac/office/2008/main" xmlns:mv="urn:schemas-microsoft-com:mac:vml" xmlns:o="urn:schemas-microsoft-com:office:office" xmlns:r="http://schemas.openxmlformats.org/officeDocument/2006/relationships" xmlns:v="urn:schemas-microsoft-com:vml" xmlns:w10="urn:schemas-microsoft-com:office:word" xmlns:w14="http://schemas.microsoft.com/office/word/2010/wordml" xmlns:w="http://schemas.openxmlformats.org/wordprocessingml/2006/main" xmlns:wne="http://schemas.microsoft.com/office/word/2006/wordml" xmlns:wp14="http://schemas.microsoft.com/office/word/2010/wordprocessingDrawing" xmlns:wp="http://schemas.openxmlformats.org/drawingml/2006/wordprocessingDrawing" xmlns:wpc="http://schemas.microsoft.com/office/word/2010/wordprocessingCanvas" xmlns:wpg="http://schemas.microsoft.com/office/word/2010/wordprocessingGroup" xmlns:wpi="http://schemas.microsoft.com/office/word/2010/wordprocessingInk" xmlns:wps="http://schemas.microsoft.com/office/word/2010/wordprocessingShape" mc:Ignorable="w14 wp14">
+  <w:p>
+    <w:pPr>
+      <w:pStyle w:val="Header"/>
+      <w:spacing w:after="40"/>
+      <w:jc w:val="right"/>
+      <w:pBdr>
+        <w:bottom w:val="single" w:sz="4" w:space="2" w:color="808080"/>
+      </w:pBdr>
+    </w:pPr>
+    <w:r/>
+    <w:r>
+      <w:rPr>
+        <w:rFonts w:ascii="Arial" w:hAnsi="Arial"/>
+        <w:b/>
+        <w:color w:val="555555"/>
+        <w:sz w:val="20"/>
+      </w:rPr>
+      <w:t>8. Period Overrides</w:t>
+    </w:r>
+  </w:p>
+</w:hdr>
+</file>
+
+<file path=word/header75.xml><?xml version="1.0" encoding="utf-8"?>
+<w:hdr xmlns:m="http://schemas.openxmlformats.org/officeDocument/2006/math" xmlns:mc="http://schemas.openxmlformats.org/markup-compatibility/2006" xmlns:mo="http://schemas.microsoft.com/office/mac/office/2008/main" xmlns:mv="urn:schemas-microsoft-com:mac:vml" xmlns:o="urn:schemas-microsoft-com:office:office" xmlns:r="http://schemas.openxmlformats.org/officeDocument/2006/relationships" xmlns:v="urn:schemas-microsoft-com:vml" xmlns:w10="urn:schemas-microsoft-com:office:word" xmlns:w14="http://schemas.microsoft.com/office/word/2010/wordml" xmlns:w="http://schemas.openxmlformats.org/wordprocessingml/2006/main" xmlns:wne="http://schemas.microsoft.com/office/word/2006/wordml" xmlns:wp14="http://schemas.microsoft.com/office/word/2010/wordprocessingDrawing" xmlns:wp="http://schemas.openxmlformats.org/drawingml/2006/wordprocessingDrawing" xmlns:wpc="http://schemas.microsoft.com/office/word/2010/wordprocessingCanvas" xmlns:wpg="http://schemas.microsoft.com/office/word/2010/wordprocessingGroup" xmlns:wpi="http://schemas.microsoft.com/office/word/2010/wordprocessingInk" xmlns:wps="http://schemas.microsoft.com/office/word/2010/wordprocessingShape" mc:Ignorable="w14 wp14">
+  <w:p>
+    <w:pPr>
+      <w:pStyle w:val="Header"/>
+      <w:spacing w:after="40"/>
+      <w:jc w:val="right"/>
+      <w:pBdr>
+        <w:bottom w:val="single" w:sz="4" w:space="2" w:color="808080"/>
+      </w:pBdr>
+    </w:pPr>
+    <w:r/>
+    <w:r>
+      <w:rPr>
+        <w:rFonts w:ascii="Arial" w:hAnsi="Arial"/>
+        <w:b/>
+        <w:color w:val="555555"/>
+        <w:sz w:val="20"/>
+      </w:rPr>
+      <w:t>9. Backlight (LED) Effects</w:t>
+    </w:r>
+  </w:p>
+</w:hdr>
+</file>
+
+<file path=word/header76.xml><?xml version="1.0" encoding="utf-8"?>
+<w:hdr xmlns:m="http://schemas.openxmlformats.org/officeDocument/2006/math" xmlns:mc="http://schemas.openxmlformats.org/markup-compatibility/2006" xmlns:mo="http://schemas.microsoft.com/office/mac/office/2008/main" xmlns:mv="urn:schemas-microsoft-com:mac:vml" xmlns:o="urn:schemas-microsoft-com:office:office" xmlns:r="http://schemas.openxmlformats.org/officeDocument/2006/relationships" xmlns:v="urn:schemas-microsoft-com:vml" xmlns:w10="urn:schemas-microsoft-com:office:word" xmlns:w14="http://schemas.microsoft.com/office/word/2010/wordml" xmlns:w="http://schemas.openxmlformats.org/wordprocessingml/2006/main" xmlns:wne="http://schemas.microsoft.com/office/word/2006/wordml" xmlns:wp14="http://schemas.microsoft.com/office/word/2010/wordprocessingDrawing" xmlns:wp="http://schemas.openxmlformats.org/drawingml/2006/wordprocessingDrawing" xmlns:wpc="http://schemas.microsoft.com/office/word/2010/wordprocessingCanvas" xmlns:wpg="http://schemas.microsoft.com/office/word/2010/wordprocessingGroup" xmlns:wpi="http://schemas.microsoft.com/office/word/2010/wordprocessingInk" xmlns:wps="http://schemas.microsoft.com/office/word/2010/wordprocessingShape" mc:Ignorable="w14 wp14">
+  <w:p>
+    <w:pPr>
+      <w:pStyle w:val="Header"/>
+      <w:spacing w:after="40"/>
+      <w:jc w:val="right"/>
+      <w:pBdr>
+        <w:bottom w:val="single" w:sz="4" w:space="2" w:color="808080"/>
+      </w:pBdr>
+    </w:pPr>
+    <w:r/>
+    <w:r>
+      <w:rPr>
+        <w:rFonts w:ascii="Arial" w:hAnsi="Arial"/>
+        <w:b/>
+        <w:color w:val="555555"/>
+        <w:sz w:val="20"/>
+      </w:rPr>
+      <w:t>10. Word and Time Change Effects</w:t>
+    </w:r>
+  </w:p>
+</w:hdr>
+</file>
+
+<file path=word/header77.xml><?xml version="1.0" encoding="utf-8"?>
+<w:hdr xmlns:m="http://schemas.openxmlformats.org/officeDocument/2006/math" xmlns:mc="http://schemas.openxmlformats.org/markup-compatibility/2006" xmlns:mo="http://schemas.microsoft.com/office/mac/office/2008/main" xmlns:mv="urn:schemas-microsoft-com:mac:vml" xmlns:o="urn:schemas-microsoft-com:office:office" xmlns:r="http://schemas.openxmlformats.org/officeDocument/2006/relationships" xmlns:v="urn:schemas-microsoft-com:vml" xmlns:w10="urn:schemas-microsoft-com:office:word" xmlns:w14="http://schemas.microsoft.com/office/word/2010/wordml" xmlns:w="http://schemas.openxmlformats.org/wordprocessingml/2006/main" xmlns:wne="http://schemas.microsoft.com/office/word/2006/wordml" xmlns:wp14="http://schemas.microsoft.com/office/word/2010/wordprocessingDrawing" xmlns:wp="http://schemas.openxmlformats.org/drawingml/2006/wordprocessingDrawing" xmlns:wpc="http://schemas.microsoft.com/office/word/2010/wordprocessingCanvas" xmlns:wpg="http://schemas.microsoft.com/office/word/2010/wordprocessingGroup" xmlns:wpi="http://schemas.microsoft.com/office/word/2010/wordprocessingInk" xmlns:wps="http://schemas.microsoft.com/office/word/2010/wordprocessingShape" mc:Ignorable="w14 wp14">
+  <w:p>
+    <w:pPr>
+      <w:pStyle w:val="Header"/>
+      <w:spacing w:after="40"/>
+      <w:jc w:val="right"/>
+      <w:pBdr>
+        <w:bottom w:val="single" w:sz="4" w:space="2" w:color="808080"/>
+      </w:pBdr>
+    </w:pPr>
+    <w:r/>
+    <w:r>
+      <w:rPr>
+        <w:rFonts w:ascii="Arial" w:hAnsi="Arial"/>
+        <w:b/>
+        <w:color w:val="555555"/>
+        <w:sz w:val="20"/>
+      </w:rPr>
+      <w:t>11. Info Display Cycle</w:t>
+    </w:r>
+  </w:p>
+</w:hdr>
+</file>
+
+<file path=word/header78.xml><?xml version="1.0" encoding="utf-8"?>
+<w:hdr xmlns:m="http://schemas.openxmlformats.org/officeDocument/2006/math" xmlns:mc="http://schemas.openxmlformats.org/markup-compatibility/2006" xmlns:mo="http://schemas.microsoft.com/office/mac/office/2008/main" xmlns:mv="urn:schemas-microsoft-com:mac:vml" xmlns:o="urn:schemas-microsoft-com:office:office" xmlns:r="http://schemas.openxmlformats.org/officeDocument/2006/relationships" xmlns:v="urn:schemas-microsoft-com:vml" xmlns:w10="urn:schemas-microsoft-com:office:word" xmlns:w14="http://schemas.microsoft.com/office/word/2010/wordml" xmlns:w="http://schemas.openxmlformats.org/wordprocessingml/2006/main" xmlns:wne="http://schemas.microsoft.com/office/word/2006/wordml" xmlns:wp14="http://schemas.microsoft.com/office/word/2010/wordprocessingDrawing" xmlns:wp="http://schemas.openxmlformats.org/drawingml/2006/wordprocessingDrawing" xmlns:wpc="http://schemas.microsoft.com/office/word/2010/wordprocessingCanvas" xmlns:wpg="http://schemas.microsoft.com/office/word/2010/wordprocessingGroup" xmlns:wpi="http://schemas.microsoft.com/office/word/2010/wordprocessingInk" xmlns:wps="http://schemas.microsoft.com/office/word/2010/wordprocessingShape" mc:Ignorable="w14 wp14">
+  <w:p>
+    <w:pPr>
+      <w:pStyle w:val="Header"/>
+      <w:spacing w:after="40"/>
+      <w:jc w:val="right"/>
+      <w:pBdr>
+        <w:bottom w:val="single" w:sz="4" w:space="2" w:color="808080"/>
+      </w:pBdr>
+    </w:pPr>
+    <w:r/>
+    <w:r>
+      <w:rPr>
+        <w:rFonts w:ascii="Arial" w:hAnsi="Arial"/>
+        <w:b/>
+        <w:color w:val="555555"/>
+        <w:sz w:val="20"/>
+      </w:rPr>
+      <w:t>12. Word Libraries</w:t>
+    </w:r>
+  </w:p>
+</w:hdr>
+</file>
+
+<file path=word/header79.xml><?xml version="1.0" encoding="utf-8"?>
+<w:hdr xmlns:m="http://schemas.openxmlformats.org/officeDocument/2006/math" xmlns:mc="http://schemas.openxmlformats.org/markup-compatibility/2006" xmlns:mo="http://schemas.microsoft.com/office/mac/office/2008/main" xmlns:mv="urn:schemas-microsoft-com:mac:vml" xmlns:o="urn:schemas-microsoft-com:office:office" xmlns:r="http://schemas.openxmlformats.org/officeDocument/2006/relationships" xmlns:v="urn:schemas-microsoft-com:vml" xmlns:w10="urn:schemas-microsoft-com:office:word" xmlns:w14="http://schemas.microsoft.com/office/word/2010/wordml" xmlns:w="http://schemas.openxmlformats.org/wordprocessingml/2006/main" xmlns:wne="http://schemas.microsoft.com/office/word/2006/wordml" xmlns:wp14="http://schemas.microsoft.com/office/word/2010/wordprocessingDrawing" xmlns:wp="http://schemas.openxmlformats.org/drawingml/2006/wordprocessingDrawing" xmlns:wpc="http://schemas.microsoft.com/office/word/2010/wordprocessingCanvas" xmlns:wpg="http://schemas.microsoft.com/office/word/2010/wordprocessingGroup" xmlns:wpi="http://schemas.microsoft.com/office/word/2010/wordprocessingInk" xmlns:wps="http://schemas.microsoft.com/office/word/2010/wordprocessingShape" mc:Ignorable="w14 wp14">
+  <w:p>
+    <w:pPr>
+      <w:pStyle w:val="Header"/>
+      <w:spacing w:after="40"/>
+      <w:jc w:val="right"/>
+      <w:pBdr>
+        <w:bottom w:val="single" w:sz="4" w:space="2" w:color="808080"/>
+      </w:pBdr>
+    </w:pPr>
+    <w:r/>
+    <w:r>
+      <w:rPr>
+        <w:rFonts w:ascii="Arial" w:hAnsi="Arial"/>
+        <w:b/>
+        <w:color w:val="555555"/>
+        <w:sz w:val="20"/>
+      </w:rPr>
+      <w:t>13. Sensors</w:t>
+    </w:r>
+  </w:p>
+</w:hdr>
+</file>
+
+<file path=word/header8.xml><?xml version="1.0" encoding="utf-8"?>
+<w:hdr xmlns:m="http://schemas.openxmlformats.org/officeDocument/2006/math" xmlns:mc="http://schemas.openxmlformats.org/markup-compatibility/2006" xmlns:mo="http://schemas.microsoft.com/office/mac/office/2008/main" xmlns:mv="urn:schemas-microsoft-com:mac:vml" xmlns:o="urn:schemas-microsoft-com:office:office" xmlns:r="http://schemas.openxmlformats.org/officeDocument/2006/relationships" xmlns:v="urn:schemas-microsoft-com:vml" xmlns:w10="urn:schemas-microsoft-com:office:word" xmlns:w14="http://schemas.microsoft.com/office/word/2010/wordml" xmlns:w="http://schemas.openxmlformats.org/wordprocessingml/2006/main" xmlns:wne="http://schemas.microsoft.com/office/word/2006/wordml" xmlns:wp14="http://schemas.microsoft.com/office/word/2010/wordprocessingDrawing" xmlns:wp="http://schemas.openxmlformats.org/drawingml/2006/wordprocessingDrawing" xmlns:wpc="http://schemas.microsoft.com/office/word/2010/wordprocessingCanvas" xmlns:wpg="http://schemas.microsoft.com/office/word/2010/wordprocessingGroup" xmlns:wpi="http://schemas.microsoft.com/office/word/2010/wordprocessingInk" xmlns:wps="http://schemas.microsoft.com/office/word/2010/wordprocessingShape" mc:Ignorable="w14 wp14">
+  <w:p>
+    <w:pPr>
+      <w:pStyle w:val="Header"/>
+      <w:spacing w:after="40"/>
+      <w:jc w:val="right"/>
+      <w:pBdr>
+        <w:bottom w:val="single" w:sz="4" w:space="2" w:color="808080"/>
+      </w:pBdr>
+    </w:pPr>
+    <w:r/>
+    <w:r>
+      <w:rPr>
+        <w:rFonts w:ascii="Arial" w:hAnsi="Arial"/>
+        <w:b/>
+        <w:color w:val="555555"/>
+        <w:sz w:val="20"/>
+      </w:rPr>
+      <w:t>5. Power-On Functions</w:t>
+    </w:r>
+  </w:p>
+</w:hdr>
+</file>
+
+<file path=word/header80.xml><?xml version="1.0" encoding="utf-8"?>
+<w:hdr xmlns:m="http://schemas.openxmlformats.org/officeDocument/2006/math" xmlns:mc="http://schemas.openxmlformats.org/markup-compatibility/2006" xmlns:mo="http://schemas.microsoft.com/office/mac/office/2008/main" xmlns:mv="urn:schemas-microsoft-com:mac:vml" xmlns:o="urn:schemas-microsoft-com:office:office" xmlns:r="http://schemas.openxmlformats.org/officeDocument/2006/relationships" xmlns:v="urn:schemas-microsoft-com:vml" xmlns:w10="urn:schemas-microsoft-com:office:word" xmlns:w14="http://schemas.microsoft.com/office/word/2010/wordml" xmlns:w="http://schemas.openxmlformats.org/wordprocessingml/2006/main" xmlns:wne="http://schemas.microsoft.com/office/word/2006/wordml" xmlns:wp14="http://schemas.microsoft.com/office/word/2010/wordprocessingDrawing" xmlns:wp="http://schemas.openxmlformats.org/drawingml/2006/wordprocessingDrawing" xmlns:wpc="http://schemas.microsoft.com/office/word/2010/wordprocessingCanvas" xmlns:wpg="http://schemas.microsoft.com/office/word/2010/wordprocessingGroup" xmlns:wpi="http://schemas.microsoft.com/office/word/2010/wordprocessingInk" xmlns:wps="http://schemas.microsoft.com/office/word/2010/wordprocessingShape" mc:Ignorable="w14 wp14">
+  <w:p>
+    <w:pPr>
+      <w:pStyle w:val="Header"/>
+      <w:spacing w:after="40"/>
+      <w:jc w:val="right"/>
+      <w:pBdr>
+        <w:bottom w:val="single" w:sz="4" w:space="2" w:color="808080"/>
+      </w:pBdr>
+    </w:pPr>
+    <w:r/>
+    <w:r>
+      <w:rPr>
+        <w:rFonts w:ascii="Arial" w:hAnsi="Arial"/>
+        <w:b/>
+        <w:color w:val="555555"/>
+        <w:sz w:val="20"/>
+      </w:rPr>
+      <w:t>14. Time Source</w:t>
+    </w:r>
+  </w:p>
+</w:hdr>
+</file>
+
+<file path=word/header81.xml><?xml version="1.0" encoding="utf-8"?>
+<w:hdr xmlns:m="http://schemas.openxmlformats.org/officeDocument/2006/math" xmlns:mc="http://schemas.openxmlformats.org/markup-compatibility/2006" xmlns:mo="http://schemas.microsoft.com/office/mac/office/2008/main" xmlns:mv="urn:schemas-microsoft-com:mac:vml" xmlns:o="urn:schemas-microsoft-com:office:office" xmlns:r="http://schemas.openxmlformats.org/officeDocument/2006/relationships" xmlns:v="urn:schemas-microsoft-com:vml" xmlns:w10="urn:schemas-microsoft-com:office:word" xmlns:w14="http://schemas.microsoft.com/office/word/2010/wordml" xmlns:w="http://schemas.openxmlformats.org/wordprocessingml/2006/main" xmlns:wne="http://schemas.microsoft.com/office/word/2006/wordml" xmlns:wp14="http://schemas.microsoft.com/office/word/2010/wordprocessingDrawing" xmlns:wp="http://schemas.openxmlformats.org/drawingml/2006/wordprocessingDrawing" xmlns:wpc="http://schemas.microsoft.com/office/word/2010/wordprocessingCanvas" xmlns:wpg="http://schemas.microsoft.com/office/word/2010/wordprocessingGroup" xmlns:wpi="http://schemas.microsoft.com/office/word/2010/wordprocessingInk" xmlns:wps="http://schemas.microsoft.com/office/word/2010/wordprocessingShape" mc:Ignorable="w14 wp14">
+  <w:p>
+    <w:pPr>
+      <w:pStyle w:val="Header"/>
+      <w:spacing w:after="40"/>
+      <w:jc w:val="right"/>
+      <w:pBdr>
+        <w:bottom w:val="single" w:sz="4" w:space="2" w:color="808080"/>
+      </w:pBdr>
+    </w:pPr>
+    <w:r/>
+    <w:r>
+      <w:rPr>
+        <w:rFonts w:ascii="Arial" w:hAnsi="Arial"/>
+        <w:b/>
+        <w:color w:val="555555"/>
+        <w:sz w:val="20"/>
+      </w:rPr>
+      <w:t>15. OTA Firmware Update</w:t>
+    </w:r>
+  </w:p>
+</w:hdr>
+</file>
+
+<file path=word/header82.xml><?xml version="1.0" encoding="utf-8"?>
+<w:hdr xmlns:m="http://schemas.openxmlformats.org/officeDocument/2006/math" xmlns:mc="http://schemas.openxmlformats.org/markup-compatibility/2006" xmlns:mo="http://schemas.microsoft.com/office/mac/office/2008/main" xmlns:mv="urn:schemas-microsoft-com:mac:vml" xmlns:o="urn:schemas-microsoft-com:office:office" xmlns:r="http://schemas.openxmlformats.org/officeDocument/2006/relationships" xmlns:v="urn:schemas-microsoft-com:vml" xmlns:w10="urn:schemas-microsoft-com:office:word" xmlns:w14="http://schemas.microsoft.com/office/word/2010/wordml" xmlns:w="http://schemas.openxmlformats.org/wordprocessingml/2006/main" xmlns:wne="http://schemas.microsoft.com/office/word/2006/wordml" xmlns:wp14="http://schemas.microsoft.com/office/word/2010/wordprocessingDrawing" xmlns:wp="http://schemas.openxmlformats.org/drawingml/2006/wordprocessingDrawing" xmlns:wpc="http://schemas.microsoft.com/office/word/2010/wordprocessingCanvas" xmlns:wpg="http://schemas.microsoft.com/office/word/2010/wordprocessingGroup" xmlns:wpi="http://schemas.microsoft.com/office/word/2010/wordprocessingInk" xmlns:wps="http://schemas.microsoft.com/office/word/2010/wordprocessingShape" mc:Ignorable="w14 wp14">
+  <w:p>
+    <w:pPr>
+      <w:pStyle w:val="Header"/>
+      <w:spacing w:after="40"/>
+      <w:jc w:val="right"/>
+      <w:pBdr>
+        <w:bottom w:val="single" w:sz="4" w:space="2" w:color="808080"/>
+      </w:pBdr>
+    </w:pPr>
+    <w:r/>
+    <w:r>
+      <w:rPr>
+        <w:rFonts w:ascii="Arial" w:hAnsi="Arial"/>
+        <w:b/>
+        <w:color w:val="555555"/>
+        <w:sz w:val="20"/>
+      </w:rPr>
+      <w:t>16. Factory Reset</w:t>
+    </w:r>
+  </w:p>
+</w:hdr>
+</file>
+
+<file path=word/header83.xml><?xml version="1.0" encoding="utf-8"?>
+<w:hdr xmlns:m="http://schemas.openxmlformats.org/officeDocument/2006/math" xmlns:mc="http://schemas.openxmlformats.org/markup-compatibility/2006" xmlns:mo="http://schemas.microsoft.com/office/mac/office/2008/main" xmlns:mv="urn:schemas-microsoft-com:mac:vml" xmlns:o="urn:schemas-microsoft-com:office:office" xmlns:r="http://schemas.openxmlformats.org/officeDocument/2006/relationships" xmlns:v="urn:schemas-microsoft-com:vml" xmlns:w10="urn:schemas-microsoft-com:office:word" xmlns:w14="http://schemas.microsoft.com/office/word/2010/wordml" xmlns:w="http://schemas.openxmlformats.org/wordprocessingml/2006/main" xmlns:wne="http://schemas.microsoft.com/office/word/2006/wordml" xmlns:wp14="http://schemas.microsoft.com/office/word/2010/wordprocessingDrawing" xmlns:wp="http://schemas.openxmlformats.org/drawingml/2006/wordprocessingDrawing" xmlns:wpc="http://schemas.microsoft.com/office/word/2010/wordprocessingCanvas" xmlns:wpg="http://schemas.microsoft.com/office/word/2010/wordprocessingGroup" xmlns:wpi="http://schemas.microsoft.com/office/word/2010/wordprocessingInk" xmlns:wps="http://schemas.microsoft.com/office/word/2010/wordprocessingShape" mc:Ignorable="w14 wp14">
+  <w:p>
+    <w:pPr>
+      <w:pStyle w:val="Header"/>
+      <w:spacing w:after="40"/>
+      <w:jc w:val="right"/>
+      <w:pBdr>
+        <w:bottom w:val="single" w:sz="4" w:space="2" w:color="808080"/>
+      </w:pBdr>
+    </w:pPr>
+    <w:r/>
+    <w:r>
+      <w:rPr>
+        <w:rFonts w:ascii="Arial" w:hAnsi="Arial"/>
+        <w:b/>
+        <w:color w:val="555555"/>
+        <w:sz w:val="20"/>
+      </w:rPr>
+      <w:t>17. Display Messages</w:t>
+    </w:r>
+  </w:p>
+</w:hdr>
+</file>
+
+<file path=word/header84.xml><?xml version="1.0" encoding="utf-8"?>
+<w:hdr xmlns:m="http://schemas.openxmlformats.org/officeDocument/2006/math" xmlns:mc="http://schemas.openxmlformats.org/markup-compatibility/2006" xmlns:mo="http://schemas.microsoft.com/office/mac/office/2008/main" xmlns:mv="urn:schemas-microsoft-com:mac:vml" xmlns:o="urn:schemas-microsoft-com:office:office" xmlns:r="http://schemas.openxmlformats.org/officeDocument/2006/relationships" xmlns:v="urn:schemas-microsoft-com:vml" xmlns:w10="urn:schemas-microsoft-com:office:word" xmlns:w14="http://schemas.microsoft.com/office/word/2010/wordml" xmlns:w="http://schemas.openxmlformats.org/wordprocessingml/2006/main" xmlns:wne="http://schemas.microsoft.com/office/word/2006/wordml" xmlns:wp14="http://schemas.microsoft.com/office/word/2010/wordprocessingDrawing" xmlns:wp="http://schemas.openxmlformats.org/drawingml/2006/wordprocessingDrawing" xmlns:wpc="http://schemas.microsoft.com/office/word/2010/wordprocessingCanvas" xmlns:wpg="http://schemas.microsoft.com/office/word/2010/wordprocessingGroup" xmlns:wpi="http://schemas.microsoft.com/office/word/2010/wordprocessingInk" xmlns:wps="http://schemas.microsoft.com/office/word/2010/wordprocessingShape" mc:Ignorable="w14 wp14">
+  <w:p>
+    <w:pPr>
+      <w:pStyle w:val="Header"/>
+      <w:spacing w:after="40"/>
+      <w:jc w:val="right"/>
+      <w:pBdr>
+        <w:bottom w:val="single" w:sz="4" w:space="2" w:color="808080"/>
+      </w:pBdr>
+    </w:pPr>
+    <w:r/>
+    <w:r>
+      <w:rPr>
+        <w:rFonts w:ascii="Arial" w:hAnsi="Arial"/>
+        <w:b/>
+        <w:color w:val="555555"/>
+        <w:sz w:val="20"/>
+      </w:rPr>
+      <w:t>18. Troubleshooting</w:t>
+    </w:r>
+  </w:p>
+</w:hdr>
+</file>
+
+<file path=word/header85.xml><?xml version="1.0" encoding="utf-8"?>
+<w:hdr xmlns:m="http://schemas.openxmlformats.org/officeDocument/2006/math" xmlns:mc="http://schemas.openxmlformats.org/markup-compatibility/2006" xmlns:mo="http://schemas.microsoft.com/office/mac/office/2008/main" xmlns:mv="urn:schemas-microsoft-com:mac:vml" xmlns:o="urn:schemas-microsoft-com:office:office" xmlns:r="http://schemas.openxmlformats.org/officeDocument/2006/relationships" xmlns:v="urn:schemas-microsoft-com:vml" xmlns:w10="urn:schemas-microsoft-com:office:word" xmlns:w14="http://schemas.microsoft.com/office/word/2010/wordml" xmlns:w="http://schemas.openxmlformats.org/wordprocessingml/2006/main" xmlns:wne="http://schemas.microsoft.com/office/word/2006/wordml" xmlns:wp14="http://schemas.microsoft.com/office/word/2010/wordprocessingDrawing" xmlns:wp="http://schemas.openxmlformats.org/drawingml/2006/wordprocessingDrawing" xmlns:wpc="http://schemas.microsoft.com/office/word/2010/wordprocessingCanvas" xmlns:wpg="http://schemas.microsoft.com/office/word/2010/wordprocessingGroup" xmlns:wpi="http://schemas.microsoft.com/office/word/2010/wordprocessingInk" xmlns:wps="http://schemas.microsoft.com/office/word/2010/wordprocessingShape" mc:Ignorable="w14 wp14">
+  <w:p>
+    <w:pPr>
+      <w:pStyle w:val="Header"/>
+      <w:spacing w:after="40"/>
+      <w:jc w:val="right"/>
+      <w:pBdr>
+        <w:bottom w:val="single" w:sz="4" w:space="2" w:color="808080"/>
+      </w:pBdr>
+    </w:pPr>
+    <w:r/>
+    <w:r>
+      <w:rPr>
+        <w:rFonts w:ascii="Arial" w:hAnsi="Arial"/>
+        <w:b/>
+        <w:color w:val="555555"/>
+        <w:sz w:val="20"/>
+      </w:rPr>
+      <w:t>Copyright and Disclaimer</w:t>
     </w:r>
   </w:p>
 </w:hdr>

</xml_diff>

<commit_message>
Manuals: rule capacity for the locked classic clocks - original Zev-7 50 (4 without PSRAM), original Metronome 7; WordClock 1-4 58/6 (rev 4); WordClock 5 50/5 (rev 7)
</commit_message>
<xml_diff>
--- a/WordClock 1-4 Operator Manual.docx
+++ b/WordClock 1-4 Operator Manual.docx
@@ -375,7 +375,7 @@
                 <w:rFonts w:ascii="Arial" w:hAnsi="Arial"/>
                 <w:sz w:val="21"/>
               </w:rPr>
-              <w:t>Updated guide (Revision 3)</w:t>
+              <w:t>Updated guide (Revision 4)</w:t>
             </w:r>
           </w:p>
         </w:tc>
@@ -465,8 +465,8 @@
     <w:p>
       <w:pPr>
         <w:sectPr>
-          <w:headerReference w:type="default" r:id="rId183"/>
-          <w:footerReference w:type="default" r:id="rId184"/>
+          <w:headerReference w:type="default" r:id="rId225"/>
+          <w:footerReference w:type="default" r:id="rId226"/>
           <w:pgSz w:w="12240" w:h="15840"/>
           <w:pgMar w:top="1440" w:right="1800" w:bottom="1440" w:left="1800" w:header="720" w:footer="720" w:gutter="0"/>
           <w:cols w:space="720"/>
@@ -1104,8 +1104,8 @@
     <w:p>
       <w:pPr>
         <w:sectPr>
-          <w:headerReference w:type="default" r:id="rId185"/>
-          <w:footerReference w:type="default" r:id="rId186"/>
+          <w:headerReference w:type="default" r:id="rId227"/>
+          <w:footerReference w:type="default" r:id="rId228"/>
           <w:pgSz w:w="12240" w:h="15840"/>
           <w:pgMar w:top="1440" w:right="1800" w:bottom="1440" w:left="1800" w:header="720" w:footer="720" w:gutter="0"/>
           <w:cols w:space="720"/>
@@ -1637,8 +1637,8 @@
     <w:p>
       <w:pPr>
         <w:sectPr>
-          <w:headerReference w:type="default" r:id="rId187"/>
-          <w:footerReference w:type="default" r:id="rId188"/>
+          <w:headerReference w:type="default" r:id="rId229"/>
+          <w:footerReference w:type="default" r:id="rId230"/>
           <w:pgSz w:w="12240" w:h="15840"/>
           <w:pgMar w:top="1440" w:right="1800" w:bottom="1440" w:left="1800" w:header="720" w:footer="720" w:gutter="0"/>
           <w:cols w:space="720"/>
@@ -1732,8 +1732,8 @@
     <w:p>
       <w:pPr>
         <w:sectPr>
-          <w:headerReference w:type="default" r:id="rId189"/>
-          <w:footerReference w:type="default" r:id="rId190"/>
+          <w:headerReference w:type="default" r:id="rId231"/>
+          <w:footerReference w:type="default" r:id="rId232"/>
           <w:pgSz w:w="12240" w:h="15840"/>
           <w:pgMar w:top="1440" w:right="1800" w:bottom="1440" w:left="1800" w:header="720" w:footer="720" w:gutter="0"/>
           <w:cols w:space="720"/>
@@ -2531,8 +2531,8 @@
     <w:p>
       <w:pPr>
         <w:sectPr>
-          <w:headerReference w:type="default" r:id="rId191"/>
-          <w:footerReference w:type="default" r:id="rId192"/>
+          <w:headerReference w:type="default" r:id="rId233"/>
+          <w:footerReference w:type="default" r:id="rId234"/>
           <w:pgSz w:w="12240" w:h="15840"/>
           <w:pgMar w:top="1440" w:right="1800" w:bottom="1440" w:left="1800" w:header="720" w:footer="720" w:gutter="0"/>
           <w:cols w:space="720"/>
@@ -2608,8 +2608,8 @@
     <w:p>
       <w:pPr>
         <w:sectPr>
-          <w:headerReference w:type="default" r:id="rId193"/>
-          <w:footerReference w:type="default" r:id="rId194"/>
+          <w:headerReference w:type="default" r:id="rId235"/>
+          <w:footerReference w:type="default" r:id="rId236"/>
           <w:pgSz w:w="12240" w:h="15840"/>
           <w:pgMar w:top="1440" w:right="1800" w:bottom="1440" w:left="1800" w:header="720" w:footer="720" w:gutter="0"/>
           <w:cols w:space="720"/>
@@ -3102,8 +3102,8 @@
     <w:p>
       <w:pPr>
         <w:sectPr>
-          <w:headerReference w:type="default" r:id="rId195"/>
-          <w:footerReference w:type="default" r:id="rId196"/>
+          <w:headerReference w:type="default" r:id="rId237"/>
+          <w:footerReference w:type="default" r:id="rId238"/>
           <w:pgSz w:w="12240" w:h="15840"/>
           <w:pgMar w:top="1440" w:right="1800" w:bottom="1440" w:left="1800" w:header="720" w:footer="720" w:gutter="0"/>
           <w:cols w:space="720"/>
@@ -3299,8 +3299,8 @@
     <w:p>
       <w:pPr>
         <w:sectPr>
-          <w:headerReference w:type="default" r:id="rId197"/>
-          <w:footerReference w:type="default" r:id="rId198"/>
+          <w:headerReference w:type="default" r:id="rId239"/>
+          <w:footerReference w:type="default" r:id="rId240"/>
           <w:pgSz w:w="12240" w:h="15840"/>
           <w:pgMar w:top="1440" w:right="1800" w:bottom="1440" w:left="1800" w:header="720" w:footer="720" w:gutter="0"/>
           <w:cols w:space="720"/>
@@ -6594,8 +6594,8 @@
     <w:p>
       <w:pPr>
         <w:sectPr>
-          <w:headerReference w:type="default" r:id="rId199"/>
-          <w:footerReference w:type="default" r:id="rId200"/>
+          <w:headerReference w:type="default" r:id="rId241"/>
+          <w:footerReference w:type="default" r:id="rId242"/>
           <w:pgSz w:w="12240" w:h="15840"/>
           <w:pgMar w:top="1440" w:right="1800" w:bottom="1440" w:left="1800" w:header="720" w:footer="720" w:gutter="0"/>
           <w:cols w:space="720"/>
@@ -7173,8 +7173,8 @@
     <w:p>
       <w:pPr>
         <w:sectPr>
-          <w:headerReference w:type="default" r:id="rId201"/>
-          <w:footerReference w:type="default" r:id="rId202"/>
+          <w:headerReference w:type="default" r:id="rId243"/>
+          <w:footerReference w:type="default" r:id="rId244"/>
           <w:pgSz w:w="12240" w:h="15840"/>
           <w:pgMar w:top="1440" w:right="1800" w:bottom="1440" w:left="1800" w:header="720" w:footer="720" w:gutter="0"/>
           <w:cols w:space="720"/>
@@ -7226,7 +7226,7 @@
           <w:rFonts w:ascii="Arial" w:hAnsi="Arial"/>
           <w:sz w:val="22"/>
         </w:rPr>
-        <w:t>The Rule Scheduler changes display settings automatically by time of day and day of the week. It replaces the three Period Overrides and the Override Mode switch of earlier firmware. Up to 32 rules can be stored. Each rule combines a time window, an optional day filter, and one or more settings to apply during that window; settings a rule does not mention keep their saved values. The most common use is to dim or turn off the display during sleeping hours.</w:t>
+        <w:t>The Rule Scheduler changes display settings automatically by time of day and day of the week. It replaces the three Period Overrides and the Override Mode switch of earlier firmware. Up to 58 rules can be stored on a clock with PSRAM, or 6 on a clock without it. If a saved schedule is longer than the limit (for example after a firmware update), only the first rules, at the top of the list, are kept. Each rule combines a time window, an optional day filter, and one or more settings to apply during that window; settings a rule does not mention keep their saved values. The most common use is to dim or turn off the display during sleeping hours.</w:t>
       </w:r>
     </w:p>
     <w:p>
@@ -8150,8 +8150,8 @@
     <w:p>
       <w:pPr>
         <w:sectPr>
-          <w:headerReference w:type="default" r:id="rId203"/>
-          <w:footerReference w:type="default" r:id="rId204"/>
+          <w:headerReference w:type="default" r:id="rId245"/>
+          <w:footerReference w:type="default" r:id="rId246"/>
           <w:pgSz w:w="12240" w:h="15840"/>
           <w:pgMar w:top="1440" w:right="1800" w:bottom="1440" w:left="1800" w:header="720" w:footer="720" w:gutter="0"/>
           <w:cols w:space="720"/>
@@ -8962,8 +8962,8 @@
     <w:p>
       <w:pPr>
         <w:sectPr>
-          <w:headerReference w:type="default" r:id="rId205"/>
-          <w:footerReference w:type="default" r:id="rId206"/>
+          <w:headerReference w:type="default" r:id="rId247"/>
+          <w:footerReference w:type="default" r:id="rId248"/>
           <w:pgSz w:w="12240" w:h="15840"/>
           <w:pgMar w:top="1440" w:right="1800" w:bottom="1440" w:left="1800" w:header="720" w:footer="720" w:gutter="0"/>
           <w:cols w:space="720"/>
@@ -9288,8 +9288,8 @@
     <w:p>
       <w:pPr>
         <w:sectPr>
-          <w:headerReference w:type="default" r:id="rId207"/>
-          <w:footerReference w:type="default" r:id="rId208"/>
+          <w:headerReference w:type="default" r:id="rId249"/>
+          <w:footerReference w:type="default" r:id="rId250"/>
           <w:pgSz w:w="12240" w:h="15840"/>
           <w:pgMar w:top="1440" w:right="1800" w:bottom="1440" w:left="1800" w:header="720" w:footer="720" w:gutter="0"/>
           <w:cols w:space="720"/>
@@ -9490,8 +9490,8 @@
     <w:p>
       <w:pPr>
         <w:sectPr>
-          <w:headerReference w:type="default" r:id="rId209"/>
-          <w:footerReference w:type="default" r:id="rId210"/>
+          <w:headerReference w:type="default" r:id="rId251"/>
+          <w:footerReference w:type="default" r:id="rId252"/>
           <w:pgSz w:w="12240" w:h="15840"/>
           <w:pgMar w:top="1440" w:right="1800" w:bottom="1440" w:left="1800" w:header="720" w:footer="720" w:gutter="0"/>
           <w:cols w:space="720"/>
@@ -9915,8 +9915,8 @@
     <w:p>
       <w:pPr>
         <w:sectPr>
-          <w:headerReference w:type="default" r:id="rId211"/>
-          <w:footerReference w:type="default" r:id="rId212"/>
+          <w:headerReference w:type="default" r:id="rId253"/>
+          <w:footerReference w:type="default" r:id="rId254"/>
           <w:pgSz w:w="12240" w:h="15840"/>
           <w:pgMar w:top="1440" w:right="1800" w:bottom="1440" w:left="1800" w:header="720" w:footer="720" w:gutter="0"/>
           <w:cols w:space="720"/>
@@ -10070,8 +10070,8 @@
     <w:p>
       <w:pPr>
         <w:sectPr>
-          <w:headerReference w:type="default" r:id="rId213"/>
-          <w:footerReference w:type="default" r:id="rId214"/>
+          <w:headerReference w:type="default" r:id="rId255"/>
+          <w:footerReference w:type="default" r:id="rId256"/>
           <w:pgSz w:w="12240" w:h="15840"/>
           <w:pgMar w:top="1440" w:right="1800" w:bottom="1440" w:left="1800" w:header="720" w:footer="720" w:gutter="0"/>
           <w:cols w:space="720"/>
@@ -10196,8 +10196,8 @@
     <w:p>
       <w:pPr>
         <w:sectPr>
-          <w:headerReference w:type="default" r:id="rId215"/>
-          <w:footerReference w:type="default" r:id="rId216"/>
+          <w:headerReference w:type="default" r:id="rId257"/>
+          <w:footerReference w:type="default" r:id="rId258"/>
           <w:pgSz w:w="12240" w:h="15840"/>
           <w:pgMar w:top="1440" w:right="1800" w:bottom="1440" w:left="1800" w:header="720" w:footer="720" w:gutter="0"/>
           <w:cols w:space="720"/>
@@ -10809,8 +10809,8 @@
     <w:p>
       <w:pPr>
         <w:sectPr>
-          <w:headerReference w:type="default" r:id="rId217"/>
-          <w:footerReference w:type="default" r:id="rId218"/>
+          <w:headerReference w:type="default" r:id="rId259"/>
+          <w:footerReference w:type="default" r:id="rId260"/>
           <w:pgSz w:w="12240" w:h="15840"/>
           <w:pgMar w:top="1440" w:right="1800" w:bottom="1440" w:left="1800" w:header="720" w:footer="720" w:gutter="0"/>
           <w:cols w:space="720"/>
@@ -10931,8 +10931,8 @@
     <w:p>
       <w:pPr>
         <w:sectPr>
-          <w:headerReference w:type="default" r:id="rId219"/>
-          <w:footerReference w:type="default" r:id="rId220"/>
+          <w:headerReference w:type="default" r:id="rId261"/>
+          <w:footerReference w:type="default" r:id="rId262"/>
           <w:pgSz w:w="12240" w:h="15840"/>
           <w:pgMar w:top="1440" w:right="1800" w:bottom="1440" w:left="1800" w:header="720" w:footer="720" w:gutter="0"/>
           <w:cols w:space="720"/>
@@ -11725,8 +11725,8 @@
     <w:p>
       <w:pPr>
         <w:sectPr>
-          <w:headerReference w:type="default" r:id="rId221"/>
-          <w:footerReference w:type="default" r:id="rId222"/>
+          <w:headerReference w:type="default" r:id="rId263"/>
+          <w:footerReference w:type="default" r:id="rId264"/>
           <w:pgSz w:w="12240" w:h="15840"/>
           <w:pgMar w:top="1440" w:right="1800" w:bottom="1440" w:left="1800" w:header="720" w:footer="720" w:gutter="0"/>
           <w:cols w:space="720"/>
@@ -12941,8 +12941,8 @@
     <w:p>
       <w:pPr>
         <w:sectPr>
-          <w:headerReference w:type="default" r:id="rId223"/>
-          <w:footerReference w:type="default" r:id="rId224"/>
+          <w:headerReference w:type="default" r:id="rId265"/>
+          <w:footerReference w:type="default" r:id="rId266"/>
           <w:pgSz w:w="12240" w:h="15840"/>
           <w:pgMar w:top="1440" w:right="1800" w:bottom="1440" w:left="1800" w:header="720" w:footer="720" w:gutter="0"/>
           <w:cols w:space="720"/>
@@ -13034,8 +13034,8 @@
       </w:r>
     </w:p>
     <w:sectPr>
-      <w:headerReference w:type="default" r:id="rId225"/>
-      <w:footerReference w:type="default" r:id="rId226"/>
+      <w:headerReference w:type="default" r:id="rId267"/>
+      <w:footerReference w:type="default" r:id="rId268"/>
       <w:pgSz w:w="12240" w:h="15840"/>
       <w:pgMar w:top="1440" w:right="1800" w:bottom="1440" w:left="1800" w:header="720" w:footer="720" w:gutter="0"/>
       <w:cols w:space="720"/>
@@ -13426,13 +13426,150 @@
       </w:pBdr>
     </w:pPr>
     <w:r/>
-    <w:r>
-      <w:rPr>
-        <w:rFonts w:ascii="Arial" w:hAnsi="Arial"/>
-        <w:color w:val="555555"/>
-        <w:sz w:val="20"/>
-      </w:rPr>
-      <w:t>Revision 3 — October 2026</w:t>
+  </w:p>
+</w:ftr>
+</file>
+
+<file path=word/footer107.xml><?xml version="1.0" encoding="utf-8"?>
+<w:ftr xmlns:m="http://schemas.openxmlformats.org/officeDocument/2006/math" xmlns:mc="http://schemas.openxmlformats.org/markup-compatibility/2006" xmlns:mo="http://schemas.microsoft.com/office/mac/office/2008/main" xmlns:mv="urn:schemas-microsoft-com:mac:vml" xmlns:o="urn:schemas-microsoft-com:office:office" xmlns:r="http://schemas.openxmlformats.org/officeDocument/2006/relationships" xmlns:v="urn:schemas-microsoft-com:vml" xmlns:w10="urn:schemas-microsoft-com:office:word" xmlns:w14="http://schemas.microsoft.com/office/word/2010/wordml" xmlns:w="http://schemas.openxmlformats.org/wordprocessingml/2006/main" xmlns:wne="http://schemas.microsoft.com/office/word/2006/wordml" xmlns:wp14="http://schemas.microsoft.com/office/word/2010/wordprocessingDrawing" xmlns:wp="http://schemas.openxmlformats.org/drawingml/2006/wordprocessingDrawing" xmlns:wpc="http://schemas.microsoft.com/office/word/2010/wordprocessingCanvas" xmlns:wpg="http://schemas.microsoft.com/office/word/2010/wordprocessingGroup" xmlns:wpi="http://schemas.microsoft.com/office/word/2010/wordprocessingInk" xmlns:wps="http://schemas.microsoft.com/office/word/2010/wordprocessingShape" mc:Ignorable="w14 wp14">
+  <w:p>
+    <w:pPr>
+      <w:pStyle w:val="Footer"/>
+      <w:spacing w:before="40"/>
+      <w:jc w:val="left"/>
+      <w:pBdr>
+        <w:top w:val="single" w:sz="4" w:space="2" w:color="808080"/>
+      </w:pBdr>
+    </w:pPr>
+    <w:r/>
+    <w:r>
+      <w:rPr>
+        <w:rFonts w:ascii="Arial" w:hAnsi="Arial"/>
+        <w:color w:val="555555"/>
+        <w:sz w:val="20"/>
+      </w:rPr>
+      <w:t>Revision 4 — October 2026</w:t>
+    </w:r>
+    <w:r>
+      <w:rPr>
+        <w:rFonts w:ascii="Arial" w:hAnsi="Arial"/>
+      </w:rPr>
+      <w:tab/>
+      <w:tab/>
+    </w:r>
+    <w:r>
+      <w:rPr>
+        <w:rFonts w:ascii="Arial" w:hAnsi="Arial"/>
+        <w:color w:val="555555"/>
+        <w:sz w:val="20"/>
+      </w:rPr>
+      <w:fldChar w:fldCharType="begin"/>
+      <w:instrText xml:space="preserve"> PAGE </w:instrText>
+      <w:fldChar w:fldCharType="separate"/>
+      <w:t>1</w:t>
+      <w:fldChar w:fldCharType="end"/>
+    </w:r>
+  </w:p>
+</w:ftr>
+</file>
+
+<file path=word/footer108.xml><?xml version="1.0" encoding="utf-8"?>
+<w:ftr xmlns:m="http://schemas.openxmlformats.org/officeDocument/2006/math" xmlns:mc="http://schemas.openxmlformats.org/markup-compatibility/2006" xmlns:mo="http://schemas.microsoft.com/office/mac/office/2008/main" xmlns:mv="urn:schemas-microsoft-com:mac:vml" xmlns:o="urn:schemas-microsoft-com:office:office" xmlns:r="http://schemas.openxmlformats.org/officeDocument/2006/relationships" xmlns:v="urn:schemas-microsoft-com:vml" xmlns:w10="urn:schemas-microsoft-com:office:word" xmlns:w14="http://schemas.microsoft.com/office/word/2010/wordml" xmlns:w="http://schemas.openxmlformats.org/wordprocessingml/2006/main" xmlns:wne="http://schemas.microsoft.com/office/word/2006/wordml" xmlns:wp14="http://schemas.microsoft.com/office/word/2010/wordprocessingDrawing" xmlns:wp="http://schemas.openxmlformats.org/drawingml/2006/wordprocessingDrawing" xmlns:wpc="http://schemas.microsoft.com/office/word/2010/wordprocessingCanvas" xmlns:wpg="http://schemas.microsoft.com/office/word/2010/wordprocessingGroup" xmlns:wpi="http://schemas.microsoft.com/office/word/2010/wordprocessingInk" xmlns:wps="http://schemas.microsoft.com/office/word/2010/wordprocessingShape" mc:Ignorable="w14 wp14">
+  <w:p>
+    <w:pPr>
+      <w:pStyle w:val="Footer"/>
+      <w:spacing w:before="40"/>
+      <w:jc w:val="left"/>
+      <w:pBdr>
+        <w:top w:val="single" w:sz="4" w:space="2" w:color="808080"/>
+      </w:pBdr>
+    </w:pPr>
+    <w:r/>
+    <w:r>
+      <w:rPr>
+        <w:rFonts w:ascii="Arial" w:hAnsi="Arial"/>
+        <w:color w:val="555555"/>
+        <w:sz w:val="20"/>
+      </w:rPr>
+      <w:t>Revision 4 — October 2026</w:t>
+    </w:r>
+    <w:r>
+      <w:rPr>
+        <w:rFonts w:ascii="Arial" w:hAnsi="Arial"/>
+      </w:rPr>
+      <w:tab/>
+      <w:tab/>
+    </w:r>
+    <w:r>
+      <w:rPr>
+        <w:rFonts w:ascii="Arial" w:hAnsi="Arial"/>
+        <w:color w:val="555555"/>
+        <w:sz w:val="20"/>
+      </w:rPr>
+      <w:t>QS-</w:t>
+    </w:r>
+    <w:r>
+      <w:rPr>
+        <w:rFonts w:ascii="Arial" w:hAnsi="Arial"/>
+        <w:color w:val="555555"/>
+        <w:sz w:val="20"/>
+      </w:rPr>
+      <w:fldChar w:fldCharType="begin"/>
+      <w:instrText xml:space="preserve"> PAGE </w:instrText>
+      <w:fldChar w:fldCharType="separate"/>
+      <w:t>1</w:t>
+      <w:fldChar w:fldCharType="end"/>
+    </w:r>
+  </w:p>
+</w:ftr>
+</file>
+
+<file path=word/footer109.xml><?xml version="1.0" encoding="utf-8"?>
+<w:ftr xmlns:m="http://schemas.openxmlformats.org/officeDocument/2006/math" xmlns:mc="http://schemas.openxmlformats.org/markup-compatibility/2006" xmlns:mo="http://schemas.microsoft.com/office/mac/office/2008/main" xmlns:mv="urn:schemas-microsoft-com:mac:vml" xmlns:o="urn:schemas-microsoft-com:office:office" xmlns:r="http://schemas.openxmlformats.org/officeDocument/2006/relationships" xmlns:v="urn:schemas-microsoft-com:vml" xmlns:w10="urn:schemas-microsoft-com:office:word" xmlns:w14="http://schemas.microsoft.com/office/word/2010/wordml" xmlns:w="http://schemas.openxmlformats.org/wordprocessingml/2006/main" xmlns:wne="http://schemas.microsoft.com/office/word/2006/wordml" xmlns:wp14="http://schemas.microsoft.com/office/word/2010/wordprocessingDrawing" xmlns:wp="http://schemas.openxmlformats.org/drawingml/2006/wordprocessingDrawing" xmlns:wpc="http://schemas.microsoft.com/office/word/2010/wordprocessingCanvas" xmlns:wpg="http://schemas.microsoft.com/office/word/2010/wordprocessingGroup" xmlns:wpi="http://schemas.microsoft.com/office/word/2010/wordprocessingInk" xmlns:wps="http://schemas.microsoft.com/office/word/2010/wordprocessingShape" mc:Ignorable="w14 wp14">
+  <w:p>
+    <w:pPr>
+      <w:pStyle w:val="Footer"/>
+      <w:spacing w:before="40"/>
+      <w:jc w:val="left"/>
+      <w:pBdr>
+        <w:top w:val="single" w:sz="4" w:space="2" w:color="808080"/>
+      </w:pBdr>
+    </w:pPr>
+    <w:r/>
+    <w:r>
+      <w:rPr>
+        <w:rFonts w:ascii="Arial" w:hAnsi="Arial"/>
+        <w:color w:val="555555"/>
+        <w:sz w:val="20"/>
+      </w:rPr>
+      <w:t>Revision 4 — October 2026</w:t>
+    </w:r>
+    <w:r>
+      <w:rPr>
+        <w:rFonts w:ascii="Arial" w:hAnsi="Arial"/>
+      </w:rPr>
+      <w:tab/>
+      <w:tab/>
+    </w:r>
+    <w:r>
+      <w:rPr>
+        <w:rFonts w:ascii="Arial" w:hAnsi="Arial"/>
+        <w:color w:val="555555"/>
+        <w:sz w:val="20"/>
+      </w:rPr>
+      <w:t>1-</w:t>
+    </w:r>
+    <w:r>
+      <w:rPr>
+        <w:rFonts w:ascii="Arial" w:hAnsi="Arial"/>
+        <w:color w:val="555555"/>
+        <w:sz w:val="20"/>
+      </w:rPr>
+      <w:fldChar w:fldCharType="begin"/>
+      <w:instrText xml:space="preserve"> PAGE </w:instrText>
+      <w:fldChar w:fldCharType="separate"/>
+      <w:t>1</w:t>
+      <w:fldChar w:fldCharType="end"/>
     </w:r>
   </w:p>
 </w:ftr>
@@ -13489,7 +13626,7 @@
 </w:ftr>
 </file>
 
-<file path=word/footer12.xml><?xml version="1.0" encoding="utf-8"?>
+<file path=word/footer110.xml><?xml version="1.0" encoding="utf-8"?>
 <w:ftr xmlns:m="http://schemas.openxmlformats.org/officeDocument/2006/math" xmlns:mc="http://schemas.openxmlformats.org/markup-compatibility/2006" xmlns:mo="http://schemas.microsoft.com/office/mac/office/2008/main" xmlns:mv="urn:schemas-microsoft-com:mac:vml" xmlns:o="urn:schemas-microsoft-com:office:office" xmlns:r="http://schemas.openxmlformats.org/officeDocument/2006/relationships" xmlns:v="urn:schemas-microsoft-com:vml" xmlns:w10="urn:schemas-microsoft-com:office:word" xmlns:w14="http://schemas.microsoft.com/office/word/2010/wordml" xmlns:w="http://schemas.openxmlformats.org/wordprocessingml/2006/main" xmlns:wne="http://schemas.microsoft.com/office/word/2006/wordml" xmlns:wp14="http://schemas.microsoft.com/office/word/2010/wordprocessingDrawing" xmlns:wp="http://schemas.openxmlformats.org/drawingml/2006/wordprocessingDrawing" xmlns:wpc="http://schemas.microsoft.com/office/word/2010/wordprocessingCanvas" xmlns:wpg="http://schemas.microsoft.com/office/word/2010/wordprocessingGroup" xmlns:wpi="http://schemas.microsoft.com/office/word/2010/wordprocessingInk" xmlns:wps="http://schemas.microsoft.com/office/word/2010/wordprocessingShape" mc:Ignorable="w14 wp14">
   <w:p>
     <w:pPr>
@@ -13507,7 +13644,7 @@
         <w:color w:val="555555"/>
         <w:sz w:val="20"/>
       </w:rPr>
-      <w:t>Revision 1 — April 2026</w:t>
+      <w:t>Revision 4 — October 2026</w:t>
     </w:r>
     <w:r>
       <w:rPr>
@@ -13522,7 +13659,7 @@
         <w:color w:val="555555"/>
         <w:sz w:val="20"/>
       </w:rPr>
-      <w:t>9-</w:t>
+      <w:t>2-</w:t>
     </w:r>
     <w:r>
       <w:rPr>
@@ -13535,6 +13672,897 @@
       <w:fldChar w:fldCharType="separate"/>
       <w:t>1</w:t>
       <w:fldChar w:fldCharType="end"/>
+    </w:r>
+  </w:p>
+</w:ftr>
+</file>
+
+<file path=word/footer111.xml><?xml version="1.0" encoding="utf-8"?>
+<w:ftr xmlns:m="http://schemas.openxmlformats.org/officeDocument/2006/math" xmlns:mc="http://schemas.openxmlformats.org/markup-compatibility/2006" xmlns:mo="http://schemas.microsoft.com/office/mac/office/2008/main" xmlns:mv="urn:schemas-microsoft-com:mac:vml" xmlns:o="urn:schemas-microsoft-com:office:office" xmlns:r="http://schemas.openxmlformats.org/officeDocument/2006/relationships" xmlns:v="urn:schemas-microsoft-com:vml" xmlns:w10="urn:schemas-microsoft-com:office:word" xmlns:w14="http://schemas.microsoft.com/office/word/2010/wordml" xmlns:w="http://schemas.openxmlformats.org/wordprocessingml/2006/main" xmlns:wne="http://schemas.microsoft.com/office/word/2006/wordml" xmlns:wp14="http://schemas.microsoft.com/office/word/2010/wordprocessingDrawing" xmlns:wp="http://schemas.openxmlformats.org/drawingml/2006/wordprocessingDrawing" xmlns:wpc="http://schemas.microsoft.com/office/word/2010/wordprocessingCanvas" xmlns:wpg="http://schemas.microsoft.com/office/word/2010/wordprocessingGroup" xmlns:wpi="http://schemas.microsoft.com/office/word/2010/wordprocessingInk" xmlns:wps="http://schemas.microsoft.com/office/word/2010/wordprocessingShape" mc:Ignorable="w14 wp14">
+  <w:p>
+    <w:pPr>
+      <w:pStyle w:val="Footer"/>
+      <w:spacing w:before="40"/>
+      <w:jc w:val="left"/>
+      <w:pBdr>
+        <w:top w:val="single" w:sz="4" w:space="2" w:color="808080"/>
+      </w:pBdr>
+    </w:pPr>
+    <w:r/>
+    <w:r>
+      <w:rPr>
+        <w:rFonts w:ascii="Arial" w:hAnsi="Arial"/>
+        <w:color w:val="555555"/>
+        <w:sz w:val="20"/>
+      </w:rPr>
+      <w:t>Revision 4 — October 2026</w:t>
+    </w:r>
+    <w:r>
+      <w:rPr>
+        <w:rFonts w:ascii="Arial" w:hAnsi="Arial"/>
+      </w:rPr>
+      <w:tab/>
+      <w:tab/>
+    </w:r>
+    <w:r>
+      <w:rPr>
+        <w:rFonts w:ascii="Arial" w:hAnsi="Arial"/>
+        <w:color w:val="555555"/>
+        <w:sz w:val="20"/>
+      </w:rPr>
+      <w:t>3-</w:t>
+    </w:r>
+    <w:r>
+      <w:rPr>
+        <w:rFonts w:ascii="Arial" w:hAnsi="Arial"/>
+        <w:color w:val="555555"/>
+        <w:sz w:val="20"/>
+      </w:rPr>
+      <w:fldChar w:fldCharType="begin"/>
+      <w:instrText xml:space="preserve"> PAGE </w:instrText>
+      <w:fldChar w:fldCharType="separate"/>
+      <w:t>1</w:t>
+      <w:fldChar w:fldCharType="end"/>
+    </w:r>
+  </w:p>
+</w:ftr>
+</file>
+
+<file path=word/footer112.xml><?xml version="1.0" encoding="utf-8"?>
+<w:ftr xmlns:m="http://schemas.openxmlformats.org/officeDocument/2006/math" xmlns:mc="http://schemas.openxmlformats.org/markup-compatibility/2006" xmlns:mo="http://schemas.microsoft.com/office/mac/office/2008/main" xmlns:mv="urn:schemas-microsoft-com:mac:vml" xmlns:o="urn:schemas-microsoft-com:office:office" xmlns:r="http://schemas.openxmlformats.org/officeDocument/2006/relationships" xmlns:v="urn:schemas-microsoft-com:vml" xmlns:w10="urn:schemas-microsoft-com:office:word" xmlns:w14="http://schemas.microsoft.com/office/word/2010/wordml" xmlns:w="http://schemas.openxmlformats.org/wordprocessingml/2006/main" xmlns:wne="http://schemas.microsoft.com/office/word/2006/wordml" xmlns:wp14="http://schemas.microsoft.com/office/word/2010/wordprocessingDrawing" xmlns:wp="http://schemas.openxmlformats.org/drawingml/2006/wordprocessingDrawing" xmlns:wpc="http://schemas.microsoft.com/office/word/2010/wordprocessingCanvas" xmlns:wpg="http://schemas.microsoft.com/office/word/2010/wordprocessingGroup" xmlns:wpi="http://schemas.microsoft.com/office/word/2010/wordprocessingInk" xmlns:wps="http://schemas.microsoft.com/office/word/2010/wordprocessingShape" mc:Ignorable="w14 wp14">
+  <w:p>
+    <w:pPr>
+      <w:pStyle w:val="Footer"/>
+      <w:spacing w:before="40"/>
+      <w:jc w:val="left"/>
+      <w:pBdr>
+        <w:top w:val="single" w:sz="4" w:space="2" w:color="808080"/>
+      </w:pBdr>
+    </w:pPr>
+    <w:r/>
+    <w:r>
+      <w:rPr>
+        <w:rFonts w:ascii="Arial" w:hAnsi="Arial"/>
+        <w:color w:val="555555"/>
+        <w:sz w:val="20"/>
+      </w:rPr>
+      <w:t>Revision 4 — October 2026</w:t>
+    </w:r>
+    <w:r>
+      <w:rPr>
+        <w:rFonts w:ascii="Arial" w:hAnsi="Arial"/>
+      </w:rPr>
+      <w:tab/>
+      <w:tab/>
+    </w:r>
+    <w:r>
+      <w:rPr>
+        <w:rFonts w:ascii="Arial" w:hAnsi="Arial"/>
+        <w:color w:val="555555"/>
+        <w:sz w:val="20"/>
+      </w:rPr>
+      <w:t>4-</w:t>
+    </w:r>
+    <w:r>
+      <w:rPr>
+        <w:rFonts w:ascii="Arial" w:hAnsi="Arial"/>
+        <w:color w:val="555555"/>
+        <w:sz w:val="20"/>
+      </w:rPr>
+      <w:fldChar w:fldCharType="begin"/>
+      <w:instrText xml:space="preserve"> PAGE </w:instrText>
+      <w:fldChar w:fldCharType="separate"/>
+      <w:t>1</w:t>
+      <w:fldChar w:fldCharType="end"/>
+    </w:r>
+  </w:p>
+</w:ftr>
+</file>
+
+<file path=word/footer113.xml><?xml version="1.0" encoding="utf-8"?>
+<w:ftr xmlns:m="http://schemas.openxmlformats.org/officeDocument/2006/math" xmlns:mc="http://schemas.openxmlformats.org/markup-compatibility/2006" xmlns:mo="http://schemas.microsoft.com/office/mac/office/2008/main" xmlns:mv="urn:schemas-microsoft-com:mac:vml" xmlns:o="urn:schemas-microsoft-com:office:office" xmlns:r="http://schemas.openxmlformats.org/officeDocument/2006/relationships" xmlns:v="urn:schemas-microsoft-com:vml" xmlns:w10="urn:schemas-microsoft-com:office:word" xmlns:w14="http://schemas.microsoft.com/office/word/2010/wordml" xmlns:w="http://schemas.openxmlformats.org/wordprocessingml/2006/main" xmlns:wne="http://schemas.microsoft.com/office/word/2006/wordml" xmlns:wp14="http://schemas.microsoft.com/office/word/2010/wordprocessingDrawing" xmlns:wp="http://schemas.openxmlformats.org/drawingml/2006/wordprocessingDrawing" xmlns:wpc="http://schemas.microsoft.com/office/word/2010/wordprocessingCanvas" xmlns:wpg="http://schemas.microsoft.com/office/word/2010/wordprocessingGroup" xmlns:wpi="http://schemas.microsoft.com/office/word/2010/wordprocessingInk" xmlns:wps="http://schemas.microsoft.com/office/word/2010/wordprocessingShape" mc:Ignorable="w14 wp14">
+  <w:p>
+    <w:pPr>
+      <w:pStyle w:val="Footer"/>
+      <w:spacing w:before="40"/>
+      <w:jc w:val="left"/>
+      <w:pBdr>
+        <w:top w:val="single" w:sz="4" w:space="2" w:color="808080"/>
+      </w:pBdr>
+    </w:pPr>
+    <w:r/>
+    <w:r>
+      <w:rPr>
+        <w:rFonts w:ascii="Arial" w:hAnsi="Arial"/>
+        <w:color w:val="555555"/>
+        <w:sz w:val="20"/>
+      </w:rPr>
+      <w:t>Revision 4 — October 2026</w:t>
+    </w:r>
+    <w:r>
+      <w:rPr>
+        <w:rFonts w:ascii="Arial" w:hAnsi="Arial"/>
+      </w:rPr>
+      <w:tab/>
+      <w:tab/>
+    </w:r>
+    <w:r>
+      <w:rPr>
+        <w:rFonts w:ascii="Arial" w:hAnsi="Arial"/>
+        <w:color w:val="555555"/>
+        <w:sz w:val="20"/>
+      </w:rPr>
+      <w:t>5-</w:t>
+    </w:r>
+    <w:r>
+      <w:rPr>
+        <w:rFonts w:ascii="Arial" w:hAnsi="Arial"/>
+        <w:color w:val="555555"/>
+        <w:sz w:val="20"/>
+      </w:rPr>
+      <w:fldChar w:fldCharType="begin"/>
+      <w:instrText xml:space="preserve"> PAGE </w:instrText>
+      <w:fldChar w:fldCharType="separate"/>
+      <w:t>1</w:t>
+      <w:fldChar w:fldCharType="end"/>
+    </w:r>
+  </w:p>
+</w:ftr>
+</file>
+
+<file path=word/footer114.xml><?xml version="1.0" encoding="utf-8"?>
+<w:ftr xmlns:m="http://schemas.openxmlformats.org/officeDocument/2006/math" xmlns:mc="http://schemas.openxmlformats.org/markup-compatibility/2006" xmlns:mo="http://schemas.microsoft.com/office/mac/office/2008/main" xmlns:mv="urn:schemas-microsoft-com:mac:vml" xmlns:o="urn:schemas-microsoft-com:office:office" xmlns:r="http://schemas.openxmlformats.org/officeDocument/2006/relationships" xmlns:v="urn:schemas-microsoft-com:vml" xmlns:w10="urn:schemas-microsoft-com:office:word" xmlns:w14="http://schemas.microsoft.com/office/word/2010/wordml" xmlns:w="http://schemas.openxmlformats.org/wordprocessingml/2006/main" xmlns:wne="http://schemas.microsoft.com/office/word/2006/wordml" xmlns:wp14="http://schemas.microsoft.com/office/word/2010/wordprocessingDrawing" xmlns:wp="http://schemas.openxmlformats.org/drawingml/2006/wordprocessingDrawing" xmlns:wpc="http://schemas.microsoft.com/office/word/2010/wordprocessingCanvas" xmlns:wpg="http://schemas.microsoft.com/office/word/2010/wordprocessingGroup" xmlns:wpi="http://schemas.microsoft.com/office/word/2010/wordprocessingInk" xmlns:wps="http://schemas.microsoft.com/office/word/2010/wordprocessingShape" mc:Ignorable="w14 wp14">
+  <w:p>
+    <w:pPr>
+      <w:pStyle w:val="Footer"/>
+      <w:spacing w:before="40"/>
+      <w:jc w:val="left"/>
+      <w:pBdr>
+        <w:top w:val="single" w:sz="4" w:space="2" w:color="808080"/>
+      </w:pBdr>
+    </w:pPr>
+    <w:r/>
+    <w:r>
+      <w:rPr>
+        <w:rFonts w:ascii="Arial" w:hAnsi="Arial"/>
+        <w:color w:val="555555"/>
+        <w:sz w:val="20"/>
+      </w:rPr>
+      <w:t>Revision 4 — October 2026</w:t>
+    </w:r>
+    <w:r>
+      <w:rPr>
+        <w:rFonts w:ascii="Arial" w:hAnsi="Arial"/>
+      </w:rPr>
+      <w:tab/>
+      <w:tab/>
+    </w:r>
+    <w:r>
+      <w:rPr>
+        <w:rFonts w:ascii="Arial" w:hAnsi="Arial"/>
+        <w:color w:val="555555"/>
+        <w:sz w:val="20"/>
+      </w:rPr>
+      <w:t>6-</w:t>
+    </w:r>
+    <w:r>
+      <w:rPr>
+        <w:rFonts w:ascii="Arial" w:hAnsi="Arial"/>
+        <w:color w:val="555555"/>
+        <w:sz w:val="20"/>
+      </w:rPr>
+      <w:fldChar w:fldCharType="begin"/>
+      <w:instrText xml:space="preserve"> PAGE </w:instrText>
+      <w:fldChar w:fldCharType="separate"/>
+      <w:t>1</w:t>
+      <w:fldChar w:fldCharType="end"/>
+    </w:r>
+  </w:p>
+</w:ftr>
+</file>
+
+<file path=word/footer115.xml><?xml version="1.0" encoding="utf-8"?>
+<w:ftr xmlns:m="http://schemas.openxmlformats.org/officeDocument/2006/math" xmlns:mc="http://schemas.openxmlformats.org/markup-compatibility/2006" xmlns:mo="http://schemas.microsoft.com/office/mac/office/2008/main" xmlns:mv="urn:schemas-microsoft-com:mac:vml" xmlns:o="urn:schemas-microsoft-com:office:office" xmlns:r="http://schemas.openxmlformats.org/officeDocument/2006/relationships" xmlns:v="urn:schemas-microsoft-com:vml" xmlns:w10="urn:schemas-microsoft-com:office:word" xmlns:w14="http://schemas.microsoft.com/office/word/2010/wordml" xmlns:w="http://schemas.openxmlformats.org/wordprocessingml/2006/main" xmlns:wne="http://schemas.microsoft.com/office/word/2006/wordml" xmlns:wp14="http://schemas.microsoft.com/office/word/2010/wordprocessingDrawing" xmlns:wp="http://schemas.openxmlformats.org/drawingml/2006/wordprocessingDrawing" xmlns:wpc="http://schemas.microsoft.com/office/word/2010/wordprocessingCanvas" xmlns:wpg="http://schemas.microsoft.com/office/word/2010/wordprocessingGroup" xmlns:wpi="http://schemas.microsoft.com/office/word/2010/wordprocessingInk" xmlns:wps="http://schemas.microsoft.com/office/word/2010/wordprocessingShape" mc:Ignorable="w14 wp14">
+  <w:p>
+    <w:pPr>
+      <w:pStyle w:val="Footer"/>
+      <w:spacing w:before="40"/>
+      <w:jc w:val="left"/>
+      <w:pBdr>
+        <w:top w:val="single" w:sz="4" w:space="2" w:color="808080"/>
+      </w:pBdr>
+    </w:pPr>
+    <w:r/>
+    <w:r>
+      <w:rPr>
+        <w:rFonts w:ascii="Arial" w:hAnsi="Arial"/>
+        <w:color w:val="555555"/>
+        <w:sz w:val="20"/>
+      </w:rPr>
+      <w:t>Revision 4 — October 2026</w:t>
+    </w:r>
+    <w:r>
+      <w:rPr>
+        <w:rFonts w:ascii="Arial" w:hAnsi="Arial"/>
+      </w:rPr>
+      <w:tab/>
+      <w:tab/>
+    </w:r>
+    <w:r>
+      <w:rPr>
+        <w:rFonts w:ascii="Arial" w:hAnsi="Arial"/>
+        <w:color w:val="555555"/>
+        <w:sz w:val="20"/>
+      </w:rPr>
+      <w:t>7-</w:t>
+    </w:r>
+    <w:r>
+      <w:rPr>
+        <w:rFonts w:ascii="Arial" w:hAnsi="Arial"/>
+        <w:color w:val="555555"/>
+        <w:sz w:val="20"/>
+      </w:rPr>
+      <w:fldChar w:fldCharType="begin"/>
+      <w:instrText xml:space="preserve"> PAGE </w:instrText>
+      <w:fldChar w:fldCharType="separate"/>
+      <w:t>1</w:t>
+      <w:fldChar w:fldCharType="end"/>
+    </w:r>
+  </w:p>
+</w:ftr>
+</file>
+
+<file path=word/footer116.xml><?xml version="1.0" encoding="utf-8"?>
+<w:ftr xmlns:m="http://schemas.openxmlformats.org/officeDocument/2006/math" xmlns:mc="http://schemas.openxmlformats.org/markup-compatibility/2006" xmlns:mo="http://schemas.microsoft.com/office/mac/office/2008/main" xmlns:mv="urn:schemas-microsoft-com:mac:vml" xmlns:o="urn:schemas-microsoft-com:office:office" xmlns:r="http://schemas.openxmlformats.org/officeDocument/2006/relationships" xmlns:v="urn:schemas-microsoft-com:vml" xmlns:w10="urn:schemas-microsoft-com:office:word" xmlns:w14="http://schemas.microsoft.com/office/word/2010/wordml" xmlns:w="http://schemas.openxmlformats.org/wordprocessingml/2006/main" xmlns:wne="http://schemas.microsoft.com/office/word/2006/wordml" xmlns:wp14="http://schemas.microsoft.com/office/word/2010/wordprocessingDrawing" xmlns:wp="http://schemas.openxmlformats.org/drawingml/2006/wordprocessingDrawing" xmlns:wpc="http://schemas.microsoft.com/office/word/2010/wordprocessingCanvas" xmlns:wpg="http://schemas.microsoft.com/office/word/2010/wordprocessingGroup" xmlns:wpi="http://schemas.microsoft.com/office/word/2010/wordprocessingInk" xmlns:wps="http://schemas.microsoft.com/office/word/2010/wordprocessingShape" mc:Ignorable="w14 wp14">
+  <w:p>
+    <w:pPr>
+      <w:pStyle w:val="Footer"/>
+      <w:spacing w:before="40"/>
+      <w:jc w:val="left"/>
+      <w:pBdr>
+        <w:top w:val="single" w:sz="4" w:space="2" w:color="808080"/>
+      </w:pBdr>
+    </w:pPr>
+    <w:r/>
+    <w:r>
+      <w:rPr>
+        <w:rFonts w:ascii="Arial" w:hAnsi="Arial"/>
+        <w:color w:val="555555"/>
+        <w:sz w:val="20"/>
+      </w:rPr>
+      <w:t>Revision 4 — October 2026</w:t>
+    </w:r>
+    <w:r>
+      <w:rPr>
+        <w:rFonts w:ascii="Arial" w:hAnsi="Arial"/>
+      </w:rPr>
+      <w:tab/>
+      <w:tab/>
+    </w:r>
+    <w:r>
+      <w:rPr>
+        <w:rFonts w:ascii="Arial" w:hAnsi="Arial"/>
+        <w:color w:val="555555"/>
+        <w:sz w:val="20"/>
+      </w:rPr>
+      <w:t>8-</w:t>
+    </w:r>
+    <w:r>
+      <w:rPr>
+        <w:rFonts w:ascii="Arial" w:hAnsi="Arial"/>
+        <w:color w:val="555555"/>
+        <w:sz w:val="20"/>
+      </w:rPr>
+      <w:fldChar w:fldCharType="begin"/>
+      <w:instrText xml:space="preserve"> PAGE </w:instrText>
+      <w:fldChar w:fldCharType="separate"/>
+      <w:t>1</w:t>
+      <w:fldChar w:fldCharType="end"/>
+    </w:r>
+  </w:p>
+</w:ftr>
+</file>
+
+<file path=word/footer117.xml><?xml version="1.0" encoding="utf-8"?>
+<w:ftr xmlns:m="http://schemas.openxmlformats.org/officeDocument/2006/math" xmlns:mc="http://schemas.openxmlformats.org/markup-compatibility/2006" xmlns:mo="http://schemas.microsoft.com/office/mac/office/2008/main" xmlns:mv="urn:schemas-microsoft-com:mac:vml" xmlns:o="urn:schemas-microsoft-com:office:office" xmlns:r="http://schemas.openxmlformats.org/officeDocument/2006/relationships" xmlns:v="urn:schemas-microsoft-com:vml" xmlns:w10="urn:schemas-microsoft-com:office:word" xmlns:w14="http://schemas.microsoft.com/office/word/2010/wordml" xmlns:w="http://schemas.openxmlformats.org/wordprocessingml/2006/main" xmlns:wne="http://schemas.microsoft.com/office/word/2006/wordml" xmlns:wp14="http://schemas.microsoft.com/office/word/2010/wordprocessingDrawing" xmlns:wp="http://schemas.openxmlformats.org/drawingml/2006/wordprocessingDrawing" xmlns:wpc="http://schemas.microsoft.com/office/word/2010/wordprocessingCanvas" xmlns:wpg="http://schemas.microsoft.com/office/word/2010/wordprocessingGroup" xmlns:wpi="http://schemas.microsoft.com/office/word/2010/wordprocessingInk" xmlns:wps="http://schemas.microsoft.com/office/word/2010/wordprocessingShape" mc:Ignorable="w14 wp14">
+  <w:p>
+    <w:pPr>
+      <w:pStyle w:val="Footer"/>
+      <w:spacing w:before="40"/>
+      <w:jc w:val="left"/>
+      <w:pBdr>
+        <w:top w:val="single" w:sz="4" w:space="2" w:color="808080"/>
+      </w:pBdr>
+    </w:pPr>
+    <w:r/>
+    <w:r>
+      <w:rPr>
+        <w:rFonts w:ascii="Arial" w:hAnsi="Arial"/>
+        <w:color w:val="555555"/>
+        <w:sz w:val="20"/>
+      </w:rPr>
+      <w:t>Revision 4 — October 2026</w:t>
+    </w:r>
+    <w:r>
+      <w:rPr>
+        <w:rFonts w:ascii="Arial" w:hAnsi="Arial"/>
+      </w:rPr>
+      <w:tab/>
+      <w:tab/>
+    </w:r>
+    <w:r>
+      <w:rPr>
+        <w:rFonts w:ascii="Arial" w:hAnsi="Arial"/>
+        <w:color w:val="555555"/>
+        <w:sz w:val="20"/>
+      </w:rPr>
+      <w:t>9-</w:t>
+    </w:r>
+    <w:r>
+      <w:rPr>
+        <w:rFonts w:ascii="Arial" w:hAnsi="Arial"/>
+        <w:color w:val="555555"/>
+        <w:sz w:val="20"/>
+      </w:rPr>
+      <w:fldChar w:fldCharType="begin"/>
+      <w:instrText xml:space="preserve"> PAGE </w:instrText>
+      <w:fldChar w:fldCharType="separate"/>
+      <w:t>1</w:t>
+      <w:fldChar w:fldCharType="end"/>
+    </w:r>
+  </w:p>
+</w:ftr>
+</file>
+
+<file path=word/footer118.xml><?xml version="1.0" encoding="utf-8"?>
+<w:ftr xmlns:m="http://schemas.openxmlformats.org/officeDocument/2006/math" xmlns:mc="http://schemas.openxmlformats.org/markup-compatibility/2006" xmlns:mo="http://schemas.microsoft.com/office/mac/office/2008/main" xmlns:mv="urn:schemas-microsoft-com:mac:vml" xmlns:o="urn:schemas-microsoft-com:office:office" xmlns:r="http://schemas.openxmlformats.org/officeDocument/2006/relationships" xmlns:v="urn:schemas-microsoft-com:vml" xmlns:w10="urn:schemas-microsoft-com:office:word" xmlns:w14="http://schemas.microsoft.com/office/word/2010/wordml" xmlns:w="http://schemas.openxmlformats.org/wordprocessingml/2006/main" xmlns:wne="http://schemas.microsoft.com/office/word/2006/wordml" xmlns:wp14="http://schemas.microsoft.com/office/word/2010/wordprocessingDrawing" xmlns:wp="http://schemas.openxmlformats.org/drawingml/2006/wordprocessingDrawing" xmlns:wpc="http://schemas.microsoft.com/office/word/2010/wordprocessingCanvas" xmlns:wpg="http://schemas.microsoft.com/office/word/2010/wordprocessingGroup" xmlns:wpi="http://schemas.microsoft.com/office/word/2010/wordprocessingInk" xmlns:wps="http://schemas.microsoft.com/office/word/2010/wordprocessingShape" mc:Ignorable="w14 wp14">
+  <w:p>
+    <w:pPr>
+      <w:pStyle w:val="Footer"/>
+      <w:spacing w:before="40"/>
+      <w:jc w:val="left"/>
+      <w:pBdr>
+        <w:top w:val="single" w:sz="4" w:space="2" w:color="808080"/>
+      </w:pBdr>
+    </w:pPr>
+    <w:r/>
+    <w:r>
+      <w:rPr>
+        <w:rFonts w:ascii="Arial" w:hAnsi="Arial"/>
+        <w:color w:val="555555"/>
+        <w:sz w:val="20"/>
+      </w:rPr>
+      <w:t>Revision 4 — October 2026</w:t>
+    </w:r>
+    <w:r>
+      <w:rPr>
+        <w:rFonts w:ascii="Arial" w:hAnsi="Arial"/>
+      </w:rPr>
+      <w:tab/>
+      <w:tab/>
+    </w:r>
+    <w:r>
+      <w:rPr>
+        <w:rFonts w:ascii="Arial" w:hAnsi="Arial"/>
+        <w:color w:val="555555"/>
+        <w:sz w:val="20"/>
+      </w:rPr>
+      <w:t>10-</w:t>
+    </w:r>
+    <w:r>
+      <w:rPr>
+        <w:rFonts w:ascii="Arial" w:hAnsi="Arial"/>
+        <w:color w:val="555555"/>
+        <w:sz w:val="20"/>
+      </w:rPr>
+      <w:fldChar w:fldCharType="begin"/>
+      <w:instrText xml:space="preserve"> PAGE </w:instrText>
+      <w:fldChar w:fldCharType="separate"/>
+      <w:t>1</w:t>
+      <w:fldChar w:fldCharType="end"/>
+    </w:r>
+  </w:p>
+</w:ftr>
+</file>
+
+<file path=word/footer119.xml><?xml version="1.0" encoding="utf-8"?>
+<w:ftr xmlns:m="http://schemas.openxmlformats.org/officeDocument/2006/math" xmlns:mc="http://schemas.openxmlformats.org/markup-compatibility/2006" xmlns:mo="http://schemas.microsoft.com/office/mac/office/2008/main" xmlns:mv="urn:schemas-microsoft-com:mac:vml" xmlns:o="urn:schemas-microsoft-com:office:office" xmlns:r="http://schemas.openxmlformats.org/officeDocument/2006/relationships" xmlns:v="urn:schemas-microsoft-com:vml" xmlns:w10="urn:schemas-microsoft-com:office:word" xmlns:w14="http://schemas.microsoft.com/office/word/2010/wordml" xmlns:w="http://schemas.openxmlformats.org/wordprocessingml/2006/main" xmlns:wne="http://schemas.microsoft.com/office/word/2006/wordml" xmlns:wp14="http://schemas.microsoft.com/office/word/2010/wordprocessingDrawing" xmlns:wp="http://schemas.openxmlformats.org/drawingml/2006/wordprocessingDrawing" xmlns:wpc="http://schemas.microsoft.com/office/word/2010/wordprocessingCanvas" xmlns:wpg="http://schemas.microsoft.com/office/word/2010/wordprocessingGroup" xmlns:wpi="http://schemas.microsoft.com/office/word/2010/wordprocessingInk" xmlns:wps="http://schemas.microsoft.com/office/word/2010/wordprocessingShape" mc:Ignorable="w14 wp14">
+  <w:p>
+    <w:pPr>
+      <w:pStyle w:val="Footer"/>
+      <w:spacing w:before="40"/>
+      <w:jc w:val="left"/>
+      <w:pBdr>
+        <w:top w:val="single" w:sz="4" w:space="2" w:color="808080"/>
+      </w:pBdr>
+    </w:pPr>
+    <w:r/>
+    <w:r>
+      <w:rPr>
+        <w:rFonts w:ascii="Arial" w:hAnsi="Arial"/>
+        <w:color w:val="555555"/>
+        <w:sz w:val="20"/>
+      </w:rPr>
+      <w:t>Revision 4 — October 2026</w:t>
+    </w:r>
+    <w:r>
+      <w:rPr>
+        <w:rFonts w:ascii="Arial" w:hAnsi="Arial"/>
+      </w:rPr>
+      <w:tab/>
+      <w:tab/>
+    </w:r>
+    <w:r>
+      <w:rPr>
+        <w:rFonts w:ascii="Arial" w:hAnsi="Arial"/>
+        <w:color w:val="555555"/>
+        <w:sz w:val="20"/>
+      </w:rPr>
+      <w:t>11-</w:t>
+    </w:r>
+    <w:r>
+      <w:rPr>
+        <w:rFonts w:ascii="Arial" w:hAnsi="Arial"/>
+        <w:color w:val="555555"/>
+        <w:sz w:val="20"/>
+      </w:rPr>
+      <w:fldChar w:fldCharType="begin"/>
+      <w:instrText xml:space="preserve"> PAGE </w:instrText>
+      <w:fldChar w:fldCharType="separate"/>
+      <w:t>1</w:t>
+      <w:fldChar w:fldCharType="end"/>
+    </w:r>
+  </w:p>
+</w:ftr>
+</file>
+
+<file path=word/footer12.xml><?xml version="1.0" encoding="utf-8"?>
+<w:ftr xmlns:m="http://schemas.openxmlformats.org/officeDocument/2006/math" xmlns:mc="http://schemas.openxmlformats.org/markup-compatibility/2006" xmlns:mo="http://schemas.microsoft.com/office/mac/office/2008/main" xmlns:mv="urn:schemas-microsoft-com:mac:vml" xmlns:o="urn:schemas-microsoft-com:office:office" xmlns:r="http://schemas.openxmlformats.org/officeDocument/2006/relationships" xmlns:v="urn:schemas-microsoft-com:vml" xmlns:w10="urn:schemas-microsoft-com:office:word" xmlns:w14="http://schemas.microsoft.com/office/word/2010/wordml" xmlns:w="http://schemas.openxmlformats.org/wordprocessingml/2006/main" xmlns:wne="http://schemas.microsoft.com/office/word/2006/wordml" xmlns:wp14="http://schemas.microsoft.com/office/word/2010/wordprocessingDrawing" xmlns:wp="http://schemas.openxmlformats.org/drawingml/2006/wordprocessingDrawing" xmlns:wpc="http://schemas.microsoft.com/office/word/2010/wordprocessingCanvas" xmlns:wpg="http://schemas.microsoft.com/office/word/2010/wordprocessingGroup" xmlns:wpi="http://schemas.microsoft.com/office/word/2010/wordprocessingInk" xmlns:wps="http://schemas.microsoft.com/office/word/2010/wordprocessingShape" mc:Ignorable="w14 wp14">
+  <w:p>
+    <w:pPr>
+      <w:pStyle w:val="Footer"/>
+      <w:spacing w:before="40"/>
+      <w:jc w:val="left"/>
+      <w:pBdr>
+        <w:top w:val="single" w:sz="4" w:space="2" w:color="808080"/>
+      </w:pBdr>
+    </w:pPr>
+    <w:r/>
+    <w:r>
+      <w:rPr>
+        <w:rFonts w:ascii="Arial" w:hAnsi="Arial"/>
+        <w:color w:val="555555"/>
+        <w:sz w:val="20"/>
+      </w:rPr>
+      <w:t>Revision 1 — April 2026</w:t>
+    </w:r>
+    <w:r>
+      <w:rPr>
+        <w:rFonts w:ascii="Arial" w:hAnsi="Arial"/>
+      </w:rPr>
+      <w:tab/>
+      <w:tab/>
+    </w:r>
+    <w:r>
+      <w:rPr>
+        <w:rFonts w:ascii="Arial" w:hAnsi="Arial"/>
+        <w:color w:val="555555"/>
+        <w:sz w:val="20"/>
+      </w:rPr>
+      <w:t>9-</w:t>
+    </w:r>
+    <w:r>
+      <w:rPr>
+        <w:rFonts w:ascii="Arial" w:hAnsi="Arial"/>
+        <w:color w:val="555555"/>
+        <w:sz w:val="20"/>
+      </w:rPr>
+      <w:fldChar w:fldCharType="begin"/>
+      <w:instrText xml:space="preserve"> PAGE </w:instrText>
+      <w:fldChar w:fldCharType="separate"/>
+      <w:t>1</w:t>
+      <w:fldChar w:fldCharType="end"/>
+    </w:r>
+  </w:p>
+</w:ftr>
+</file>
+
+<file path=word/footer120.xml><?xml version="1.0" encoding="utf-8"?>
+<w:ftr xmlns:m="http://schemas.openxmlformats.org/officeDocument/2006/math" xmlns:mc="http://schemas.openxmlformats.org/markup-compatibility/2006" xmlns:mo="http://schemas.microsoft.com/office/mac/office/2008/main" xmlns:mv="urn:schemas-microsoft-com:mac:vml" xmlns:o="urn:schemas-microsoft-com:office:office" xmlns:r="http://schemas.openxmlformats.org/officeDocument/2006/relationships" xmlns:v="urn:schemas-microsoft-com:vml" xmlns:w10="urn:schemas-microsoft-com:office:word" xmlns:w14="http://schemas.microsoft.com/office/word/2010/wordml" xmlns:w="http://schemas.openxmlformats.org/wordprocessingml/2006/main" xmlns:wne="http://schemas.microsoft.com/office/word/2006/wordml" xmlns:wp14="http://schemas.microsoft.com/office/word/2010/wordprocessingDrawing" xmlns:wp="http://schemas.openxmlformats.org/drawingml/2006/wordprocessingDrawing" xmlns:wpc="http://schemas.microsoft.com/office/word/2010/wordprocessingCanvas" xmlns:wpg="http://schemas.microsoft.com/office/word/2010/wordprocessingGroup" xmlns:wpi="http://schemas.microsoft.com/office/word/2010/wordprocessingInk" xmlns:wps="http://schemas.microsoft.com/office/word/2010/wordprocessingShape" mc:Ignorable="w14 wp14">
+  <w:p>
+    <w:pPr>
+      <w:pStyle w:val="Footer"/>
+      <w:spacing w:before="40"/>
+      <w:jc w:val="left"/>
+      <w:pBdr>
+        <w:top w:val="single" w:sz="4" w:space="2" w:color="808080"/>
+      </w:pBdr>
+    </w:pPr>
+    <w:r/>
+    <w:r>
+      <w:rPr>
+        <w:rFonts w:ascii="Arial" w:hAnsi="Arial"/>
+        <w:color w:val="555555"/>
+        <w:sz w:val="20"/>
+      </w:rPr>
+      <w:t>Revision 4 — October 2026</w:t>
+    </w:r>
+    <w:r>
+      <w:rPr>
+        <w:rFonts w:ascii="Arial" w:hAnsi="Arial"/>
+      </w:rPr>
+      <w:tab/>
+      <w:tab/>
+    </w:r>
+    <w:r>
+      <w:rPr>
+        <w:rFonts w:ascii="Arial" w:hAnsi="Arial"/>
+        <w:color w:val="555555"/>
+        <w:sz w:val="20"/>
+      </w:rPr>
+      <w:t>12-</w:t>
+    </w:r>
+    <w:r>
+      <w:rPr>
+        <w:rFonts w:ascii="Arial" w:hAnsi="Arial"/>
+        <w:color w:val="555555"/>
+        <w:sz w:val="20"/>
+      </w:rPr>
+      <w:fldChar w:fldCharType="begin"/>
+      <w:instrText xml:space="preserve"> PAGE </w:instrText>
+      <w:fldChar w:fldCharType="separate"/>
+      <w:t>1</w:t>
+      <w:fldChar w:fldCharType="end"/>
+    </w:r>
+  </w:p>
+</w:ftr>
+</file>
+
+<file path=word/footer121.xml><?xml version="1.0" encoding="utf-8"?>
+<w:ftr xmlns:m="http://schemas.openxmlformats.org/officeDocument/2006/math" xmlns:mc="http://schemas.openxmlformats.org/markup-compatibility/2006" xmlns:mo="http://schemas.microsoft.com/office/mac/office/2008/main" xmlns:mv="urn:schemas-microsoft-com:mac:vml" xmlns:o="urn:schemas-microsoft-com:office:office" xmlns:r="http://schemas.openxmlformats.org/officeDocument/2006/relationships" xmlns:v="urn:schemas-microsoft-com:vml" xmlns:w10="urn:schemas-microsoft-com:office:word" xmlns:w14="http://schemas.microsoft.com/office/word/2010/wordml" xmlns:w="http://schemas.openxmlformats.org/wordprocessingml/2006/main" xmlns:wne="http://schemas.microsoft.com/office/word/2006/wordml" xmlns:wp14="http://schemas.microsoft.com/office/word/2010/wordprocessingDrawing" xmlns:wp="http://schemas.openxmlformats.org/drawingml/2006/wordprocessingDrawing" xmlns:wpc="http://schemas.microsoft.com/office/word/2010/wordprocessingCanvas" xmlns:wpg="http://schemas.microsoft.com/office/word/2010/wordprocessingGroup" xmlns:wpi="http://schemas.microsoft.com/office/word/2010/wordprocessingInk" xmlns:wps="http://schemas.microsoft.com/office/word/2010/wordprocessingShape" mc:Ignorable="w14 wp14">
+  <w:p>
+    <w:pPr>
+      <w:pStyle w:val="Footer"/>
+      <w:spacing w:before="40"/>
+      <w:jc w:val="left"/>
+      <w:pBdr>
+        <w:top w:val="single" w:sz="4" w:space="2" w:color="808080"/>
+      </w:pBdr>
+    </w:pPr>
+    <w:r/>
+    <w:r>
+      <w:rPr>
+        <w:rFonts w:ascii="Arial" w:hAnsi="Arial"/>
+        <w:color w:val="555555"/>
+        <w:sz w:val="20"/>
+      </w:rPr>
+      <w:t>Revision 4 — October 2026</w:t>
+    </w:r>
+    <w:r>
+      <w:rPr>
+        <w:rFonts w:ascii="Arial" w:hAnsi="Arial"/>
+      </w:rPr>
+      <w:tab/>
+      <w:tab/>
+    </w:r>
+    <w:r>
+      <w:rPr>
+        <w:rFonts w:ascii="Arial" w:hAnsi="Arial"/>
+        <w:color w:val="555555"/>
+        <w:sz w:val="20"/>
+      </w:rPr>
+      <w:t>13-</w:t>
+    </w:r>
+    <w:r>
+      <w:rPr>
+        <w:rFonts w:ascii="Arial" w:hAnsi="Arial"/>
+        <w:color w:val="555555"/>
+        <w:sz w:val="20"/>
+      </w:rPr>
+      <w:fldChar w:fldCharType="begin"/>
+      <w:instrText xml:space="preserve"> PAGE </w:instrText>
+      <w:fldChar w:fldCharType="separate"/>
+      <w:t>1</w:t>
+      <w:fldChar w:fldCharType="end"/>
+    </w:r>
+  </w:p>
+</w:ftr>
+</file>
+
+<file path=word/footer122.xml><?xml version="1.0" encoding="utf-8"?>
+<w:ftr xmlns:m="http://schemas.openxmlformats.org/officeDocument/2006/math" xmlns:mc="http://schemas.openxmlformats.org/markup-compatibility/2006" xmlns:mo="http://schemas.microsoft.com/office/mac/office/2008/main" xmlns:mv="urn:schemas-microsoft-com:mac:vml" xmlns:o="urn:schemas-microsoft-com:office:office" xmlns:r="http://schemas.openxmlformats.org/officeDocument/2006/relationships" xmlns:v="urn:schemas-microsoft-com:vml" xmlns:w10="urn:schemas-microsoft-com:office:word" xmlns:w14="http://schemas.microsoft.com/office/word/2010/wordml" xmlns:w="http://schemas.openxmlformats.org/wordprocessingml/2006/main" xmlns:wne="http://schemas.microsoft.com/office/word/2006/wordml" xmlns:wp14="http://schemas.microsoft.com/office/word/2010/wordprocessingDrawing" xmlns:wp="http://schemas.openxmlformats.org/drawingml/2006/wordprocessingDrawing" xmlns:wpc="http://schemas.microsoft.com/office/word/2010/wordprocessingCanvas" xmlns:wpg="http://schemas.microsoft.com/office/word/2010/wordprocessingGroup" xmlns:wpi="http://schemas.microsoft.com/office/word/2010/wordprocessingInk" xmlns:wps="http://schemas.microsoft.com/office/word/2010/wordprocessingShape" mc:Ignorable="w14 wp14">
+  <w:p>
+    <w:pPr>
+      <w:pStyle w:val="Footer"/>
+      <w:spacing w:before="40"/>
+      <w:jc w:val="left"/>
+      <w:pBdr>
+        <w:top w:val="single" w:sz="4" w:space="2" w:color="808080"/>
+      </w:pBdr>
+    </w:pPr>
+    <w:r/>
+    <w:r>
+      <w:rPr>
+        <w:rFonts w:ascii="Arial" w:hAnsi="Arial"/>
+        <w:color w:val="555555"/>
+        <w:sz w:val="20"/>
+      </w:rPr>
+      <w:t>Revision 4 — October 2026</w:t>
+    </w:r>
+    <w:r>
+      <w:rPr>
+        <w:rFonts w:ascii="Arial" w:hAnsi="Arial"/>
+      </w:rPr>
+      <w:tab/>
+      <w:tab/>
+    </w:r>
+    <w:r>
+      <w:rPr>
+        <w:rFonts w:ascii="Arial" w:hAnsi="Arial"/>
+        <w:color w:val="555555"/>
+        <w:sz w:val="20"/>
+      </w:rPr>
+      <w:t>14-</w:t>
+    </w:r>
+    <w:r>
+      <w:rPr>
+        <w:rFonts w:ascii="Arial" w:hAnsi="Arial"/>
+        <w:color w:val="555555"/>
+        <w:sz w:val="20"/>
+      </w:rPr>
+      <w:fldChar w:fldCharType="begin"/>
+      <w:instrText xml:space="preserve"> PAGE </w:instrText>
+      <w:fldChar w:fldCharType="separate"/>
+      <w:t>1</w:t>
+      <w:fldChar w:fldCharType="end"/>
+    </w:r>
+  </w:p>
+</w:ftr>
+</file>
+
+<file path=word/footer123.xml><?xml version="1.0" encoding="utf-8"?>
+<w:ftr xmlns:m="http://schemas.openxmlformats.org/officeDocument/2006/math" xmlns:mc="http://schemas.openxmlformats.org/markup-compatibility/2006" xmlns:mo="http://schemas.microsoft.com/office/mac/office/2008/main" xmlns:mv="urn:schemas-microsoft-com:mac:vml" xmlns:o="urn:schemas-microsoft-com:office:office" xmlns:r="http://schemas.openxmlformats.org/officeDocument/2006/relationships" xmlns:v="urn:schemas-microsoft-com:vml" xmlns:w10="urn:schemas-microsoft-com:office:word" xmlns:w14="http://schemas.microsoft.com/office/word/2010/wordml" xmlns:w="http://schemas.openxmlformats.org/wordprocessingml/2006/main" xmlns:wne="http://schemas.microsoft.com/office/word/2006/wordml" xmlns:wp14="http://schemas.microsoft.com/office/word/2010/wordprocessingDrawing" xmlns:wp="http://schemas.openxmlformats.org/drawingml/2006/wordprocessingDrawing" xmlns:wpc="http://schemas.microsoft.com/office/word/2010/wordprocessingCanvas" xmlns:wpg="http://schemas.microsoft.com/office/word/2010/wordprocessingGroup" xmlns:wpi="http://schemas.microsoft.com/office/word/2010/wordprocessingInk" xmlns:wps="http://schemas.microsoft.com/office/word/2010/wordprocessingShape" mc:Ignorable="w14 wp14">
+  <w:p>
+    <w:pPr>
+      <w:pStyle w:val="Footer"/>
+      <w:spacing w:before="40"/>
+      <w:jc w:val="left"/>
+      <w:pBdr>
+        <w:top w:val="single" w:sz="4" w:space="2" w:color="808080"/>
+      </w:pBdr>
+    </w:pPr>
+    <w:r/>
+    <w:r>
+      <w:rPr>
+        <w:rFonts w:ascii="Arial" w:hAnsi="Arial"/>
+        <w:color w:val="555555"/>
+        <w:sz w:val="20"/>
+      </w:rPr>
+      <w:t>Revision 4 — October 2026</w:t>
+    </w:r>
+    <w:r>
+      <w:rPr>
+        <w:rFonts w:ascii="Arial" w:hAnsi="Arial"/>
+      </w:rPr>
+      <w:tab/>
+      <w:tab/>
+    </w:r>
+    <w:r>
+      <w:rPr>
+        <w:rFonts w:ascii="Arial" w:hAnsi="Arial"/>
+        <w:color w:val="555555"/>
+        <w:sz w:val="20"/>
+      </w:rPr>
+      <w:t>15-</w:t>
+    </w:r>
+    <w:r>
+      <w:rPr>
+        <w:rFonts w:ascii="Arial" w:hAnsi="Arial"/>
+        <w:color w:val="555555"/>
+        <w:sz w:val="20"/>
+      </w:rPr>
+      <w:fldChar w:fldCharType="begin"/>
+      <w:instrText xml:space="preserve"> PAGE </w:instrText>
+      <w:fldChar w:fldCharType="separate"/>
+      <w:t>1</w:t>
+      <w:fldChar w:fldCharType="end"/>
+    </w:r>
+  </w:p>
+</w:ftr>
+</file>
+
+<file path=word/footer124.xml><?xml version="1.0" encoding="utf-8"?>
+<w:ftr xmlns:m="http://schemas.openxmlformats.org/officeDocument/2006/math" xmlns:mc="http://schemas.openxmlformats.org/markup-compatibility/2006" xmlns:mo="http://schemas.microsoft.com/office/mac/office/2008/main" xmlns:mv="urn:schemas-microsoft-com:mac:vml" xmlns:o="urn:schemas-microsoft-com:office:office" xmlns:r="http://schemas.openxmlformats.org/officeDocument/2006/relationships" xmlns:v="urn:schemas-microsoft-com:vml" xmlns:w10="urn:schemas-microsoft-com:office:word" xmlns:w14="http://schemas.microsoft.com/office/word/2010/wordml" xmlns:w="http://schemas.openxmlformats.org/wordprocessingml/2006/main" xmlns:wne="http://schemas.microsoft.com/office/word/2006/wordml" xmlns:wp14="http://schemas.microsoft.com/office/word/2010/wordprocessingDrawing" xmlns:wp="http://schemas.openxmlformats.org/drawingml/2006/wordprocessingDrawing" xmlns:wpc="http://schemas.microsoft.com/office/word/2010/wordprocessingCanvas" xmlns:wpg="http://schemas.microsoft.com/office/word/2010/wordprocessingGroup" xmlns:wpi="http://schemas.microsoft.com/office/word/2010/wordprocessingInk" xmlns:wps="http://schemas.microsoft.com/office/word/2010/wordprocessingShape" mc:Ignorable="w14 wp14">
+  <w:p>
+    <w:pPr>
+      <w:pStyle w:val="Footer"/>
+      <w:spacing w:before="40"/>
+      <w:jc w:val="left"/>
+      <w:pBdr>
+        <w:top w:val="single" w:sz="4" w:space="2" w:color="808080"/>
+      </w:pBdr>
+    </w:pPr>
+    <w:r/>
+    <w:r>
+      <w:rPr>
+        <w:rFonts w:ascii="Arial" w:hAnsi="Arial"/>
+        <w:color w:val="555555"/>
+        <w:sz w:val="20"/>
+      </w:rPr>
+      <w:t>Revision 4 — October 2026</w:t>
+    </w:r>
+    <w:r>
+      <w:rPr>
+        <w:rFonts w:ascii="Arial" w:hAnsi="Arial"/>
+      </w:rPr>
+      <w:tab/>
+      <w:tab/>
+    </w:r>
+    <w:r>
+      <w:rPr>
+        <w:rFonts w:ascii="Arial" w:hAnsi="Arial"/>
+        <w:color w:val="555555"/>
+        <w:sz w:val="20"/>
+      </w:rPr>
+      <w:t>16-</w:t>
+    </w:r>
+    <w:r>
+      <w:rPr>
+        <w:rFonts w:ascii="Arial" w:hAnsi="Arial"/>
+        <w:color w:val="555555"/>
+        <w:sz w:val="20"/>
+      </w:rPr>
+      <w:fldChar w:fldCharType="begin"/>
+      <w:instrText xml:space="preserve"> PAGE </w:instrText>
+      <w:fldChar w:fldCharType="separate"/>
+      <w:t>1</w:t>
+      <w:fldChar w:fldCharType="end"/>
+    </w:r>
+  </w:p>
+</w:ftr>
+</file>
+
+<file path=word/footer125.xml><?xml version="1.0" encoding="utf-8"?>
+<w:ftr xmlns:m="http://schemas.openxmlformats.org/officeDocument/2006/math" xmlns:mc="http://schemas.openxmlformats.org/markup-compatibility/2006" xmlns:mo="http://schemas.microsoft.com/office/mac/office/2008/main" xmlns:mv="urn:schemas-microsoft-com:mac:vml" xmlns:o="urn:schemas-microsoft-com:office:office" xmlns:r="http://schemas.openxmlformats.org/officeDocument/2006/relationships" xmlns:v="urn:schemas-microsoft-com:vml" xmlns:w10="urn:schemas-microsoft-com:office:word" xmlns:w14="http://schemas.microsoft.com/office/word/2010/wordml" xmlns:w="http://schemas.openxmlformats.org/wordprocessingml/2006/main" xmlns:wne="http://schemas.microsoft.com/office/word/2006/wordml" xmlns:wp14="http://schemas.microsoft.com/office/word/2010/wordprocessingDrawing" xmlns:wp="http://schemas.openxmlformats.org/drawingml/2006/wordprocessingDrawing" xmlns:wpc="http://schemas.microsoft.com/office/word/2010/wordprocessingCanvas" xmlns:wpg="http://schemas.microsoft.com/office/word/2010/wordprocessingGroup" xmlns:wpi="http://schemas.microsoft.com/office/word/2010/wordprocessingInk" xmlns:wps="http://schemas.microsoft.com/office/word/2010/wordprocessingShape" mc:Ignorable="w14 wp14">
+  <w:p>
+    <w:pPr>
+      <w:pStyle w:val="Footer"/>
+      <w:spacing w:before="40"/>
+      <w:jc w:val="left"/>
+      <w:pBdr>
+        <w:top w:val="single" w:sz="4" w:space="2" w:color="808080"/>
+      </w:pBdr>
+    </w:pPr>
+    <w:r/>
+    <w:r>
+      <w:rPr>
+        <w:rFonts w:ascii="Arial" w:hAnsi="Arial"/>
+        <w:color w:val="555555"/>
+        <w:sz w:val="20"/>
+      </w:rPr>
+      <w:t>Revision 4 — October 2026</w:t>
+    </w:r>
+    <w:r>
+      <w:rPr>
+        <w:rFonts w:ascii="Arial" w:hAnsi="Arial"/>
+      </w:rPr>
+      <w:tab/>
+      <w:tab/>
+    </w:r>
+    <w:r>
+      <w:rPr>
+        <w:rFonts w:ascii="Arial" w:hAnsi="Arial"/>
+        <w:color w:val="555555"/>
+        <w:sz w:val="20"/>
+      </w:rPr>
+      <w:t>17-</w:t>
+    </w:r>
+    <w:r>
+      <w:rPr>
+        <w:rFonts w:ascii="Arial" w:hAnsi="Arial"/>
+        <w:color w:val="555555"/>
+        <w:sz w:val="20"/>
+      </w:rPr>
+      <w:fldChar w:fldCharType="begin"/>
+      <w:instrText xml:space="preserve"> PAGE </w:instrText>
+      <w:fldChar w:fldCharType="separate"/>
+      <w:t>1</w:t>
+      <w:fldChar w:fldCharType="end"/>
+    </w:r>
+  </w:p>
+</w:ftr>
+</file>
+
+<file path=word/footer126.xml><?xml version="1.0" encoding="utf-8"?>
+<w:ftr xmlns:m="http://schemas.openxmlformats.org/officeDocument/2006/math" xmlns:mc="http://schemas.openxmlformats.org/markup-compatibility/2006" xmlns:mo="http://schemas.microsoft.com/office/mac/office/2008/main" xmlns:mv="urn:schemas-microsoft-com:mac:vml" xmlns:o="urn:schemas-microsoft-com:office:office" xmlns:r="http://schemas.openxmlformats.org/officeDocument/2006/relationships" xmlns:v="urn:schemas-microsoft-com:vml" xmlns:w10="urn:schemas-microsoft-com:office:word" xmlns:w14="http://schemas.microsoft.com/office/word/2010/wordml" xmlns:w="http://schemas.openxmlformats.org/wordprocessingml/2006/main" xmlns:wne="http://schemas.microsoft.com/office/word/2006/wordml" xmlns:wp14="http://schemas.microsoft.com/office/word/2010/wordprocessingDrawing" xmlns:wp="http://schemas.openxmlformats.org/drawingml/2006/wordprocessingDrawing" xmlns:wpc="http://schemas.microsoft.com/office/word/2010/wordprocessingCanvas" xmlns:wpg="http://schemas.microsoft.com/office/word/2010/wordprocessingGroup" xmlns:wpi="http://schemas.microsoft.com/office/word/2010/wordprocessingInk" xmlns:wps="http://schemas.microsoft.com/office/word/2010/wordprocessingShape" mc:Ignorable="w14 wp14">
+  <w:p>
+    <w:pPr>
+      <w:pStyle w:val="Footer"/>
+      <w:spacing w:before="40"/>
+      <w:jc w:val="left"/>
+      <w:pBdr>
+        <w:top w:val="single" w:sz="4" w:space="2" w:color="808080"/>
+      </w:pBdr>
+    </w:pPr>
+    <w:r/>
+    <w:r>
+      <w:rPr>
+        <w:rFonts w:ascii="Arial" w:hAnsi="Arial"/>
+        <w:color w:val="555555"/>
+        <w:sz w:val="20"/>
+      </w:rPr>
+      <w:t>Revision 4 — October 2026</w:t>
+    </w:r>
+    <w:r>
+      <w:rPr>
+        <w:rFonts w:ascii="Arial" w:hAnsi="Arial"/>
+      </w:rPr>
+      <w:tab/>
+      <w:tab/>
+    </w:r>
+    <w:r>
+      <w:rPr>
+        <w:rFonts w:ascii="Arial" w:hAnsi="Arial"/>
+        <w:color w:val="555555"/>
+        <w:sz w:val="20"/>
+      </w:rPr>
+      <w:t>18-</w:t>
+    </w:r>
+    <w:r>
+      <w:rPr>
+        <w:rFonts w:ascii="Arial" w:hAnsi="Arial"/>
+        <w:color w:val="555555"/>
+        <w:sz w:val="20"/>
+      </w:rPr>
+      <w:fldChar w:fldCharType="begin"/>
+      <w:instrText xml:space="preserve"> PAGE </w:instrText>
+      <w:fldChar w:fldCharType="separate"/>
+      <w:t>1</w:t>
+      <w:fldChar w:fldCharType="end"/>
+    </w:r>
+  </w:p>
+</w:ftr>
+</file>
+
+<file path=word/footer127.xml><?xml version="1.0" encoding="utf-8"?>
+<w:ftr xmlns:m="http://schemas.openxmlformats.org/officeDocument/2006/math" xmlns:mc="http://schemas.openxmlformats.org/markup-compatibility/2006" xmlns:mo="http://schemas.microsoft.com/office/mac/office/2008/main" xmlns:mv="urn:schemas-microsoft-com:mac:vml" xmlns:o="urn:schemas-microsoft-com:office:office" xmlns:r="http://schemas.openxmlformats.org/officeDocument/2006/relationships" xmlns:v="urn:schemas-microsoft-com:vml" xmlns:w10="urn:schemas-microsoft-com:office:word" xmlns:w14="http://schemas.microsoft.com/office/word/2010/wordml" xmlns:w="http://schemas.openxmlformats.org/wordprocessingml/2006/main" xmlns:wne="http://schemas.microsoft.com/office/word/2006/wordml" xmlns:wp14="http://schemas.microsoft.com/office/word/2010/wordprocessingDrawing" xmlns:wp="http://schemas.openxmlformats.org/drawingml/2006/wordprocessingDrawing" xmlns:wpc="http://schemas.microsoft.com/office/word/2010/wordprocessingCanvas" xmlns:wpg="http://schemas.microsoft.com/office/word/2010/wordprocessingGroup" xmlns:wpi="http://schemas.microsoft.com/office/word/2010/wordprocessingInk" xmlns:wps="http://schemas.microsoft.com/office/word/2010/wordprocessingShape" mc:Ignorable="w14 wp14">
+  <w:p>
+    <w:pPr>
+      <w:pStyle w:val="Footer"/>
+      <w:spacing w:before="40"/>
+      <w:jc w:val="left"/>
+      <w:pBdr>
+        <w:top w:val="single" w:sz="4" w:space="2" w:color="808080"/>
+      </w:pBdr>
+    </w:pPr>
+    <w:r/>
+    <w:r>
+      <w:rPr>
+        <w:rFonts w:ascii="Arial" w:hAnsi="Arial"/>
+        <w:color w:val="555555"/>
+        <w:sz w:val="20"/>
+      </w:rPr>
+      <w:t>Revision 4 — October 2026</w:t>
     </w:r>
   </w:p>
 </w:ftr>
@@ -18403,14 +19431,80 @@
       </w:pBdr>
     </w:pPr>
     <w:r/>
-    <w:r>
-      <w:rPr>
-        <w:rFonts w:ascii="Arial" w:hAnsi="Arial"/>
-        <w:b/>
-        <w:color w:val="555555"/>
-        <w:sz w:val="20"/>
-      </w:rPr>
-      <w:t>Copyright and Disclaimer</w:t>
+  </w:p>
+</w:hdr>
+</file>
+
+<file path=word/header107.xml><?xml version="1.0" encoding="utf-8"?>
+<w:hdr xmlns:m="http://schemas.openxmlformats.org/officeDocument/2006/math" xmlns:mc="http://schemas.openxmlformats.org/markup-compatibility/2006" xmlns:mo="http://schemas.microsoft.com/office/mac/office/2008/main" xmlns:mv="urn:schemas-microsoft-com:mac:vml" xmlns:o="urn:schemas-microsoft-com:office:office" xmlns:r="http://schemas.openxmlformats.org/officeDocument/2006/relationships" xmlns:v="urn:schemas-microsoft-com:vml" xmlns:w10="urn:schemas-microsoft-com:office:word" xmlns:w14="http://schemas.microsoft.com/office/word/2010/wordml" xmlns:w="http://schemas.openxmlformats.org/wordprocessingml/2006/main" xmlns:wne="http://schemas.microsoft.com/office/word/2006/wordml" xmlns:wp14="http://schemas.microsoft.com/office/word/2010/wordprocessingDrawing" xmlns:wp="http://schemas.openxmlformats.org/drawingml/2006/wordprocessingDrawing" xmlns:wpc="http://schemas.microsoft.com/office/word/2010/wordprocessingCanvas" xmlns:wpg="http://schemas.microsoft.com/office/word/2010/wordprocessingGroup" xmlns:wpi="http://schemas.microsoft.com/office/word/2010/wordprocessingInk" xmlns:wps="http://schemas.microsoft.com/office/word/2010/wordprocessingShape" mc:Ignorable="w14 wp14">
+  <w:p>
+    <w:pPr>
+      <w:pStyle w:val="Header"/>
+      <w:spacing w:after="40"/>
+      <w:jc w:val="right"/>
+      <w:pBdr>
+        <w:bottom w:val="single" w:sz="4" w:space="2" w:color="808080"/>
+      </w:pBdr>
+    </w:pPr>
+    <w:r/>
+    <w:r>
+      <w:rPr>
+        <w:rFonts w:ascii="Arial" w:hAnsi="Arial"/>
+        <w:b/>
+        <w:color w:val="555555"/>
+        <w:sz w:val="20"/>
+      </w:rPr>
+      <w:t>Table of Contents</w:t>
+    </w:r>
+  </w:p>
+</w:hdr>
+</file>
+
+<file path=word/header108.xml><?xml version="1.0" encoding="utf-8"?>
+<w:hdr xmlns:m="http://schemas.openxmlformats.org/officeDocument/2006/math" xmlns:mc="http://schemas.openxmlformats.org/markup-compatibility/2006" xmlns:mo="http://schemas.microsoft.com/office/mac/office/2008/main" xmlns:mv="urn:schemas-microsoft-com:mac:vml" xmlns:o="urn:schemas-microsoft-com:office:office" xmlns:r="http://schemas.openxmlformats.org/officeDocument/2006/relationships" xmlns:v="urn:schemas-microsoft-com:vml" xmlns:w10="urn:schemas-microsoft-com:office:word" xmlns:w14="http://schemas.microsoft.com/office/word/2010/wordml" xmlns:w="http://schemas.openxmlformats.org/wordprocessingml/2006/main" xmlns:wne="http://schemas.microsoft.com/office/word/2006/wordml" xmlns:wp14="http://schemas.microsoft.com/office/word/2010/wordprocessingDrawing" xmlns:wp="http://schemas.openxmlformats.org/drawingml/2006/wordprocessingDrawing" xmlns:wpc="http://schemas.microsoft.com/office/word/2010/wordprocessingCanvas" xmlns:wpg="http://schemas.microsoft.com/office/word/2010/wordprocessingGroup" xmlns:wpi="http://schemas.microsoft.com/office/word/2010/wordprocessingInk" xmlns:wps="http://schemas.microsoft.com/office/word/2010/wordprocessingShape" mc:Ignorable="w14 wp14">
+  <w:p>
+    <w:pPr>
+      <w:pStyle w:val="Header"/>
+      <w:spacing w:after="40"/>
+      <w:jc w:val="right"/>
+      <w:pBdr>
+        <w:bottom w:val="single" w:sz="4" w:space="2" w:color="808080"/>
+      </w:pBdr>
+    </w:pPr>
+    <w:r/>
+    <w:r>
+      <w:rPr>
+        <w:rFonts w:ascii="Arial" w:hAnsi="Arial"/>
+        <w:b/>
+        <w:color w:val="555555"/>
+        <w:sz w:val="20"/>
+      </w:rPr>
+      <w:t>Quick Start</w:t>
+    </w:r>
+  </w:p>
+</w:hdr>
+</file>
+
+<file path=word/header109.xml><?xml version="1.0" encoding="utf-8"?>
+<w:hdr xmlns:m="http://schemas.openxmlformats.org/officeDocument/2006/math" xmlns:mc="http://schemas.openxmlformats.org/markup-compatibility/2006" xmlns:mo="http://schemas.microsoft.com/office/mac/office/2008/main" xmlns:mv="urn:schemas-microsoft-com:mac:vml" xmlns:o="urn:schemas-microsoft-com:office:office" xmlns:r="http://schemas.openxmlformats.org/officeDocument/2006/relationships" xmlns:v="urn:schemas-microsoft-com:vml" xmlns:w10="urn:schemas-microsoft-com:office:word" xmlns:w14="http://schemas.microsoft.com/office/word/2010/wordml" xmlns:w="http://schemas.openxmlformats.org/wordprocessingml/2006/main" xmlns:wne="http://schemas.microsoft.com/office/word/2006/wordml" xmlns:wp14="http://schemas.microsoft.com/office/word/2010/wordprocessingDrawing" xmlns:wp="http://schemas.openxmlformats.org/drawingml/2006/wordprocessingDrawing" xmlns:wpc="http://schemas.microsoft.com/office/word/2010/wordprocessingCanvas" xmlns:wpg="http://schemas.microsoft.com/office/word/2010/wordprocessingGroup" xmlns:wpi="http://schemas.microsoft.com/office/word/2010/wordprocessingInk" xmlns:wps="http://schemas.microsoft.com/office/word/2010/wordprocessingShape" mc:Ignorable="w14 wp14">
+  <w:p>
+    <w:pPr>
+      <w:pStyle w:val="Header"/>
+      <w:spacing w:after="40"/>
+      <w:jc w:val="right"/>
+      <w:pBdr>
+        <w:bottom w:val="single" w:sz="4" w:space="2" w:color="808080"/>
+      </w:pBdr>
+    </w:pPr>
+    <w:r/>
+    <w:r>
+      <w:rPr>
+        <w:rFonts w:ascii="Arial" w:hAnsi="Arial"/>
+        <w:b/>
+        <w:color w:val="555555"/>
+        <w:sz w:val="20"/>
+      </w:rPr>
+      <w:t>1. Overview</w:t>
     </w:r>
   </w:p>
 </w:hdr>
@@ -18441,7 +19535,7 @@
 </w:hdr>
 </file>
 
-<file path=word/header12.xml><?xml version="1.0" encoding="utf-8"?>
+<file path=word/header110.xml><?xml version="1.0" encoding="utf-8"?>
 <w:hdr xmlns:m="http://schemas.openxmlformats.org/officeDocument/2006/math" xmlns:mc="http://schemas.openxmlformats.org/markup-compatibility/2006" xmlns:mo="http://schemas.microsoft.com/office/mac/office/2008/main" xmlns:mv="urn:schemas-microsoft-com:mac:vml" xmlns:o="urn:schemas-microsoft-com:office:office" xmlns:r="http://schemas.openxmlformats.org/officeDocument/2006/relationships" xmlns:v="urn:schemas-microsoft-com:vml" xmlns:w10="urn:schemas-microsoft-com:office:word" xmlns:w14="http://schemas.microsoft.com/office/word/2010/wordml" xmlns:w="http://schemas.openxmlformats.org/wordprocessingml/2006/main" xmlns:wne="http://schemas.microsoft.com/office/word/2006/wordml" xmlns:wp14="http://schemas.microsoft.com/office/word/2010/wordprocessingDrawing" xmlns:wp="http://schemas.openxmlformats.org/drawingml/2006/wordprocessingDrawing" xmlns:wpc="http://schemas.microsoft.com/office/word/2010/wordprocessingCanvas" xmlns:wpg="http://schemas.microsoft.com/office/word/2010/wordprocessingGroup" xmlns:wpi="http://schemas.microsoft.com/office/word/2010/wordprocessingInk" xmlns:wps="http://schemas.microsoft.com/office/word/2010/wordprocessingShape" mc:Ignorable="w14 wp14">
   <w:p>
     <w:pPr>
@@ -18460,7 +19554,457 @@
         <w:color w:val="555555"/>
         <w:sz w:val="20"/>
       </w:rPr>
+      <w:t>2. Models</w:t>
+    </w:r>
+  </w:p>
+</w:hdr>
+</file>
+
+<file path=word/header111.xml><?xml version="1.0" encoding="utf-8"?>
+<w:hdr xmlns:m="http://schemas.openxmlformats.org/officeDocument/2006/math" xmlns:mc="http://schemas.openxmlformats.org/markup-compatibility/2006" xmlns:mo="http://schemas.microsoft.com/office/mac/office/2008/main" xmlns:mv="urn:schemas-microsoft-com:mac:vml" xmlns:o="urn:schemas-microsoft-com:office:office" xmlns:r="http://schemas.openxmlformats.org/officeDocument/2006/relationships" xmlns:v="urn:schemas-microsoft-com:vml" xmlns:w10="urn:schemas-microsoft-com:office:word" xmlns:w14="http://schemas.microsoft.com/office/word/2010/wordml" xmlns:w="http://schemas.openxmlformats.org/wordprocessingml/2006/main" xmlns:wne="http://schemas.microsoft.com/office/word/2006/wordml" xmlns:wp14="http://schemas.microsoft.com/office/word/2010/wordprocessingDrawing" xmlns:wp="http://schemas.openxmlformats.org/drawingml/2006/wordprocessingDrawing" xmlns:wpc="http://schemas.microsoft.com/office/word/2010/wordprocessingCanvas" xmlns:wpg="http://schemas.microsoft.com/office/word/2010/wordprocessingGroup" xmlns:wpi="http://schemas.microsoft.com/office/word/2010/wordprocessingInk" xmlns:wps="http://schemas.microsoft.com/office/word/2010/wordprocessingShape" mc:Ignorable="w14 wp14">
+  <w:p>
+    <w:pPr>
+      <w:pStyle w:val="Header"/>
+      <w:spacing w:after="40"/>
+      <w:jc w:val="right"/>
+      <w:pBdr>
+        <w:bottom w:val="single" w:sz="4" w:space="2" w:color="808080"/>
+      </w:pBdr>
+    </w:pPr>
+    <w:r/>
+    <w:r>
+      <w:rPr>
+        <w:rFonts w:ascii="Arial" w:hAnsi="Arial"/>
+        <w:b/>
+        <w:color w:val="555555"/>
+        <w:sz w:val="20"/>
+      </w:rPr>
+      <w:t>3. Display</w:t>
+    </w:r>
+  </w:p>
+</w:hdr>
+</file>
+
+<file path=word/header112.xml><?xml version="1.0" encoding="utf-8"?>
+<w:hdr xmlns:m="http://schemas.openxmlformats.org/officeDocument/2006/math" xmlns:mc="http://schemas.openxmlformats.org/markup-compatibility/2006" xmlns:mo="http://schemas.microsoft.com/office/mac/office/2008/main" xmlns:mv="urn:schemas-microsoft-com:mac:vml" xmlns:o="urn:schemas-microsoft-com:office:office" xmlns:r="http://schemas.openxmlformats.org/officeDocument/2006/relationships" xmlns:v="urn:schemas-microsoft-com:vml" xmlns:w10="urn:schemas-microsoft-com:office:word" xmlns:w14="http://schemas.microsoft.com/office/word/2010/wordml" xmlns:w="http://schemas.openxmlformats.org/wordprocessingml/2006/main" xmlns:wne="http://schemas.microsoft.com/office/word/2006/wordml" xmlns:wp14="http://schemas.microsoft.com/office/word/2010/wordprocessingDrawing" xmlns:wp="http://schemas.openxmlformats.org/drawingml/2006/wordprocessingDrawing" xmlns:wpc="http://schemas.microsoft.com/office/word/2010/wordprocessingCanvas" xmlns:wpg="http://schemas.microsoft.com/office/word/2010/wordprocessingGroup" xmlns:wpi="http://schemas.microsoft.com/office/word/2010/wordprocessingInk" xmlns:wps="http://schemas.microsoft.com/office/word/2010/wordprocessingShape" mc:Ignorable="w14 wp14">
+  <w:p>
+    <w:pPr>
+      <w:pStyle w:val="Header"/>
+      <w:spacing w:after="40"/>
+      <w:jc w:val="right"/>
+      <w:pBdr>
+        <w:bottom w:val="single" w:sz="4" w:space="2" w:color="808080"/>
+      </w:pBdr>
+    </w:pPr>
+    <w:r/>
+    <w:r>
+      <w:rPr>
+        <w:rFonts w:ascii="Arial" w:hAnsi="Arial"/>
+        <w:b/>
+        <w:color w:val="555555"/>
+        <w:sz w:val="20"/>
+      </w:rPr>
+      <w:t>4. Buttons</w:t>
+    </w:r>
+  </w:p>
+</w:hdr>
+</file>
+
+<file path=word/header113.xml><?xml version="1.0" encoding="utf-8"?>
+<w:hdr xmlns:m="http://schemas.openxmlformats.org/officeDocument/2006/math" xmlns:mc="http://schemas.openxmlformats.org/markup-compatibility/2006" xmlns:mo="http://schemas.microsoft.com/office/mac/office/2008/main" xmlns:mv="urn:schemas-microsoft-com:mac:vml" xmlns:o="urn:schemas-microsoft-com:office:office" xmlns:r="http://schemas.openxmlformats.org/officeDocument/2006/relationships" xmlns:v="urn:schemas-microsoft-com:vml" xmlns:w10="urn:schemas-microsoft-com:office:word" xmlns:w14="http://schemas.microsoft.com/office/word/2010/wordml" xmlns:w="http://schemas.openxmlformats.org/wordprocessingml/2006/main" xmlns:wne="http://schemas.microsoft.com/office/word/2006/wordml" xmlns:wp14="http://schemas.microsoft.com/office/word/2010/wordprocessingDrawing" xmlns:wp="http://schemas.openxmlformats.org/drawingml/2006/wordprocessingDrawing" xmlns:wpc="http://schemas.microsoft.com/office/word/2010/wordprocessingCanvas" xmlns:wpg="http://schemas.microsoft.com/office/word/2010/wordprocessingGroup" xmlns:wpi="http://schemas.microsoft.com/office/word/2010/wordprocessingInk" xmlns:wps="http://schemas.microsoft.com/office/word/2010/wordprocessingShape" mc:Ignorable="w14 wp14">
+  <w:p>
+    <w:pPr>
+      <w:pStyle w:val="Header"/>
+      <w:spacing w:after="40"/>
+      <w:jc w:val="right"/>
+      <w:pBdr>
+        <w:bottom w:val="single" w:sz="4" w:space="2" w:color="808080"/>
+      </w:pBdr>
+    </w:pPr>
+    <w:r/>
+    <w:r>
+      <w:rPr>
+        <w:rFonts w:ascii="Arial" w:hAnsi="Arial"/>
+        <w:b/>
+        <w:color w:val="555555"/>
+        <w:sz w:val="20"/>
+      </w:rPr>
+      <w:t>5. Power-On Functions</w:t>
+    </w:r>
+  </w:p>
+</w:hdr>
+</file>
+
+<file path=word/header114.xml><?xml version="1.0" encoding="utf-8"?>
+<w:hdr xmlns:m="http://schemas.openxmlformats.org/officeDocument/2006/math" xmlns:mc="http://schemas.openxmlformats.org/markup-compatibility/2006" xmlns:mo="http://schemas.microsoft.com/office/mac/office/2008/main" xmlns:mv="urn:schemas-microsoft-com:mac:vml" xmlns:o="urn:schemas-microsoft-com:office:office" xmlns:r="http://schemas.openxmlformats.org/officeDocument/2006/relationships" xmlns:v="urn:schemas-microsoft-com:vml" xmlns:w10="urn:schemas-microsoft-com:office:word" xmlns:w14="http://schemas.microsoft.com/office/word/2010/wordml" xmlns:w="http://schemas.openxmlformats.org/wordprocessingml/2006/main" xmlns:wne="http://schemas.microsoft.com/office/word/2006/wordml" xmlns:wp14="http://schemas.microsoft.com/office/word/2010/wordprocessingDrawing" xmlns:wp="http://schemas.openxmlformats.org/drawingml/2006/wordprocessingDrawing" xmlns:wpc="http://schemas.microsoft.com/office/word/2010/wordprocessingCanvas" xmlns:wpg="http://schemas.microsoft.com/office/word/2010/wordprocessingGroup" xmlns:wpi="http://schemas.microsoft.com/office/word/2010/wordprocessingInk" xmlns:wps="http://schemas.microsoft.com/office/word/2010/wordprocessingShape" mc:Ignorable="w14 wp14">
+  <w:p>
+    <w:pPr>
+      <w:pStyle w:val="Header"/>
+      <w:spacing w:after="40"/>
+      <w:jc w:val="right"/>
+      <w:pBdr>
+        <w:bottom w:val="single" w:sz="4" w:space="2" w:color="808080"/>
+      </w:pBdr>
+    </w:pPr>
+    <w:r/>
+    <w:r>
+      <w:rPr>
+        <w:rFonts w:ascii="Arial" w:hAnsi="Arial"/>
+        <w:b/>
+        <w:color w:val="555555"/>
+        <w:sz w:val="20"/>
+      </w:rPr>
+      <w:t>6. AP Configuration Mode</w:t>
+    </w:r>
+  </w:p>
+</w:hdr>
+</file>
+
+<file path=word/header115.xml><?xml version="1.0" encoding="utf-8"?>
+<w:hdr xmlns:m="http://schemas.openxmlformats.org/officeDocument/2006/math" xmlns:mc="http://schemas.openxmlformats.org/markup-compatibility/2006" xmlns:mo="http://schemas.microsoft.com/office/mac/office/2008/main" xmlns:mv="urn:schemas-microsoft-com:mac:vml" xmlns:o="urn:schemas-microsoft-com:office:office" xmlns:r="http://schemas.openxmlformats.org/officeDocument/2006/relationships" xmlns:v="urn:schemas-microsoft-com:vml" xmlns:w10="urn:schemas-microsoft-com:office:word" xmlns:w14="http://schemas.microsoft.com/office/word/2010/wordml" xmlns:w="http://schemas.openxmlformats.org/wordprocessingml/2006/main" xmlns:wne="http://schemas.microsoft.com/office/word/2006/wordml" xmlns:wp14="http://schemas.microsoft.com/office/word/2010/wordprocessingDrawing" xmlns:wp="http://schemas.openxmlformats.org/drawingml/2006/wordprocessingDrawing" xmlns:wpc="http://schemas.microsoft.com/office/word/2010/wordprocessingCanvas" xmlns:wpg="http://schemas.microsoft.com/office/word/2010/wordprocessingGroup" xmlns:wpi="http://schemas.microsoft.com/office/word/2010/wordprocessingInk" xmlns:wps="http://schemas.microsoft.com/office/word/2010/wordprocessingShape" mc:Ignorable="w14 wp14">
+  <w:p>
+    <w:pPr>
+      <w:pStyle w:val="Header"/>
+      <w:spacing w:after="40"/>
+      <w:jc w:val="right"/>
+      <w:pBdr>
+        <w:bottom w:val="single" w:sz="4" w:space="2" w:color="808080"/>
+      </w:pBdr>
+    </w:pPr>
+    <w:r/>
+    <w:r>
+      <w:rPr>
+        <w:rFonts w:ascii="Arial" w:hAnsi="Arial"/>
+        <w:b/>
+        <w:color w:val="555555"/>
+        <w:sz w:val="20"/>
+      </w:rPr>
+      <w:t>7. Live Settings Web Interface</w:t>
+    </w:r>
+  </w:p>
+</w:hdr>
+</file>
+
+<file path=word/header116.xml><?xml version="1.0" encoding="utf-8"?>
+<w:hdr xmlns:m="http://schemas.openxmlformats.org/officeDocument/2006/math" xmlns:mc="http://schemas.openxmlformats.org/markup-compatibility/2006" xmlns:mo="http://schemas.microsoft.com/office/mac/office/2008/main" xmlns:mv="urn:schemas-microsoft-com:mac:vml" xmlns:o="urn:schemas-microsoft-com:office:office" xmlns:r="http://schemas.openxmlformats.org/officeDocument/2006/relationships" xmlns:v="urn:schemas-microsoft-com:vml" xmlns:w10="urn:schemas-microsoft-com:office:word" xmlns:w14="http://schemas.microsoft.com/office/word/2010/wordml" xmlns:w="http://schemas.openxmlformats.org/wordprocessingml/2006/main" xmlns:wne="http://schemas.microsoft.com/office/word/2006/wordml" xmlns:wp14="http://schemas.microsoft.com/office/word/2010/wordprocessingDrawing" xmlns:wp="http://schemas.openxmlformats.org/drawingml/2006/wordprocessingDrawing" xmlns:wpc="http://schemas.microsoft.com/office/word/2010/wordprocessingCanvas" xmlns:wpg="http://schemas.microsoft.com/office/word/2010/wordprocessingGroup" xmlns:wpi="http://schemas.microsoft.com/office/word/2010/wordprocessingInk" xmlns:wps="http://schemas.microsoft.com/office/word/2010/wordprocessingShape" mc:Ignorable="w14 wp14">
+  <w:p>
+    <w:pPr>
+      <w:pStyle w:val="Header"/>
+      <w:spacing w:after="40"/>
+      <w:jc w:val="right"/>
+      <w:pBdr>
+        <w:bottom w:val="single" w:sz="4" w:space="2" w:color="808080"/>
+      </w:pBdr>
+    </w:pPr>
+    <w:r/>
+    <w:r>
+      <w:rPr>
+        <w:rFonts w:ascii="Arial" w:hAnsi="Arial"/>
+        <w:b/>
+        <w:color w:val="555555"/>
+        <w:sz w:val="20"/>
+      </w:rPr>
+      <w:t>8. Rule Scheduler</w:t>
+    </w:r>
+  </w:p>
+</w:hdr>
+</file>
+
+<file path=word/header117.xml><?xml version="1.0" encoding="utf-8"?>
+<w:hdr xmlns:m="http://schemas.openxmlformats.org/officeDocument/2006/math" xmlns:mc="http://schemas.openxmlformats.org/markup-compatibility/2006" xmlns:mo="http://schemas.microsoft.com/office/mac/office/2008/main" xmlns:mv="urn:schemas-microsoft-com:mac:vml" xmlns:o="urn:schemas-microsoft-com:office:office" xmlns:r="http://schemas.openxmlformats.org/officeDocument/2006/relationships" xmlns:v="urn:schemas-microsoft-com:vml" xmlns:w10="urn:schemas-microsoft-com:office:word" xmlns:w14="http://schemas.microsoft.com/office/word/2010/wordml" xmlns:w="http://schemas.openxmlformats.org/wordprocessingml/2006/main" xmlns:wne="http://schemas.microsoft.com/office/word/2006/wordml" xmlns:wp14="http://schemas.microsoft.com/office/word/2010/wordprocessingDrawing" xmlns:wp="http://schemas.openxmlformats.org/drawingml/2006/wordprocessingDrawing" xmlns:wpc="http://schemas.microsoft.com/office/word/2010/wordprocessingCanvas" xmlns:wpg="http://schemas.microsoft.com/office/word/2010/wordprocessingGroup" xmlns:wpi="http://schemas.microsoft.com/office/word/2010/wordprocessingInk" xmlns:wps="http://schemas.microsoft.com/office/word/2010/wordprocessingShape" mc:Ignorable="w14 wp14">
+  <w:p>
+    <w:pPr>
+      <w:pStyle w:val="Header"/>
+      <w:spacing w:after="40"/>
+      <w:jc w:val="right"/>
+      <w:pBdr>
+        <w:bottom w:val="single" w:sz="4" w:space="2" w:color="808080"/>
+      </w:pBdr>
+    </w:pPr>
+    <w:r/>
+    <w:r>
+      <w:rPr>
+        <w:rFonts w:ascii="Arial" w:hAnsi="Arial"/>
+        <w:b/>
+        <w:color w:val="555555"/>
+        <w:sz w:val="20"/>
+      </w:rPr>
       <w:t>9. Backlight (LED) Effects</w:t>
+    </w:r>
+  </w:p>
+</w:hdr>
+</file>
+
+<file path=word/header118.xml><?xml version="1.0" encoding="utf-8"?>
+<w:hdr xmlns:m="http://schemas.openxmlformats.org/officeDocument/2006/math" xmlns:mc="http://schemas.openxmlformats.org/markup-compatibility/2006" xmlns:mo="http://schemas.microsoft.com/office/mac/office/2008/main" xmlns:mv="urn:schemas-microsoft-com:mac:vml" xmlns:o="urn:schemas-microsoft-com:office:office" xmlns:r="http://schemas.openxmlformats.org/officeDocument/2006/relationships" xmlns:v="urn:schemas-microsoft-com:vml" xmlns:w10="urn:schemas-microsoft-com:office:word" xmlns:w14="http://schemas.microsoft.com/office/word/2010/wordml" xmlns:w="http://schemas.openxmlformats.org/wordprocessingml/2006/main" xmlns:wne="http://schemas.microsoft.com/office/word/2006/wordml" xmlns:wp14="http://schemas.microsoft.com/office/word/2010/wordprocessingDrawing" xmlns:wp="http://schemas.openxmlformats.org/drawingml/2006/wordprocessingDrawing" xmlns:wpc="http://schemas.microsoft.com/office/word/2010/wordprocessingCanvas" xmlns:wpg="http://schemas.microsoft.com/office/word/2010/wordprocessingGroup" xmlns:wpi="http://schemas.microsoft.com/office/word/2010/wordprocessingInk" xmlns:wps="http://schemas.microsoft.com/office/word/2010/wordprocessingShape" mc:Ignorable="w14 wp14">
+  <w:p>
+    <w:pPr>
+      <w:pStyle w:val="Header"/>
+      <w:spacing w:after="40"/>
+      <w:jc w:val="right"/>
+      <w:pBdr>
+        <w:bottom w:val="single" w:sz="4" w:space="2" w:color="808080"/>
+      </w:pBdr>
+    </w:pPr>
+    <w:r/>
+    <w:r>
+      <w:rPr>
+        <w:rFonts w:ascii="Arial" w:hAnsi="Arial"/>
+        <w:b/>
+        <w:color w:val="555555"/>
+        <w:sz w:val="20"/>
+      </w:rPr>
+      <w:t>10. Word Change Effect</w:t>
+    </w:r>
+  </w:p>
+</w:hdr>
+</file>
+
+<file path=word/header119.xml><?xml version="1.0" encoding="utf-8"?>
+<w:hdr xmlns:m="http://schemas.openxmlformats.org/officeDocument/2006/math" xmlns:mc="http://schemas.openxmlformats.org/markup-compatibility/2006" xmlns:mo="http://schemas.microsoft.com/office/mac/office/2008/main" xmlns:mv="urn:schemas-microsoft-com:mac:vml" xmlns:o="urn:schemas-microsoft-com:office:office" xmlns:r="http://schemas.openxmlformats.org/officeDocument/2006/relationships" xmlns:v="urn:schemas-microsoft-com:vml" xmlns:w10="urn:schemas-microsoft-com:office:word" xmlns:w14="http://schemas.microsoft.com/office/word/2010/wordml" xmlns:w="http://schemas.openxmlformats.org/wordprocessingml/2006/main" xmlns:wne="http://schemas.microsoft.com/office/word/2006/wordml" xmlns:wp14="http://schemas.microsoft.com/office/word/2010/wordprocessingDrawing" xmlns:wp="http://schemas.openxmlformats.org/drawingml/2006/wordprocessingDrawing" xmlns:wpc="http://schemas.microsoft.com/office/word/2010/wordprocessingCanvas" xmlns:wpg="http://schemas.microsoft.com/office/word/2010/wordprocessingGroup" xmlns:wpi="http://schemas.microsoft.com/office/word/2010/wordprocessingInk" xmlns:wps="http://schemas.microsoft.com/office/word/2010/wordprocessingShape" mc:Ignorable="w14 wp14">
+  <w:p>
+    <w:pPr>
+      <w:pStyle w:val="Header"/>
+      <w:spacing w:after="40"/>
+      <w:jc w:val="right"/>
+      <w:pBdr>
+        <w:bottom w:val="single" w:sz="4" w:space="2" w:color="808080"/>
+      </w:pBdr>
+    </w:pPr>
+    <w:r/>
+    <w:r>
+      <w:rPr>
+        <w:rFonts w:ascii="Arial" w:hAnsi="Arial"/>
+        <w:b/>
+        <w:color w:val="555555"/>
+        <w:sz w:val="20"/>
+      </w:rPr>
+      <w:t>11. Date, Weather, and Announcements</w:t>
+    </w:r>
+  </w:p>
+</w:hdr>
+</file>
+
+<file path=word/header12.xml><?xml version="1.0" encoding="utf-8"?>
+<w:hdr xmlns:m="http://schemas.openxmlformats.org/officeDocument/2006/math" xmlns:mc="http://schemas.openxmlformats.org/markup-compatibility/2006" xmlns:mo="http://schemas.microsoft.com/office/mac/office/2008/main" xmlns:mv="urn:schemas-microsoft-com:mac:vml" xmlns:o="urn:schemas-microsoft-com:office:office" xmlns:r="http://schemas.openxmlformats.org/officeDocument/2006/relationships" xmlns:v="urn:schemas-microsoft-com:vml" xmlns:w10="urn:schemas-microsoft-com:office:word" xmlns:w14="http://schemas.microsoft.com/office/word/2010/wordml" xmlns:w="http://schemas.openxmlformats.org/wordprocessingml/2006/main" xmlns:wne="http://schemas.microsoft.com/office/word/2006/wordml" xmlns:wp14="http://schemas.microsoft.com/office/word/2010/wordprocessingDrawing" xmlns:wp="http://schemas.openxmlformats.org/drawingml/2006/wordprocessingDrawing" xmlns:wpc="http://schemas.microsoft.com/office/word/2010/wordprocessingCanvas" xmlns:wpg="http://schemas.microsoft.com/office/word/2010/wordprocessingGroup" xmlns:wpi="http://schemas.microsoft.com/office/word/2010/wordprocessingInk" xmlns:wps="http://schemas.microsoft.com/office/word/2010/wordprocessingShape" mc:Ignorable="w14 wp14">
+  <w:p>
+    <w:pPr>
+      <w:pStyle w:val="Header"/>
+      <w:spacing w:after="40"/>
+      <w:jc w:val="right"/>
+      <w:pBdr>
+        <w:bottom w:val="single" w:sz="4" w:space="2" w:color="808080"/>
+      </w:pBdr>
+    </w:pPr>
+    <w:r/>
+    <w:r>
+      <w:rPr>
+        <w:rFonts w:ascii="Arial" w:hAnsi="Arial"/>
+        <w:b/>
+        <w:color w:val="555555"/>
+        <w:sz w:val="20"/>
+      </w:rPr>
+      <w:t>9. Backlight (LED) Effects</w:t>
+    </w:r>
+  </w:p>
+</w:hdr>
+</file>
+
+<file path=word/header120.xml><?xml version="1.0" encoding="utf-8"?>
+<w:hdr xmlns:m="http://schemas.openxmlformats.org/officeDocument/2006/math" xmlns:mc="http://schemas.openxmlformats.org/markup-compatibility/2006" xmlns:mo="http://schemas.microsoft.com/office/mac/office/2008/main" xmlns:mv="urn:schemas-microsoft-com:mac:vml" xmlns:o="urn:schemas-microsoft-com:office:office" xmlns:r="http://schemas.openxmlformats.org/officeDocument/2006/relationships" xmlns:v="urn:schemas-microsoft-com:vml" xmlns:w10="urn:schemas-microsoft-com:office:word" xmlns:w14="http://schemas.microsoft.com/office/word/2010/wordml" xmlns:w="http://schemas.openxmlformats.org/wordprocessingml/2006/main" xmlns:wne="http://schemas.microsoft.com/office/word/2006/wordml" xmlns:wp14="http://schemas.microsoft.com/office/word/2010/wordprocessingDrawing" xmlns:wp="http://schemas.openxmlformats.org/drawingml/2006/wordprocessingDrawing" xmlns:wpc="http://schemas.microsoft.com/office/word/2010/wordprocessingCanvas" xmlns:wpg="http://schemas.microsoft.com/office/word/2010/wordprocessingGroup" xmlns:wpi="http://schemas.microsoft.com/office/word/2010/wordprocessingInk" xmlns:wps="http://schemas.microsoft.com/office/word/2010/wordprocessingShape" mc:Ignorable="w14 wp14">
+  <w:p>
+    <w:pPr>
+      <w:pStyle w:val="Header"/>
+      <w:spacing w:after="40"/>
+      <w:jc w:val="right"/>
+      <w:pBdr>
+        <w:bottom w:val="single" w:sz="4" w:space="2" w:color="808080"/>
+      </w:pBdr>
+    </w:pPr>
+    <w:r/>
+    <w:r>
+      <w:rPr>
+        <w:rFonts w:ascii="Arial" w:hAnsi="Arial"/>
+        <w:b/>
+        <w:color w:val="555555"/>
+        <w:sz w:val="20"/>
+      </w:rPr>
+      <w:t>12. Word Libraries</w:t>
+    </w:r>
+  </w:p>
+</w:hdr>
+</file>
+
+<file path=word/header121.xml><?xml version="1.0" encoding="utf-8"?>
+<w:hdr xmlns:m="http://schemas.openxmlformats.org/officeDocument/2006/math" xmlns:mc="http://schemas.openxmlformats.org/markup-compatibility/2006" xmlns:mo="http://schemas.microsoft.com/office/mac/office/2008/main" xmlns:mv="urn:schemas-microsoft-com:mac:vml" xmlns:o="urn:schemas-microsoft-com:office:office" xmlns:r="http://schemas.openxmlformats.org/officeDocument/2006/relationships" xmlns:v="urn:schemas-microsoft-com:vml" xmlns:w10="urn:schemas-microsoft-com:office:word" xmlns:w14="http://schemas.microsoft.com/office/word/2010/wordml" xmlns:w="http://schemas.openxmlformats.org/wordprocessingml/2006/main" xmlns:wne="http://schemas.microsoft.com/office/word/2006/wordml" xmlns:wp14="http://schemas.microsoft.com/office/word/2010/wordprocessingDrawing" xmlns:wp="http://schemas.openxmlformats.org/drawingml/2006/wordprocessingDrawing" xmlns:wpc="http://schemas.microsoft.com/office/word/2010/wordprocessingCanvas" xmlns:wpg="http://schemas.microsoft.com/office/word/2010/wordprocessingGroup" xmlns:wpi="http://schemas.microsoft.com/office/word/2010/wordprocessingInk" xmlns:wps="http://schemas.microsoft.com/office/word/2010/wordprocessingShape" mc:Ignorable="w14 wp14">
+  <w:p>
+    <w:pPr>
+      <w:pStyle w:val="Header"/>
+      <w:spacing w:after="40"/>
+      <w:jc w:val="right"/>
+      <w:pBdr>
+        <w:bottom w:val="single" w:sz="4" w:space="2" w:color="808080"/>
+      </w:pBdr>
+    </w:pPr>
+    <w:r/>
+    <w:r>
+      <w:rPr>
+        <w:rFonts w:ascii="Arial" w:hAnsi="Arial"/>
+        <w:b/>
+        <w:color w:val="555555"/>
+        <w:sz w:val="20"/>
+      </w:rPr>
+      <w:t>13. Sensors</w:t>
+    </w:r>
+  </w:p>
+</w:hdr>
+</file>
+
+<file path=word/header122.xml><?xml version="1.0" encoding="utf-8"?>
+<w:hdr xmlns:m="http://schemas.openxmlformats.org/officeDocument/2006/math" xmlns:mc="http://schemas.openxmlformats.org/markup-compatibility/2006" xmlns:mo="http://schemas.microsoft.com/office/mac/office/2008/main" xmlns:mv="urn:schemas-microsoft-com:mac:vml" xmlns:o="urn:schemas-microsoft-com:office:office" xmlns:r="http://schemas.openxmlformats.org/officeDocument/2006/relationships" xmlns:v="urn:schemas-microsoft-com:vml" xmlns:w10="urn:schemas-microsoft-com:office:word" xmlns:w14="http://schemas.microsoft.com/office/word/2010/wordml" xmlns:w="http://schemas.openxmlformats.org/wordprocessingml/2006/main" xmlns:wne="http://schemas.microsoft.com/office/word/2006/wordml" xmlns:wp14="http://schemas.microsoft.com/office/word/2010/wordprocessingDrawing" xmlns:wp="http://schemas.openxmlformats.org/drawingml/2006/wordprocessingDrawing" xmlns:wpc="http://schemas.microsoft.com/office/word/2010/wordprocessingCanvas" xmlns:wpg="http://schemas.microsoft.com/office/word/2010/wordprocessingGroup" xmlns:wpi="http://schemas.microsoft.com/office/word/2010/wordprocessingInk" xmlns:wps="http://schemas.microsoft.com/office/word/2010/wordprocessingShape" mc:Ignorable="w14 wp14">
+  <w:p>
+    <w:pPr>
+      <w:pStyle w:val="Header"/>
+      <w:spacing w:after="40"/>
+      <w:jc w:val="right"/>
+      <w:pBdr>
+        <w:bottom w:val="single" w:sz="4" w:space="2" w:color="808080"/>
+      </w:pBdr>
+    </w:pPr>
+    <w:r/>
+    <w:r>
+      <w:rPr>
+        <w:rFonts w:ascii="Arial" w:hAnsi="Arial"/>
+        <w:b/>
+        <w:color w:val="555555"/>
+        <w:sz w:val="20"/>
+      </w:rPr>
+      <w:t>14. Time Synchronization</w:t>
+    </w:r>
+  </w:p>
+</w:hdr>
+</file>
+
+<file path=word/header123.xml><?xml version="1.0" encoding="utf-8"?>
+<w:hdr xmlns:m="http://schemas.openxmlformats.org/officeDocument/2006/math" xmlns:mc="http://schemas.openxmlformats.org/markup-compatibility/2006" xmlns:mo="http://schemas.microsoft.com/office/mac/office/2008/main" xmlns:mv="urn:schemas-microsoft-com:mac:vml" xmlns:o="urn:schemas-microsoft-com:office:office" xmlns:r="http://schemas.openxmlformats.org/officeDocument/2006/relationships" xmlns:v="urn:schemas-microsoft-com:vml" xmlns:w10="urn:schemas-microsoft-com:office:word" xmlns:w14="http://schemas.microsoft.com/office/word/2010/wordml" xmlns:w="http://schemas.openxmlformats.org/wordprocessingml/2006/main" xmlns:wne="http://schemas.microsoft.com/office/word/2006/wordml" xmlns:wp14="http://schemas.microsoft.com/office/word/2010/wordprocessingDrawing" xmlns:wp="http://schemas.openxmlformats.org/drawingml/2006/wordprocessingDrawing" xmlns:wpc="http://schemas.microsoft.com/office/word/2010/wordprocessingCanvas" xmlns:wpg="http://schemas.microsoft.com/office/word/2010/wordprocessingGroup" xmlns:wpi="http://schemas.microsoft.com/office/word/2010/wordprocessingInk" xmlns:wps="http://schemas.microsoft.com/office/word/2010/wordprocessingShape" mc:Ignorable="w14 wp14">
+  <w:p>
+    <w:pPr>
+      <w:pStyle w:val="Header"/>
+      <w:spacing w:after="40"/>
+      <w:jc w:val="right"/>
+      <w:pBdr>
+        <w:bottom w:val="single" w:sz="4" w:space="2" w:color="808080"/>
+      </w:pBdr>
+    </w:pPr>
+    <w:r/>
+    <w:r>
+      <w:rPr>
+        <w:rFonts w:ascii="Arial" w:hAnsi="Arial"/>
+        <w:b/>
+        <w:color w:val="555555"/>
+        <w:sz w:val="20"/>
+      </w:rPr>
+      <w:t>15. Firmware Updates</w:t>
+    </w:r>
+  </w:p>
+</w:hdr>
+</file>
+
+<file path=word/header124.xml><?xml version="1.0" encoding="utf-8"?>
+<w:hdr xmlns:m="http://schemas.openxmlformats.org/officeDocument/2006/math" xmlns:mc="http://schemas.openxmlformats.org/markup-compatibility/2006" xmlns:mo="http://schemas.microsoft.com/office/mac/office/2008/main" xmlns:mv="urn:schemas-microsoft-com:mac:vml" xmlns:o="urn:schemas-microsoft-com:office:office" xmlns:r="http://schemas.openxmlformats.org/officeDocument/2006/relationships" xmlns:v="urn:schemas-microsoft-com:vml" xmlns:w10="urn:schemas-microsoft-com:office:word" xmlns:w14="http://schemas.microsoft.com/office/word/2010/wordml" xmlns:w="http://schemas.openxmlformats.org/wordprocessingml/2006/main" xmlns:wne="http://schemas.microsoft.com/office/word/2006/wordml" xmlns:wp14="http://schemas.microsoft.com/office/word/2010/wordprocessingDrawing" xmlns:wp="http://schemas.openxmlformats.org/drawingml/2006/wordprocessingDrawing" xmlns:wpc="http://schemas.microsoft.com/office/word/2010/wordprocessingCanvas" xmlns:wpg="http://schemas.microsoft.com/office/word/2010/wordprocessingGroup" xmlns:wpi="http://schemas.microsoft.com/office/word/2010/wordprocessingInk" xmlns:wps="http://schemas.microsoft.com/office/word/2010/wordprocessingShape" mc:Ignorable="w14 wp14">
+  <w:p>
+    <w:pPr>
+      <w:pStyle w:val="Header"/>
+      <w:spacing w:after="40"/>
+      <w:jc w:val="right"/>
+      <w:pBdr>
+        <w:bottom w:val="single" w:sz="4" w:space="2" w:color="808080"/>
+      </w:pBdr>
+    </w:pPr>
+    <w:r/>
+    <w:r>
+      <w:rPr>
+        <w:rFonts w:ascii="Arial" w:hAnsi="Arial"/>
+        <w:b/>
+        <w:color w:val="555555"/>
+        <w:sz w:val="20"/>
+      </w:rPr>
+      <w:t>16. Factory Reset</w:t>
+    </w:r>
+  </w:p>
+</w:hdr>
+</file>
+
+<file path=word/header125.xml><?xml version="1.0" encoding="utf-8"?>
+<w:hdr xmlns:m="http://schemas.openxmlformats.org/officeDocument/2006/math" xmlns:mc="http://schemas.openxmlformats.org/markup-compatibility/2006" xmlns:mo="http://schemas.microsoft.com/office/mac/office/2008/main" xmlns:mv="urn:schemas-microsoft-com:mac:vml" xmlns:o="urn:schemas-microsoft-com:office:office" xmlns:r="http://schemas.openxmlformats.org/officeDocument/2006/relationships" xmlns:v="urn:schemas-microsoft-com:vml" xmlns:w10="urn:schemas-microsoft-com:office:word" xmlns:w14="http://schemas.microsoft.com/office/word/2010/wordml" xmlns:w="http://schemas.openxmlformats.org/wordprocessingml/2006/main" xmlns:wne="http://schemas.microsoft.com/office/word/2006/wordml" xmlns:wp14="http://schemas.microsoft.com/office/word/2010/wordprocessingDrawing" xmlns:wp="http://schemas.openxmlformats.org/drawingml/2006/wordprocessingDrawing" xmlns:wpc="http://schemas.microsoft.com/office/word/2010/wordprocessingCanvas" xmlns:wpg="http://schemas.microsoft.com/office/word/2010/wordprocessingGroup" xmlns:wpi="http://schemas.microsoft.com/office/word/2010/wordprocessingInk" xmlns:wps="http://schemas.microsoft.com/office/word/2010/wordprocessingShape" mc:Ignorable="w14 wp14">
+  <w:p>
+    <w:pPr>
+      <w:pStyle w:val="Header"/>
+      <w:spacing w:after="40"/>
+      <w:jc w:val="right"/>
+      <w:pBdr>
+        <w:bottom w:val="single" w:sz="4" w:space="2" w:color="808080"/>
+      </w:pBdr>
+    </w:pPr>
+    <w:r/>
+    <w:r>
+      <w:rPr>
+        <w:rFonts w:ascii="Arial" w:hAnsi="Arial"/>
+        <w:b/>
+        <w:color w:val="555555"/>
+        <w:sz w:val="20"/>
+      </w:rPr>
+      <w:t>17. Display Messages</w:t>
+    </w:r>
+  </w:p>
+</w:hdr>
+</file>
+
+<file path=word/header126.xml><?xml version="1.0" encoding="utf-8"?>
+<w:hdr xmlns:m="http://schemas.openxmlformats.org/officeDocument/2006/math" xmlns:mc="http://schemas.openxmlformats.org/markup-compatibility/2006" xmlns:mo="http://schemas.microsoft.com/office/mac/office/2008/main" xmlns:mv="urn:schemas-microsoft-com:mac:vml" xmlns:o="urn:schemas-microsoft-com:office:office" xmlns:r="http://schemas.openxmlformats.org/officeDocument/2006/relationships" xmlns:v="urn:schemas-microsoft-com:vml" xmlns:w10="urn:schemas-microsoft-com:office:word" xmlns:w14="http://schemas.microsoft.com/office/word/2010/wordml" xmlns:w="http://schemas.openxmlformats.org/wordprocessingml/2006/main" xmlns:wne="http://schemas.microsoft.com/office/word/2006/wordml" xmlns:wp14="http://schemas.microsoft.com/office/word/2010/wordprocessingDrawing" xmlns:wp="http://schemas.openxmlformats.org/drawingml/2006/wordprocessingDrawing" xmlns:wpc="http://schemas.microsoft.com/office/word/2010/wordprocessingCanvas" xmlns:wpg="http://schemas.microsoft.com/office/word/2010/wordprocessingGroup" xmlns:wpi="http://schemas.microsoft.com/office/word/2010/wordprocessingInk" xmlns:wps="http://schemas.microsoft.com/office/word/2010/wordprocessingShape" mc:Ignorable="w14 wp14">
+  <w:p>
+    <w:pPr>
+      <w:pStyle w:val="Header"/>
+      <w:spacing w:after="40"/>
+      <w:jc w:val="right"/>
+      <w:pBdr>
+        <w:bottom w:val="single" w:sz="4" w:space="2" w:color="808080"/>
+      </w:pBdr>
+    </w:pPr>
+    <w:r/>
+    <w:r>
+      <w:rPr>
+        <w:rFonts w:ascii="Arial" w:hAnsi="Arial"/>
+        <w:b/>
+        <w:color w:val="555555"/>
+        <w:sz w:val="20"/>
+      </w:rPr>
+      <w:t>18. Troubleshooting</w:t>
+    </w:r>
+  </w:p>
+</w:hdr>
+</file>
+
+<file path=word/header127.xml><?xml version="1.0" encoding="utf-8"?>
+<w:hdr xmlns:m="http://schemas.openxmlformats.org/officeDocument/2006/math" xmlns:mc="http://schemas.openxmlformats.org/markup-compatibility/2006" xmlns:mo="http://schemas.microsoft.com/office/mac/office/2008/main" xmlns:mv="urn:schemas-microsoft-com:mac:vml" xmlns:o="urn:schemas-microsoft-com:office:office" xmlns:r="http://schemas.openxmlformats.org/officeDocument/2006/relationships" xmlns:v="urn:schemas-microsoft-com:vml" xmlns:w10="urn:schemas-microsoft-com:office:word" xmlns:w14="http://schemas.microsoft.com/office/word/2010/wordml" xmlns:w="http://schemas.openxmlformats.org/wordprocessingml/2006/main" xmlns:wne="http://schemas.microsoft.com/office/word/2006/wordml" xmlns:wp14="http://schemas.microsoft.com/office/word/2010/wordprocessingDrawing" xmlns:wp="http://schemas.openxmlformats.org/drawingml/2006/wordprocessingDrawing" xmlns:wpc="http://schemas.microsoft.com/office/word/2010/wordprocessingCanvas" xmlns:wpg="http://schemas.microsoft.com/office/word/2010/wordprocessingGroup" xmlns:wpi="http://schemas.microsoft.com/office/word/2010/wordprocessingInk" xmlns:wps="http://schemas.microsoft.com/office/word/2010/wordprocessingShape" mc:Ignorable="w14 wp14">
+  <w:p>
+    <w:pPr>
+      <w:pStyle w:val="Header"/>
+      <w:spacing w:after="40"/>
+      <w:jc w:val="right"/>
+      <w:pBdr>
+        <w:bottom w:val="single" w:sz="4" w:space="2" w:color="808080"/>
+      </w:pBdr>
+    </w:pPr>
+    <w:r/>
+    <w:r>
+      <w:rPr>
+        <w:rFonts w:ascii="Arial" w:hAnsi="Arial"/>
+        <w:b/>
+        <w:color w:val="555555"/>
+        <w:sz w:val="20"/>
+      </w:rPr>
+      <w:t>Copyright and Disclaimer</w:t>
     </w:r>
   </w:p>
 </w:hdr>

</xml_diff>

<commit_message>
Manuals: no numeric rule limits - the maximum depends on the model and firmware version (WordClock 1-4 rev 5, WordClock 5 rev 8, RingClock/BitClock rev 11, Zev-7 Section 8)
</commit_message>
<xml_diff>
--- a/WordClock 1-4 Operator Manual.docx
+++ b/WordClock 1-4 Operator Manual.docx
@@ -375,7 +375,7 @@
                 <w:rFonts w:ascii="Arial" w:hAnsi="Arial"/>
                 <w:sz w:val="21"/>
               </w:rPr>
-              <w:t>Updated guide (Revision 4)</w:t>
+              <w:t>Updated guide (Revision 5)</w:t>
             </w:r>
           </w:p>
         </w:tc>
@@ -465,8 +465,8 @@
     <w:p>
       <w:pPr>
         <w:sectPr>
-          <w:headerReference w:type="default" r:id="rId225"/>
-          <w:footerReference w:type="default" r:id="rId226"/>
+          <w:headerReference w:type="default" r:id="rId267"/>
+          <w:footerReference w:type="default" r:id="rId268"/>
           <w:pgSz w:w="12240" w:h="15840"/>
           <w:pgMar w:top="1440" w:right="1800" w:bottom="1440" w:left="1800" w:header="720" w:footer="720" w:gutter="0"/>
           <w:cols w:space="720"/>
@@ -1104,8 +1104,8 @@
     <w:p>
       <w:pPr>
         <w:sectPr>
-          <w:headerReference w:type="default" r:id="rId227"/>
-          <w:footerReference w:type="default" r:id="rId228"/>
+          <w:headerReference w:type="default" r:id="rId269"/>
+          <w:footerReference w:type="default" r:id="rId270"/>
           <w:pgSz w:w="12240" w:h="15840"/>
           <w:pgMar w:top="1440" w:right="1800" w:bottom="1440" w:left="1800" w:header="720" w:footer="720" w:gutter="0"/>
           <w:cols w:space="720"/>
@@ -1637,8 +1637,8 @@
     <w:p>
       <w:pPr>
         <w:sectPr>
-          <w:headerReference w:type="default" r:id="rId229"/>
-          <w:footerReference w:type="default" r:id="rId230"/>
+          <w:headerReference w:type="default" r:id="rId271"/>
+          <w:footerReference w:type="default" r:id="rId272"/>
           <w:pgSz w:w="12240" w:h="15840"/>
           <w:pgMar w:top="1440" w:right="1800" w:bottom="1440" w:left="1800" w:header="720" w:footer="720" w:gutter="0"/>
           <w:cols w:space="720"/>
@@ -1732,8 +1732,8 @@
     <w:p>
       <w:pPr>
         <w:sectPr>
-          <w:headerReference w:type="default" r:id="rId231"/>
-          <w:footerReference w:type="default" r:id="rId232"/>
+          <w:headerReference w:type="default" r:id="rId273"/>
+          <w:footerReference w:type="default" r:id="rId274"/>
           <w:pgSz w:w="12240" w:h="15840"/>
           <w:pgMar w:top="1440" w:right="1800" w:bottom="1440" w:left="1800" w:header="720" w:footer="720" w:gutter="0"/>
           <w:cols w:space="720"/>
@@ -2531,8 +2531,8 @@
     <w:p>
       <w:pPr>
         <w:sectPr>
-          <w:headerReference w:type="default" r:id="rId233"/>
-          <w:footerReference w:type="default" r:id="rId234"/>
+          <w:headerReference w:type="default" r:id="rId275"/>
+          <w:footerReference w:type="default" r:id="rId276"/>
           <w:pgSz w:w="12240" w:h="15840"/>
           <w:pgMar w:top="1440" w:right="1800" w:bottom="1440" w:left="1800" w:header="720" w:footer="720" w:gutter="0"/>
           <w:cols w:space="720"/>
@@ -2608,8 +2608,8 @@
     <w:p>
       <w:pPr>
         <w:sectPr>
-          <w:headerReference w:type="default" r:id="rId235"/>
-          <w:footerReference w:type="default" r:id="rId236"/>
+          <w:headerReference w:type="default" r:id="rId277"/>
+          <w:footerReference w:type="default" r:id="rId278"/>
           <w:pgSz w:w="12240" w:h="15840"/>
           <w:pgMar w:top="1440" w:right="1800" w:bottom="1440" w:left="1800" w:header="720" w:footer="720" w:gutter="0"/>
           <w:cols w:space="720"/>
@@ -3102,8 +3102,8 @@
     <w:p>
       <w:pPr>
         <w:sectPr>
-          <w:headerReference w:type="default" r:id="rId237"/>
-          <w:footerReference w:type="default" r:id="rId238"/>
+          <w:headerReference w:type="default" r:id="rId279"/>
+          <w:footerReference w:type="default" r:id="rId280"/>
           <w:pgSz w:w="12240" w:h="15840"/>
           <w:pgMar w:top="1440" w:right="1800" w:bottom="1440" w:left="1800" w:header="720" w:footer="720" w:gutter="0"/>
           <w:cols w:space="720"/>
@@ -3299,8 +3299,8 @@
     <w:p>
       <w:pPr>
         <w:sectPr>
-          <w:headerReference w:type="default" r:id="rId239"/>
-          <w:footerReference w:type="default" r:id="rId240"/>
+          <w:headerReference w:type="default" r:id="rId281"/>
+          <w:footerReference w:type="default" r:id="rId282"/>
           <w:pgSz w:w="12240" w:h="15840"/>
           <w:pgMar w:top="1440" w:right="1800" w:bottom="1440" w:left="1800" w:header="720" w:footer="720" w:gutter="0"/>
           <w:cols w:space="720"/>
@@ -6594,8 +6594,8 @@
     <w:p>
       <w:pPr>
         <w:sectPr>
-          <w:headerReference w:type="default" r:id="rId241"/>
-          <w:footerReference w:type="default" r:id="rId242"/>
+          <w:headerReference w:type="default" r:id="rId283"/>
+          <w:footerReference w:type="default" r:id="rId284"/>
           <w:pgSz w:w="12240" w:h="15840"/>
           <w:pgMar w:top="1440" w:right="1800" w:bottom="1440" w:left="1800" w:header="720" w:footer="720" w:gutter="0"/>
           <w:cols w:space="720"/>
@@ -7173,8 +7173,8 @@
     <w:p>
       <w:pPr>
         <w:sectPr>
-          <w:headerReference w:type="default" r:id="rId243"/>
-          <w:footerReference w:type="default" r:id="rId244"/>
+          <w:headerReference w:type="default" r:id="rId285"/>
+          <w:footerReference w:type="default" r:id="rId286"/>
           <w:pgSz w:w="12240" w:h="15840"/>
           <w:pgMar w:top="1440" w:right="1800" w:bottom="1440" w:left="1800" w:header="720" w:footer="720" w:gutter="0"/>
           <w:cols w:space="720"/>
@@ -7226,7 +7226,7 @@
           <w:rFonts w:ascii="Arial" w:hAnsi="Arial"/>
           <w:sz w:val="22"/>
         </w:rPr>
-        <w:t>The Rule Scheduler changes display settings automatically by time of day and day of the week. It replaces the three Period Overrides and the Override Mode switch of earlier firmware. Up to 58 rules can be stored on a clock with PSRAM, or 6 on a clock without it. If a saved schedule is longer than the limit (for example after a firmware update), only the first rules, at the top of the list, are kept. Each rule combines a time window, an optional day filter, and one or more settings to apply during that window; settings a rule does not mention keep their saved values. The most common use is to dim or turn off the display during sleeping hours.</w:t>
+        <w:t>The Rule Scheduler changes display settings automatically by time of day and day of the week. It replaces the three Period Overrides and the Override Mode switch of earlier firmware. The maximum number of rules depends on the model and firmware version. When the list is full, the Rule Editor refuses a new rule. If a saved schedule is longer than the limit (for example after a firmware update), only the rules at the top of the list are kept. Each rule combines a time window, an optional day filter, and one or more settings to apply during that window; settings a rule does not mention keep their saved values. The most common use is to dim or turn off the display during sleeping hours.</w:t>
       </w:r>
     </w:p>
     <w:p>
@@ -8150,8 +8150,8 @@
     <w:p>
       <w:pPr>
         <w:sectPr>
-          <w:headerReference w:type="default" r:id="rId245"/>
-          <w:footerReference w:type="default" r:id="rId246"/>
+          <w:headerReference w:type="default" r:id="rId287"/>
+          <w:footerReference w:type="default" r:id="rId288"/>
           <w:pgSz w:w="12240" w:h="15840"/>
           <w:pgMar w:top="1440" w:right="1800" w:bottom="1440" w:left="1800" w:header="720" w:footer="720" w:gutter="0"/>
           <w:cols w:space="720"/>
@@ -8962,8 +8962,8 @@
     <w:p>
       <w:pPr>
         <w:sectPr>
-          <w:headerReference w:type="default" r:id="rId247"/>
-          <w:footerReference w:type="default" r:id="rId248"/>
+          <w:headerReference w:type="default" r:id="rId289"/>
+          <w:footerReference w:type="default" r:id="rId290"/>
           <w:pgSz w:w="12240" w:h="15840"/>
           <w:pgMar w:top="1440" w:right="1800" w:bottom="1440" w:left="1800" w:header="720" w:footer="720" w:gutter="0"/>
           <w:cols w:space="720"/>
@@ -9288,8 +9288,8 @@
     <w:p>
       <w:pPr>
         <w:sectPr>
-          <w:headerReference w:type="default" r:id="rId249"/>
-          <w:footerReference w:type="default" r:id="rId250"/>
+          <w:headerReference w:type="default" r:id="rId291"/>
+          <w:footerReference w:type="default" r:id="rId292"/>
           <w:pgSz w:w="12240" w:h="15840"/>
           <w:pgMar w:top="1440" w:right="1800" w:bottom="1440" w:left="1800" w:header="720" w:footer="720" w:gutter="0"/>
           <w:cols w:space="720"/>
@@ -9490,8 +9490,8 @@
     <w:p>
       <w:pPr>
         <w:sectPr>
-          <w:headerReference w:type="default" r:id="rId251"/>
-          <w:footerReference w:type="default" r:id="rId252"/>
+          <w:headerReference w:type="default" r:id="rId293"/>
+          <w:footerReference w:type="default" r:id="rId294"/>
           <w:pgSz w:w="12240" w:h="15840"/>
           <w:pgMar w:top="1440" w:right="1800" w:bottom="1440" w:left="1800" w:header="720" w:footer="720" w:gutter="0"/>
           <w:cols w:space="720"/>
@@ -9915,8 +9915,8 @@
     <w:p>
       <w:pPr>
         <w:sectPr>
-          <w:headerReference w:type="default" r:id="rId253"/>
-          <w:footerReference w:type="default" r:id="rId254"/>
+          <w:headerReference w:type="default" r:id="rId295"/>
+          <w:footerReference w:type="default" r:id="rId296"/>
           <w:pgSz w:w="12240" w:h="15840"/>
           <w:pgMar w:top="1440" w:right="1800" w:bottom="1440" w:left="1800" w:header="720" w:footer="720" w:gutter="0"/>
           <w:cols w:space="720"/>
@@ -10070,8 +10070,8 @@
     <w:p>
       <w:pPr>
         <w:sectPr>
-          <w:headerReference w:type="default" r:id="rId255"/>
-          <w:footerReference w:type="default" r:id="rId256"/>
+          <w:headerReference w:type="default" r:id="rId297"/>
+          <w:footerReference w:type="default" r:id="rId298"/>
           <w:pgSz w:w="12240" w:h="15840"/>
           <w:pgMar w:top="1440" w:right="1800" w:bottom="1440" w:left="1800" w:header="720" w:footer="720" w:gutter="0"/>
           <w:cols w:space="720"/>
@@ -10196,8 +10196,8 @@
     <w:p>
       <w:pPr>
         <w:sectPr>
-          <w:headerReference w:type="default" r:id="rId257"/>
-          <w:footerReference w:type="default" r:id="rId258"/>
+          <w:headerReference w:type="default" r:id="rId299"/>
+          <w:footerReference w:type="default" r:id="rId300"/>
           <w:pgSz w:w="12240" w:h="15840"/>
           <w:pgMar w:top="1440" w:right="1800" w:bottom="1440" w:left="1800" w:header="720" w:footer="720" w:gutter="0"/>
           <w:cols w:space="720"/>
@@ -10809,8 +10809,8 @@
     <w:p>
       <w:pPr>
         <w:sectPr>
-          <w:headerReference w:type="default" r:id="rId259"/>
-          <w:footerReference w:type="default" r:id="rId260"/>
+          <w:headerReference w:type="default" r:id="rId301"/>
+          <w:footerReference w:type="default" r:id="rId302"/>
           <w:pgSz w:w="12240" w:h="15840"/>
           <w:pgMar w:top="1440" w:right="1800" w:bottom="1440" w:left="1800" w:header="720" w:footer="720" w:gutter="0"/>
           <w:cols w:space="720"/>
@@ -10931,8 +10931,8 @@
     <w:p>
       <w:pPr>
         <w:sectPr>
-          <w:headerReference w:type="default" r:id="rId261"/>
-          <w:footerReference w:type="default" r:id="rId262"/>
+          <w:headerReference w:type="default" r:id="rId303"/>
+          <w:footerReference w:type="default" r:id="rId304"/>
           <w:pgSz w:w="12240" w:h="15840"/>
           <w:pgMar w:top="1440" w:right="1800" w:bottom="1440" w:left="1800" w:header="720" w:footer="720" w:gutter="0"/>
           <w:cols w:space="720"/>
@@ -11725,8 +11725,8 @@
     <w:p>
       <w:pPr>
         <w:sectPr>
-          <w:headerReference w:type="default" r:id="rId263"/>
-          <w:footerReference w:type="default" r:id="rId264"/>
+          <w:headerReference w:type="default" r:id="rId305"/>
+          <w:footerReference w:type="default" r:id="rId306"/>
           <w:pgSz w:w="12240" w:h="15840"/>
           <w:pgMar w:top="1440" w:right="1800" w:bottom="1440" w:left="1800" w:header="720" w:footer="720" w:gutter="0"/>
           <w:cols w:space="720"/>
@@ -12941,8 +12941,8 @@
     <w:p>
       <w:pPr>
         <w:sectPr>
-          <w:headerReference w:type="default" r:id="rId265"/>
-          <w:footerReference w:type="default" r:id="rId266"/>
+          <w:headerReference w:type="default" r:id="rId307"/>
+          <w:footerReference w:type="default" r:id="rId308"/>
           <w:pgSz w:w="12240" w:h="15840"/>
           <w:pgMar w:top="1440" w:right="1800" w:bottom="1440" w:left="1800" w:header="720" w:footer="720" w:gutter="0"/>
           <w:cols w:space="720"/>
@@ -13034,8 +13034,8 @@
       </w:r>
     </w:p>
     <w:sectPr>
-      <w:headerReference w:type="default" r:id="rId267"/>
-      <w:footerReference w:type="default" r:id="rId268"/>
+      <w:headerReference w:type="default" r:id="rId309"/>
+      <w:footerReference w:type="default" r:id="rId310"/>
       <w:pgSz w:w="12240" w:h="15840"/>
       <w:pgMar w:top="1440" w:right="1800" w:bottom="1440" w:left="1800" w:header="720" w:footer="720" w:gutter="0"/>
       <w:cols w:space="720"/>
@@ -14556,13 +14556,99 @@
       </w:pBdr>
     </w:pPr>
     <w:r/>
-    <w:r>
-      <w:rPr>
-        <w:rFonts w:ascii="Arial" w:hAnsi="Arial"/>
-        <w:color w:val="555555"/>
-        <w:sz w:val="20"/>
-      </w:rPr>
-      <w:t>Revision 4 — October 2026</w:t>
+  </w:p>
+</w:ftr>
+</file>
+
+<file path=word/footer128.xml><?xml version="1.0" encoding="utf-8"?>
+<w:ftr xmlns:m="http://schemas.openxmlformats.org/officeDocument/2006/math" xmlns:mc="http://schemas.openxmlformats.org/markup-compatibility/2006" xmlns:mo="http://schemas.microsoft.com/office/mac/office/2008/main" xmlns:mv="urn:schemas-microsoft-com:mac:vml" xmlns:o="urn:schemas-microsoft-com:office:office" xmlns:r="http://schemas.openxmlformats.org/officeDocument/2006/relationships" xmlns:v="urn:schemas-microsoft-com:vml" xmlns:w10="urn:schemas-microsoft-com:office:word" xmlns:w14="http://schemas.microsoft.com/office/word/2010/wordml" xmlns:w="http://schemas.openxmlformats.org/wordprocessingml/2006/main" xmlns:wne="http://schemas.microsoft.com/office/word/2006/wordml" xmlns:wp14="http://schemas.microsoft.com/office/word/2010/wordprocessingDrawing" xmlns:wp="http://schemas.openxmlformats.org/drawingml/2006/wordprocessingDrawing" xmlns:wpc="http://schemas.microsoft.com/office/word/2010/wordprocessingCanvas" xmlns:wpg="http://schemas.microsoft.com/office/word/2010/wordprocessingGroup" xmlns:wpi="http://schemas.microsoft.com/office/word/2010/wordprocessingInk" xmlns:wps="http://schemas.microsoft.com/office/word/2010/wordprocessingShape" mc:Ignorable="w14 wp14">
+  <w:p>
+    <w:pPr>
+      <w:pStyle w:val="Footer"/>
+      <w:spacing w:before="40"/>
+      <w:jc w:val="left"/>
+      <w:pBdr>
+        <w:top w:val="single" w:sz="4" w:space="2" w:color="808080"/>
+      </w:pBdr>
+    </w:pPr>
+    <w:r/>
+    <w:r>
+      <w:rPr>
+        <w:rFonts w:ascii="Arial" w:hAnsi="Arial"/>
+        <w:color w:val="555555"/>
+        <w:sz w:val="20"/>
+      </w:rPr>
+      <w:t>Revision 5 — October 2026</w:t>
+    </w:r>
+    <w:r>
+      <w:rPr>
+        <w:rFonts w:ascii="Arial" w:hAnsi="Arial"/>
+      </w:rPr>
+      <w:tab/>
+      <w:tab/>
+    </w:r>
+    <w:r>
+      <w:rPr>
+        <w:rFonts w:ascii="Arial" w:hAnsi="Arial"/>
+        <w:color w:val="555555"/>
+        <w:sz w:val="20"/>
+      </w:rPr>
+      <w:fldChar w:fldCharType="begin"/>
+      <w:instrText xml:space="preserve"> PAGE </w:instrText>
+      <w:fldChar w:fldCharType="separate"/>
+      <w:t>1</w:t>
+      <w:fldChar w:fldCharType="end"/>
+    </w:r>
+  </w:p>
+</w:ftr>
+</file>
+
+<file path=word/footer129.xml><?xml version="1.0" encoding="utf-8"?>
+<w:ftr xmlns:m="http://schemas.openxmlformats.org/officeDocument/2006/math" xmlns:mc="http://schemas.openxmlformats.org/markup-compatibility/2006" xmlns:mo="http://schemas.microsoft.com/office/mac/office/2008/main" xmlns:mv="urn:schemas-microsoft-com:mac:vml" xmlns:o="urn:schemas-microsoft-com:office:office" xmlns:r="http://schemas.openxmlformats.org/officeDocument/2006/relationships" xmlns:v="urn:schemas-microsoft-com:vml" xmlns:w10="urn:schemas-microsoft-com:office:word" xmlns:w14="http://schemas.microsoft.com/office/word/2010/wordml" xmlns:w="http://schemas.openxmlformats.org/wordprocessingml/2006/main" xmlns:wne="http://schemas.microsoft.com/office/word/2006/wordml" xmlns:wp14="http://schemas.microsoft.com/office/word/2010/wordprocessingDrawing" xmlns:wp="http://schemas.openxmlformats.org/drawingml/2006/wordprocessingDrawing" xmlns:wpc="http://schemas.microsoft.com/office/word/2010/wordprocessingCanvas" xmlns:wpg="http://schemas.microsoft.com/office/word/2010/wordprocessingGroup" xmlns:wpi="http://schemas.microsoft.com/office/word/2010/wordprocessingInk" xmlns:wps="http://schemas.microsoft.com/office/word/2010/wordprocessingShape" mc:Ignorable="w14 wp14">
+  <w:p>
+    <w:pPr>
+      <w:pStyle w:val="Footer"/>
+      <w:spacing w:before="40"/>
+      <w:jc w:val="left"/>
+      <w:pBdr>
+        <w:top w:val="single" w:sz="4" w:space="2" w:color="808080"/>
+      </w:pBdr>
+    </w:pPr>
+    <w:r/>
+    <w:r>
+      <w:rPr>
+        <w:rFonts w:ascii="Arial" w:hAnsi="Arial"/>
+        <w:color w:val="555555"/>
+        <w:sz w:val="20"/>
+      </w:rPr>
+      <w:t>Revision 5 — October 2026</w:t>
+    </w:r>
+    <w:r>
+      <w:rPr>
+        <w:rFonts w:ascii="Arial" w:hAnsi="Arial"/>
+      </w:rPr>
+      <w:tab/>
+      <w:tab/>
+    </w:r>
+    <w:r>
+      <w:rPr>
+        <w:rFonts w:ascii="Arial" w:hAnsi="Arial"/>
+        <w:color w:val="555555"/>
+        <w:sz w:val="20"/>
+      </w:rPr>
+      <w:t>QS-</w:t>
+    </w:r>
+    <w:r>
+      <w:rPr>
+        <w:rFonts w:ascii="Arial" w:hAnsi="Arial"/>
+        <w:color w:val="555555"/>
+        <w:sz w:val="20"/>
+      </w:rPr>
+      <w:fldChar w:fldCharType="begin"/>
+      <w:instrText xml:space="preserve"> PAGE </w:instrText>
+      <w:fldChar w:fldCharType="separate"/>
+      <w:t>1</w:t>
+      <w:fldChar w:fldCharType="end"/>
     </w:r>
   </w:p>
 </w:ftr>
@@ -14619,7 +14705,7 @@
 </w:ftr>
 </file>
 
-<file path=word/footer14.xml><?xml version="1.0" encoding="utf-8"?>
+<file path=word/footer130.xml><?xml version="1.0" encoding="utf-8"?>
 <w:ftr xmlns:m="http://schemas.openxmlformats.org/officeDocument/2006/math" xmlns:mc="http://schemas.openxmlformats.org/markup-compatibility/2006" xmlns:mo="http://schemas.microsoft.com/office/mac/office/2008/main" xmlns:mv="urn:schemas-microsoft-com:mac:vml" xmlns:o="urn:schemas-microsoft-com:office:office" xmlns:r="http://schemas.openxmlformats.org/officeDocument/2006/relationships" xmlns:v="urn:schemas-microsoft-com:vml" xmlns:w10="urn:schemas-microsoft-com:office:word" xmlns:w14="http://schemas.microsoft.com/office/word/2010/wordml" xmlns:w="http://schemas.openxmlformats.org/wordprocessingml/2006/main" xmlns:wne="http://schemas.microsoft.com/office/word/2006/wordml" xmlns:wp14="http://schemas.microsoft.com/office/word/2010/wordprocessingDrawing" xmlns:wp="http://schemas.openxmlformats.org/drawingml/2006/wordprocessingDrawing" xmlns:wpc="http://schemas.microsoft.com/office/word/2010/wordprocessingCanvas" xmlns:wpg="http://schemas.microsoft.com/office/word/2010/wordprocessingGroup" xmlns:wpi="http://schemas.microsoft.com/office/word/2010/wordprocessingInk" xmlns:wps="http://schemas.microsoft.com/office/word/2010/wordprocessingShape" mc:Ignorable="w14 wp14">
   <w:p>
     <w:pPr>
@@ -14637,7 +14723,7 @@
         <w:color w:val="555555"/>
         <w:sz w:val="20"/>
       </w:rPr>
-      <w:t>Revision 1 — April 2026</w:t>
+      <w:t>Revision 5 — October 2026</w:t>
     </w:r>
     <w:r>
       <w:rPr>
@@ -14652,7 +14738,7 @@
         <w:color w:val="555555"/>
         <w:sz w:val="20"/>
       </w:rPr>
-      <w:t>11-</w:t>
+      <w:t>1-</w:t>
     </w:r>
     <w:r>
       <w:rPr>
@@ -14665,6 +14751,948 @@
       <w:fldChar w:fldCharType="separate"/>
       <w:t>1</w:t>
       <w:fldChar w:fldCharType="end"/>
+    </w:r>
+  </w:p>
+</w:ftr>
+</file>
+
+<file path=word/footer131.xml><?xml version="1.0" encoding="utf-8"?>
+<w:ftr xmlns:m="http://schemas.openxmlformats.org/officeDocument/2006/math" xmlns:mc="http://schemas.openxmlformats.org/markup-compatibility/2006" xmlns:mo="http://schemas.microsoft.com/office/mac/office/2008/main" xmlns:mv="urn:schemas-microsoft-com:mac:vml" xmlns:o="urn:schemas-microsoft-com:office:office" xmlns:r="http://schemas.openxmlformats.org/officeDocument/2006/relationships" xmlns:v="urn:schemas-microsoft-com:vml" xmlns:w10="urn:schemas-microsoft-com:office:word" xmlns:w14="http://schemas.microsoft.com/office/word/2010/wordml" xmlns:w="http://schemas.openxmlformats.org/wordprocessingml/2006/main" xmlns:wne="http://schemas.microsoft.com/office/word/2006/wordml" xmlns:wp14="http://schemas.microsoft.com/office/word/2010/wordprocessingDrawing" xmlns:wp="http://schemas.openxmlformats.org/drawingml/2006/wordprocessingDrawing" xmlns:wpc="http://schemas.microsoft.com/office/word/2010/wordprocessingCanvas" xmlns:wpg="http://schemas.microsoft.com/office/word/2010/wordprocessingGroup" xmlns:wpi="http://schemas.microsoft.com/office/word/2010/wordprocessingInk" xmlns:wps="http://schemas.microsoft.com/office/word/2010/wordprocessingShape" mc:Ignorable="w14 wp14">
+  <w:p>
+    <w:pPr>
+      <w:pStyle w:val="Footer"/>
+      <w:spacing w:before="40"/>
+      <w:jc w:val="left"/>
+      <w:pBdr>
+        <w:top w:val="single" w:sz="4" w:space="2" w:color="808080"/>
+      </w:pBdr>
+    </w:pPr>
+    <w:r/>
+    <w:r>
+      <w:rPr>
+        <w:rFonts w:ascii="Arial" w:hAnsi="Arial"/>
+        <w:color w:val="555555"/>
+        <w:sz w:val="20"/>
+      </w:rPr>
+      <w:t>Revision 5 — October 2026</w:t>
+    </w:r>
+    <w:r>
+      <w:rPr>
+        <w:rFonts w:ascii="Arial" w:hAnsi="Arial"/>
+      </w:rPr>
+      <w:tab/>
+      <w:tab/>
+    </w:r>
+    <w:r>
+      <w:rPr>
+        <w:rFonts w:ascii="Arial" w:hAnsi="Arial"/>
+        <w:color w:val="555555"/>
+        <w:sz w:val="20"/>
+      </w:rPr>
+      <w:t>2-</w:t>
+    </w:r>
+    <w:r>
+      <w:rPr>
+        <w:rFonts w:ascii="Arial" w:hAnsi="Arial"/>
+        <w:color w:val="555555"/>
+        <w:sz w:val="20"/>
+      </w:rPr>
+      <w:fldChar w:fldCharType="begin"/>
+      <w:instrText xml:space="preserve"> PAGE </w:instrText>
+      <w:fldChar w:fldCharType="separate"/>
+      <w:t>1</w:t>
+      <w:fldChar w:fldCharType="end"/>
+    </w:r>
+  </w:p>
+</w:ftr>
+</file>
+
+<file path=word/footer132.xml><?xml version="1.0" encoding="utf-8"?>
+<w:ftr xmlns:m="http://schemas.openxmlformats.org/officeDocument/2006/math" xmlns:mc="http://schemas.openxmlformats.org/markup-compatibility/2006" xmlns:mo="http://schemas.microsoft.com/office/mac/office/2008/main" xmlns:mv="urn:schemas-microsoft-com:mac:vml" xmlns:o="urn:schemas-microsoft-com:office:office" xmlns:r="http://schemas.openxmlformats.org/officeDocument/2006/relationships" xmlns:v="urn:schemas-microsoft-com:vml" xmlns:w10="urn:schemas-microsoft-com:office:word" xmlns:w14="http://schemas.microsoft.com/office/word/2010/wordml" xmlns:w="http://schemas.openxmlformats.org/wordprocessingml/2006/main" xmlns:wne="http://schemas.microsoft.com/office/word/2006/wordml" xmlns:wp14="http://schemas.microsoft.com/office/word/2010/wordprocessingDrawing" xmlns:wp="http://schemas.openxmlformats.org/drawingml/2006/wordprocessingDrawing" xmlns:wpc="http://schemas.microsoft.com/office/word/2010/wordprocessingCanvas" xmlns:wpg="http://schemas.microsoft.com/office/word/2010/wordprocessingGroup" xmlns:wpi="http://schemas.microsoft.com/office/word/2010/wordprocessingInk" xmlns:wps="http://schemas.microsoft.com/office/word/2010/wordprocessingShape" mc:Ignorable="w14 wp14">
+  <w:p>
+    <w:pPr>
+      <w:pStyle w:val="Footer"/>
+      <w:spacing w:before="40"/>
+      <w:jc w:val="left"/>
+      <w:pBdr>
+        <w:top w:val="single" w:sz="4" w:space="2" w:color="808080"/>
+      </w:pBdr>
+    </w:pPr>
+    <w:r/>
+    <w:r>
+      <w:rPr>
+        <w:rFonts w:ascii="Arial" w:hAnsi="Arial"/>
+        <w:color w:val="555555"/>
+        <w:sz w:val="20"/>
+      </w:rPr>
+      <w:t>Revision 5 — October 2026</w:t>
+    </w:r>
+    <w:r>
+      <w:rPr>
+        <w:rFonts w:ascii="Arial" w:hAnsi="Arial"/>
+      </w:rPr>
+      <w:tab/>
+      <w:tab/>
+    </w:r>
+    <w:r>
+      <w:rPr>
+        <w:rFonts w:ascii="Arial" w:hAnsi="Arial"/>
+        <w:color w:val="555555"/>
+        <w:sz w:val="20"/>
+      </w:rPr>
+      <w:t>3-</w:t>
+    </w:r>
+    <w:r>
+      <w:rPr>
+        <w:rFonts w:ascii="Arial" w:hAnsi="Arial"/>
+        <w:color w:val="555555"/>
+        <w:sz w:val="20"/>
+      </w:rPr>
+      <w:fldChar w:fldCharType="begin"/>
+      <w:instrText xml:space="preserve"> PAGE </w:instrText>
+      <w:fldChar w:fldCharType="separate"/>
+      <w:t>1</w:t>
+      <w:fldChar w:fldCharType="end"/>
+    </w:r>
+  </w:p>
+</w:ftr>
+</file>
+
+<file path=word/footer133.xml><?xml version="1.0" encoding="utf-8"?>
+<w:ftr xmlns:m="http://schemas.openxmlformats.org/officeDocument/2006/math" xmlns:mc="http://schemas.openxmlformats.org/markup-compatibility/2006" xmlns:mo="http://schemas.microsoft.com/office/mac/office/2008/main" xmlns:mv="urn:schemas-microsoft-com:mac:vml" xmlns:o="urn:schemas-microsoft-com:office:office" xmlns:r="http://schemas.openxmlformats.org/officeDocument/2006/relationships" xmlns:v="urn:schemas-microsoft-com:vml" xmlns:w10="urn:schemas-microsoft-com:office:word" xmlns:w14="http://schemas.microsoft.com/office/word/2010/wordml" xmlns:w="http://schemas.openxmlformats.org/wordprocessingml/2006/main" xmlns:wne="http://schemas.microsoft.com/office/word/2006/wordml" xmlns:wp14="http://schemas.microsoft.com/office/word/2010/wordprocessingDrawing" xmlns:wp="http://schemas.openxmlformats.org/drawingml/2006/wordprocessingDrawing" xmlns:wpc="http://schemas.microsoft.com/office/word/2010/wordprocessingCanvas" xmlns:wpg="http://schemas.microsoft.com/office/word/2010/wordprocessingGroup" xmlns:wpi="http://schemas.microsoft.com/office/word/2010/wordprocessingInk" xmlns:wps="http://schemas.microsoft.com/office/word/2010/wordprocessingShape" mc:Ignorable="w14 wp14">
+  <w:p>
+    <w:pPr>
+      <w:pStyle w:val="Footer"/>
+      <w:spacing w:before="40"/>
+      <w:jc w:val="left"/>
+      <w:pBdr>
+        <w:top w:val="single" w:sz="4" w:space="2" w:color="808080"/>
+      </w:pBdr>
+    </w:pPr>
+    <w:r/>
+    <w:r>
+      <w:rPr>
+        <w:rFonts w:ascii="Arial" w:hAnsi="Arial"/>
+        <w:color w:val="555555"/>
+        <w:sz w:val="20"/>
+      </w:rPr>
+      <w:t>Revision 5 — October 2026</w:t>
+    </w:r>
+    <w:r>
+      <w:rPr>
+        <w:rFonts w:ascii="Arial" w:hAnsi="Arial"/>
+      </w:rPr>
+      <w:tab/>
+      <w:tab/>
+    </w:r>
+    <w:r>
+      <w:rPr>
+        <w:rFonts w:ascii="Arial" w:hAnsi="Arial"/>
+        <w:color w:val="555555"/>
+        <w:sz w:val="20"/>
+      </w:rPr>
+      <w:t>4-</w:t>
+    </w:r>
+    <w:r>
+      <w:rPr>
+        <w:rFonts w:ascii="Arial" w:hAnsi="Arial"/>
+        <w:color w:val="555555"/>
+        <w:sz w:val="20"/>
+      </w:rPr>
+      <w:fldChar w:fldCharType="begin"/>
+      <w:instrText xml:space="preserve"> PAGE </w:instrText>
+      <w:fldChar w:fldCharType="separate"/>
+      <w:t>1</w:t>
+      <w:fldChar w:fldCharType="end"/>
+    </w:r>
+  </w:p>
+</w:ftr>
+</file>
+
+<file path=word/footer134.xml><?xml version="1.0" encoding="utf-8"?>
+<w:ftr xmlns:m="http://schemas.openxmlformats.org/officeDocument/2006/math" xmlns:mc="http://schemas.openxmlformats.org/markup-compatibility/2006" xmlns:mo="http://schemas.microsoft.com/office/mac/office/2008/main" xmlns:mv="urn:schemas-microsoft-com:mac:vml" xmlns:o="urn:schemas-microsoft-com:office:office" xmlns:r="http://schemas.openxmlformats.org/officeDocument/2006/relationships" xmlns:v="urn:schemas-microsoft-com:vml" xmlns:w10="urn:schemas-microsoft-com:office:word" xmlns:w14="http://schemas.microsoft.com/office/word/2010/wordml" xmlns:w="http://schemas.openxmlformats.org/wordprocessingml/2006/main" xmlns:wne="http://schemas.microsoft.com/office/word/2006/wordml" xmlns:wp14="http://schemas.microsoft.com/office/word/2010/wordprocessingDrawing" xmlns:wp="http://schemas.openxmlformats.org/drawingml/2006/wordprocessingDrawing" xmlns:wpc="http://schemas.microsoft.com/office/word/2010/wordprocessingCanvas" xmlns:wpg="http://schemas.microsoft.com/office/word/2010/wordprocessingGroup" xmlns:wpi="http://schemas.microsoft.com/office/word/2010/wordprocessingInk" xmlns:wps="http://schemas.microsoft.com/office/word/2010/wordprocessingShape" mc:Ignorable="w14 wp14">
+  <w:p>
+    <w:pPr>
+      <w:pStyle w:val="Footer"/>
+      <w:spacing w:before="40"/>
+      <w:jc w:val="left"/>
+      <w:pBdr>
+        <w:top w:val="single" w:sz="4" w:space="2" w:color="808080"/>
+      </w:pBdr>
+    </w:pPr>
+    <w:r/>
+    <w:r>
+      <w:rPr>
+        <w:rFonts w:ascii="Arial" w:hAnsi="Arial"/>
+        <w:color w:val="555555"/>
+        <w:sz w:val="20"/>
+      </w:rPr>
+      <w:t>Revision 5 — October 2026</w:t>
+    </w:r>
+    <w:r>
+      <w:rPr>
+        <w:rFonts w:ascii="Arial" w:hAnsi="Arial"/>
+      </w:rPr>
+      <w:tab/>
+      <w:tab/>
+    </w:r>
+    <w:r>
+      <w:rPr>
+        <w:rFonts w:ascii="Arial" w:hAnsi="Arial"/>
+        <w:color w:val="555555"/>
+        <w:sz w:val="20"/>
+      </w:rPr>
+      <w:t>5-</w:t>
+    </w:r>
+    <w:r>
+      <w:rPr>
+        <w:rFonts w:ascii="Arial" w:hAnsi="Arial"/>
+        <w:color w:val="555555"/>
+        <w:sz w:val="20"/>
+      </w:rPr>
+      <w:fldChar w:fldCharType="begin"/>
+      <w:instrText xml:space="preserve"> PAGE </w:instrText>
+      <w:fldChar w:fldCharType="separate"/>
+      <w:t>1</w:t>
+      <w:fldChar w:fldCharType="end"/>
+    </w:r>
+  </w:p>
+</w:ftr>
+</file>
+
+<file path=word/footer135.xml><?xml version="1.0" encoding="utf-8"?>
+<w:ftr xmlns:m="http://schemas.openxmlformats.org/officeDocument/2006/math" xmlns:mc="http://schemas.openxmlformats.org/markup-compatibility/2006" xmlns:mo="http://schemas.microsoft.com/office/mac/office/2008/main" xmlns:mv="urn:schemas-microsoft-com:mac:vml" xmlns:o="urn:schemas-microsoft-com:office:office" xmlns:r="http://schemas.openxmlformats.org/officeDocument/2006/relationships" xmlns:v="urn:schemas-microsoft-com:vml" xmlns:w10="urn:schemas-microsoft-com:office:word" xmlns:w14="http://schemas.microsoft.com/office/word/2010/wordml" xmlns:w="http://schemas.openxmlformats.org/wordprocessingml/2006/main" xmlns:wne="http://schemas.microsoft.com/office/word/2006/wordml" xmlns:wp14="http://schemas.microsoft.com/office/word/2010/wordprocessingDrawing" xmlns:wp="http://schemas.openxmlformats.org/drawingml/2006/wordprocessingDrawing" xmlns:wpc="http://schemas.microsoft.com/office/word/2010/wordprocessingCanvas" xmlns:wpg="http://schemas.microsoft.com/office/word/2010/wordprocessingGroup" xmlns:wpi="http://schemas.microsoft.com/office/word/2010/wordprocessingInk" xmlns:wps="http://schemas.microsoft.com/office/word/2010/wordprocessingShape" mc:Ignorable="w14 wp14">
+  <w:p>
+    <w:pPr>
+      <w:pStyle w:val="Footer"/>
+      <w:spacing w:before="40"/>
+      <w:jc w:val="left"/>
+      <w:pBdr>
+        <w:top w:val="single" w:sz="4" w:space="2" w:color="808080"/>
+      </w:pBdr>
+    </w:pPr>
+    <w:r/>
+    <w:r>
+      <w:rPr>
+        <w:rFonts w:ascii="Arial" w:hAnsi="Arial"/>
+        <w:color w:val="555555"/>
+        <w:sz w:val="20"/>
+      </w:rPr>
+      <w:t>Revision 5 — October 2026</w:t>
+    </w:r>
+    <w:r>
+      <w:rPr>
+        <w:rFonts w:ascii="Arial" w:hAnsi="Arial"/>
+      </w:rPr>
+      <w:tab/>
+      <w:tab/>
+    </w:r>
+    <w:r>
+      <w:rPr>
+        <w:rFonts w:ascii="Arial" w:hAnsi="Arial"/>
+        <w:color w:val="555555"/>
+        <w:sz w:val="20"/>
+      </w:rPr>
+      <w:t>6-</w:t>
+    </w:r>
+    <w:r>
+      <w:rPr>
+        <w:rFonts w:ascii="Arial" w:hAnsi="Arial"/>
+        <w:color w:val="555555"/>
+        <w:sz w:val="20"/>
+      </w:rPr>
+      <w:fldChar w:fldCharType="begin"/>
+      <w:instrText xml:space="preserve"> PAGE </w:instrText>
+      <w:fldChar w:fldCharType="separate"/>
+      <w:t>1</w:t>
+      <w:fldChar w:fldCharType="end"/>
+    </w:r>
+  </w:p>
+</w:ftr>
+</file>
+
+<file path=word/footer136.xml><?xml version="1.0" encoding="utf-8"?>
+<w:ftr xmlns:m="http://schemas.openxmlformats.org/officeDocument/2006/math" xmlns:mc="http://schemas.openxmlformats.org/markup-compatibility/2006" xmlns:mo="http://schemas.microsoft.com/office/mac/office/2008/main" xmlns:mv="urn:schemas-microsoft-com:mac:vml" xmlns:o="urn:schemas-microsoft-com:office:office" xmlns:r="http://schemas.openxmlformats.org/officeDocument/2006/relationships" xmlns:v="urn:schemas-microsoft-com:vml" xmlns:w10="urn:schemas-microsoft-com:office:word" xmlns:w14="http://schemas.microsoft.com/office/word/2010/wordml" xmlns:w="http://schemas.openxmlformats.org/wordprocessingml/2006/main" xmlns:wne="http://schemas.microsoft.com/office/word/2006/wordml" xmlns:wp14="http://schemas.microsoft.com/office/word/2010/wordprocessingDrawing" xmlns:wp="http://schemas.openxmlformats.org/drawingml/2006/wordprocessingDrawing" xmlns:wpc="http://schemas.microsoft.com/office/word/2010/wordprocessingCanvas" xmlns:wpg="http://schemas.microsoft.com/office/word/2010/wordprocessingGroup" xmlns:wpi="http://schemas.microsoft.com/office/word/2010/wordprocessingInk" xmlns:wps="http://schemas.microsoft.com/office/word/2010/wordprocessingShape" mc:Ignorable="w14 wp14">
+  <w:p>
+    <w:pPr>
+      <w:pStyle w:val="Footer"/>
+      <w:spacing w:before="40"/>
+      <w:jc w:val="left"/>
+      <w:pBdr>
+        <w:top w:val="single" w:sz="4" w:space="2" w:color="808080"/>
+      </w:pBdr>
+    </w:pPr>
+    <w:r/>
+    <w:r>
+      <w:rPr>
+        <w:rFonts w:ascii="Arial" w:hAnsi="Arial"/>
+        <w:color w:val="555555"/>
+        <w:sz w:val="20"/>
+      </w:rPr>
+      <w:t>Revision 5 — October 2026</w:t>
+    </w:r>
+    <w:r>
+      <w:rPr>
+        <w:rFonts w:ascii="Arial" w:hAnsi="Arial"/>
+      </w:rPr>
+      <w:tab/>
+      <w:tab/>
+    </w:r>
+    <w:r>
+      <w:rPr>
+        <w:rFonts w:ascii="Arial" w:hAnsi="Arial"/>
+        <w:color w:val="555555"/>
+        <w:sz w:val="20"/>
+      </w:rPr>
+      <w:t>7-</w:t>
+    </w:r>
+    <w:r>
+      <w:rPr>
+        <w:rFonts w:ascii="Arial" w:hAnsi="Arial"/>
+        <w:color w:val="555555"/>
+        <w:sz w:val="20"/>
+      </w:rPr>
+      <w:fldChar w:fldCharType="begin"/>
+      <w:instrText xml:space="preserve"> PAGE </w:instrText>
+      <w:fldChar w:fldCharType="separate"/>
+      <w:t>1</w:t>
+      <w:fldChar w:fldCharType="end"/>
+    </w:r>
+  </w:p>
+</w:ftr>
+</file>
+
+<file path=word/footer137.xml><?xml version="1.0" encoding="utf-8"?>
+<w:ftr xmlns:m="http://schemas.openxmlformats.org/officeDocument/2006/math" xmlns:mc="http://schemas.openxmlformats.org/markup-compatibility/2006" xmlns:mo="http://schemas.microsoft.com/office/mac/office/2008/main" xmlns:mv="urn:schemas-microsoft-com:mac:vml" xmlns:o="urn:schemas-microsoft-com:office:office" xmlns:r="http://schemas.openxmlformats.org/officeDocument/2006/relationships" xmlns:v="urn:schemas-microsoft-com:vml" xmlns:w10="urn:schemas-microsoft-com:office:word" xmlns:w14="http://schemas.microsoft.com/office/word/2010/wordml" xmlns:w="http://schemas.openxmlformats.org/wordprocessingml/2006/main" xmlns:wne="http://schemas.microsoft.com/office/word/2006/wordml" xmlns:wp14="http://schemas.microsoft.com/office/word/2010/wordprocessingDrawing" xmlns:wp="http://schemas.openxmlformats.org/drawingml/2006/wordprocessingDrawing" xmlns:wpc="http://schemas.microsoft.com/office/word/2010/wordprocessingCanvas" xmlns:wpg="http://schemas.microsoft.com/office/word/2010/wordprocessingGroup" xmlns:wpi="http://schemas.microsoft.com/office/word/2010/wordprocessingInk" xmlns:wps="http://schemas.microsoft.com/office/word/2010/wordprocessingShape" mc:Ignorable="w14 wp14">
+  <w:p>
+    <w:pPr>
+      <w:pStyle w:val="Footer"/>
+      <w:spacing w:before="40"/>
+      <w:jc w:val="left"/>
+      <w:pBdr>
+        <w:top w:val="single" w:sz="4" w:space="2" w:color="808080"/>
+      </w:pBdr>
+    </w:pPr>
+    <w:r/>
+    <w:r>
+      <w:rPr>
+        <w:rFonts w:ascii="Arial" w:hAnsi="Arial"/>
+        <w:color w:val="555555"/>
+        <w:sz w:val="20"/>
+      </w:rPr>
+      <w:t>Revision 5 — October 2026</w:t>
+    </w:r>
+    <w:r>
+      <w:rPr>
+        <w:rFonts w:ascii="Arial" w:hAnsi="Arial"/>
+      </w:rPr>
+      <w:tab/>
+      <w:tab/>
+    </w:r>
+    <w:r>
+      <w:rPr>
+        <w:rFonts w:ascii="Arial" w:hAnsi="Arial"/>
+        <w:color w:val="555555"/>
+        <w:sz w:val="20"/>
+      </w:rPr>
+      <w:t>8-</w:t>
+    </w:r>
+    <w:r>
+      <w:rPr>
+        <w:rFonts w:ascii="Arial" w:hAnsi="Arial"/>
+        <w:color w:val="555555"/>
+        <w:sz w:val="20"/>
+      </w:rPr>
+      <w:fldChar w:fldCharType="begin"/>
+      <w:instrText xml:space="preserve"> PAGE </w:instrText>
+      <w:fldChar w:fldCharType="separate"/>
+      <w:t>1</w:t>
+      <w:fldChar w:fldCharType="end"/>
+    </w:r>
+  </w:p>
+</w:ftr>
+</file>
+
+<file path=word/footer138.xml><?xml version="1.0" encoding="utf-8"?>
+<w:ftr xmlns:m="http://schemas.openxmlformats.org/officeDocument/2006/math" xmlns:mc="http://schemas.openxmlformats.org/markup-compatibility/2006" xmlns:mo="http://schemas.microsoft.com/office/mac/office/2008/main" xmlns:mv="urn:schemas-microsoft-com:mac:vml" xmlns:o="urn:schemas-microsoft-com:office:office" xmlns:r="http://schemas.openxmlformats.org/officeDocument/2006/relationships" xmlns:v="urn:schemas-microsoft-com:vml" xmlns:w10="urn:schemas-microsoft-com:office:word" xmlns:w14="http://schemas.microsoft.com/office/word/2010/wordml" xmlns:w="http://schemas.openxmlformats.org/wordprocessingml/2006/main" xmlns:wne="http://schemas.microsoft.com/office/word/2006/wordml" xmlns:wp14="http://schemas.microsoft.com/office/word/2010/wordprocessingDrawing" xmlns:wp="http://schemas.openxmlformats.org/drawingml/2006/wordprocessingDrawing" xmlns:wpc="http://schemas.microsoft.com/office/word/2010/wordprocessingCanvas" xmlns:wpg="http://schemas.microsoft.com/office/word/2010/wordprocessingGroup" xmlns:wpi="http://schemas.microsoft.com/office/word/2010/wordprocessingInk" xmlns:wps="http://schemas.microsoft.com/office/word/2010/wordprocessingShape" mc:Ignorable="w14 wp14">
+  <w:p>
+    <w:pPr>
+      <w:pStyle w:val="Footer"/>
+      <w:spacing w:before="40"/>
+      <w:jc w:val="left"/>
+      <w:pBdr>
+        <w:top w:val="single" w:sz="4" w:space="2" w:color="808080"/>
+      </w:pBdr>
+    </w:pPr>
+    <w:r/>
+    <w:r>
+      <w:rPr>
+        <w:rFonts w:ascii="Arial" w:hAnsi="Arial"/>
+        <w:color w:val="555555"/>
+        <w:sz w:val="20"/>
+      </w:rPr>
+      <w:t>Revision 5 — October 2026</w:t>
+    </w:r>
+    <w:r>
+      <w:rPr>
+        <w:rFonts w:ascii="Arial" w:hAnsi="Arial"/>
+      </w:rPr>
+      <w:tab/>
+      <w:tab/>
+    </w:r>
+    <w:r>
+      <w:rPr>
+        <w:rFonts w:ascii="Arial" w:hAnsi="Arial"/>
+        <w:color w:val="555555"/>
+        <w:sz w:val="20"/>
+      </w:rPr>
+      <w:t>9-</w:t>
+    </w:r>
+    <w:r>
+      <w:rPr>
+        <w:rFonts w:ascii="Arial" w:hAnsi="Arial"/>
+        <w:color w:val="555555"/>
+        <w:sz w:val="20"/>
+      </w:rPr>
+      <w:fldChar w:fldCharType="begin"/>
+      <w:instrText xml:space="preserve"> PAGE </w:instrText>
+      <w:fldChar w:fldCharType="separate"/>
+      <w:t>1</w:t>
+      <w:fldChar w:fldCharType="end"/>
+    </w:r>
+  </w:p>
+</w:ftr>
+</file>
+
+<file path=word/footer139.xml><?xml version="1.0" encoding="utf-8"?>
+<w:ftr xmlns:m="http://schemas.openxmlformats.org/officeDocument/2006/math" xmlns:mc="http://schemas.openxmlformats.org/markup-compatibility/2006" xmlns:mo="http://schemas.microsoft.com/office/mac/office/2008/main" xmlns:mv="urn:schemas-microsoft-com:mac:vml" xmlns:o="urn:schemas-microsoft-com:office:office" xmlns:r="http://schemas.openxmlformats.org/officeDocument/2006/relationships" xmlns:v="urn:schemas-microsoft-com:vml" xmlns:w10="urn:schemas-microsoft-com:office:word" xmlns:w14="http://schemas.microsoft.com/office/word/2010/wordml" xmlns:w="http://schemas.openxmlformats.org/wordprocessingml/2006/main" xmlns:wne="http://schemas.microsoft.com/office/word/2006/wordml" xmlns:wp14="http://schemas.microsoft.com/office/word/2010/wordprocessingDrawing" xmlns:wp="http://schemas.openxmlformats.org/drawingml/2006/wordprocessingDrawing" xmlns:wpc="http://schemas.microsoft.com/office/word/2010/wordprocessingCanvas" xmlns:wpg="http://schemas.microsoft.com/office/word/2010/wordprocessingGroup" xmlns:wpi="http://schemas.microsoft.com/office/word/2010/wordprocessingInk" xmlns:wps="http://schemas.microsoft.com/office/word/2010/wordprocessingShape" mc:Ignorable="w14 wp14">
+  <w:p>
+    <w:pPr>
+      <w:pStyle w:val="Footer"/>
+      <w:spacing w:before="40"/>
+      <w:jc w:val="left"/>
+      <w:pBdr>
+        <w:top w:val="single" w:sz="4" w:space="2" w:color="808080"/>
+      </w:pBdr>
+    </w:pPr>
+    <w:r/>
+    <w:r>
+      <w:rPr>
+        <w:rFonts w:ascii="Arial" w:hAnsi="Arial"/>
+        <w:color w:val="555555"/>
+        <w:sz w:val="20"/>
+      </w:rPr>
+      <w:t>Revision 5 — October 2026</w:t>
+    </w:r>
+    <w:r>
+      <w:rPr>
+        <w:rFonts w:ascii="Arial" w:hAnsi="Arial"/>
+      </w:rPr>
+      <w:tab/>
+      <w:tab/>
+    </w:r>
+    <w:r>
+      <w:rPr>
+        <w:rFonts w:ascii="Arial" w:hAnsi="Arial"/>
+        <w:color w:val="555555"/>
+        <w:sz w:val="20"/>
+      </w:rPr>
+      <w:t>10-</w:t>
+    </w:r>
+    <w:r>
+      <w:rPr>
+        <w:rFonts w:ascii="Arial" w:hAnsi="Arial"/>
+        <w:color w:val="555555"/>
+        <w:sz w:val="20"/>
+      </w:rPr>
+      <w:fldChar w:fldCharType="begin"/>
+      <w:instrText xml:space="preserve"> PAGE </w:instrText>
+      <w:fldChar w:fldCharType="separate"/>
+      <w:t>1</w:t>
+      <w:fldChar w:fldCharType="end"/>
+    </w:r>
+  </w:p>
+</w:ftr>
+</file>
+
+<file path=word/footer14.xml><?xml version="1.0" encoding="utf-8"?>
+<w:ftr xmlns:m="http://schemas.openxmlformats.org/officeDocument/2006/math" xmlns:mc="http://schemas.openxmlformats.org/markup-compatibility/2006" xmlns:mo="http://schemas.microsoft.com/office/mac/office/2008/main" xmlns:mv="urn:schemas-microsoft-com:mac:vml" xmlns:o="urn:schemas-microsoft-com:office:office" xmlns:r="http://schemas.openxmlformats.org/officeDocument/2006/relationships" xmlns:v="urn:schemas-microsoft-com:vml" xmlns:w10="urn:schemas-microsoft-com:office:word" xmlns:w14="http://schemas.microsoft.com/office/word/2010/wordml" xmlns:w="http://schemas.openxmlformats.org/wordprocessingml/2006/main" xmlns:wne="http://schemas.microsoft.com/office/word/2006/wordml" xmlns:wp14="http://schemas.microsoft.com/office/word/2010/wordprocessingDrawing" xmlns:wp="http://schemas.openxmlformats.org/drawingml/2006/wordprocessingDrawing" xmlns:wpc="http://schemas.microsoft.com/office/word/2010/wordprocessingCanvas" xmlns:wpg="http://schemas.microsoft.com/office/word/2010/wordprocessingGroup" xmlns:wpi="http://schemas.microsoft.com/office/word/2010/wordprocessingInk" xmlns:wps="http://schemas.microsoft.com/office/word/2010/wordprocessingShape" mc:Ignorable="w14 wp14">
+  <w:p>
+    <w:pPr>
+      <w:pStyle w:val="Footer"/>
+      <w:spacing w:before="40"/>
+      <w:jc w:val="left"/>
+      <w:pBdr>
+        <w:top w:val="single" w:sz="4" w:space="2" w:color="808080"/>
+      </w:pBdr>
+    </w:pPr>
+    <w:r/>
+    <w:r>
+      <w:rPr>
+        <w:rFonts w:ascii="Arial" w:hAnsi="Arial"/>
+        <w:color w:val="555555"/>
+        <w:sz w:val="20"/>
+      </w:rPr>
+      <w:t>Revision 1 — April 2026</w:t>
+    </w:r>
+    <w:r>
+      <w:rPr>
+        <w:rFonts w:ascii="Arial" w:hAnsi="Arial"/>
+      </w:rPr>
+      <w:tab/>
+      <w:tab/>
+    </w:r>
+    <w:r>
+      <w:rPr>
+        <w:rFonts w:ascii="Arial" w:hAnsi="Arial"/>
+        <w:color w:val="555555"/>
+        <w:sz w:val="20"/>
+      </w:rPr>
+      <w:t>11-</w:t>
+    </w:r>
+    <w:r>
+      <w:rPr>
+        <w:rFonts w:ascii="Arial" w:hAnsi="Arial"/>
+        <w:color w:val="555555"/>
+        <w:sz w:val="20"/>
+      </w:rPr>
+      <w:fldChar w:fldCharType="begin"/>
+      <w:instrText xml:space="preserve"> PAGE </w:instrText>
+      <w:fldChar w:fldCharType="separate"/>
+      <w:t>1</w:t>
+      <w:fldChar w:fldCharType="end"/>
+    </w:r>
+  </w:p>
+</w:ftr>
+</file>
+
+<file path=word/footer140.xml><?xml version="1.0" encoding="utf-8"?>
+<w:ftr xmlns:m="http://schemas.openxmlformats.org/officeDocument/2006/math" xmlns:mc="http://schemas.openxmlformats.org/markup-compatibility/2006" xmlns:mo="http://schemas.microsoft.com/office/mac/office/2008/main" xmlns:mv="urn:schemas-microsoft-com:mac:vml" xmlns:o="urn:schemas-microsoft-com:office:office" xmlns:r="http://schemas.openxmlformats.org/officeDocument/2006/relationships" xmlns:v="urn:schemas-microsoft-com:vml" xmlns:w10="urn:schemas-microsoft-com:office:word" xmlns:w14="http://schemas.microsoft.com/office/word/2010/wordml" xmlns:w="http://schemas.openxmlformats.org/wordprocessingml/2006/main" xmlns:wne="http://schemas.microsoft.com/office/word/2006/wordml" xmlns:wp14="http://schemas.microsoft.com/office/word/2010/wordprocessingDrawing" xmlns:wp="http://schemas.openxmlformats.org/drawingml/2006/wordprocessingDrawing" xmlns:wpc="http://schemas.microsoft.com/office/word/2010/wordprocessingCanvas" xmlns:wpg="http://schemas.microsoft.com/office/word/2010/wordprocessingGroup" xmlns:wpi="http://schemas.microsoft.com/office/word/2010/wordprocessingInk" xmlns:wps="http://schemas.microsoft.com/office/word/2010/wordprocessingShape" mc:Ignorable="w14 wp14">
+  <w:p>
+    <w:pPr>
+      <w:pStyle w:val="Footer"/>
+      <w:spacing w:before="40"/>
+      <w:jc w:val="left"/>
+      <w:pBdr>
+        <w:top w:val="single" w:sz="4" w:space="2" w:color="808080"/>
+      </w:pBdr>
+    </w:pPr>
+    <w:r/>
+    <w:r>
+      <w:rPr>
+        <w:rFonts w:ascii="Arial" w:hAnsi="Arial"/>
+        <w:color w:val="555555"/>
+        <w:sz w:val="20"/>
+      </w:rPr>
+      <w:t>Revision 5 — October 2026</w:t>
+    </w:r>
+    <w:r>
+      <w:rPr>
+        <w:rFonts w:ascii="Arial" w:hAnsi="Arial"/>
+      </w:rPr>
+      <w:tab/>
+      <w:tab/>
+    </w:r>
+    <w:r>
+      <w:rPr>
+        <w:rFonts w:ascii="Arial" w:hAnsi="Arial"/>
+        <w:color w:val="555555"/>
+        <w:sz w:val="20"/>
+      </w:rPr>
+      <w:t>11-</w:t>
+    </w:r>
+    <w:r>
+      <w:rPr>
+        <w:rFonts w:ascii="Arial" w:hAnsi="Arial"/>
+        <w:color w:val="555555"/>
+        <w:sz w:val="20"/>
+      </w:rPr>
+      <w:fldChar w:fldCharType="begin"/>
+      <w:instrText xml:space="preserve"> PAGE </w:instrText>
+      <w:fldChar w:fldCharType="separate"/>
+      <w:t>1</w:t>
+      <w:fldChar w:fldCharType="end"/>
+    </w:r>
+  </w:p>
+</w:ftr>
+</file>
+
+<file path=word/footer141.xml><?xml version="1.0" encoding="utf-8"?>
+<w:ftr xmlns:m="http://schemas.openxmlformats.org/officeDocument/2006/math" xmlns:mc="http://schemas.openxmlformats.org/markup-compatibility/2006" xmlns:mo="http://schemas.microsoft.com/office/mac/office/2008/main" xmlns:mv="urn:schemas-microsoft-com:mac:vml" xmlns:o="urn:schemas-microsoft-com:office:office" xmlns:r="http://schemas.openxmlformats.org/officeDocument/2006/relationships" xmlns:v="urn:schemas-microsoft-com:vml" xmlns:w10="urn:schemas-microsoft-com:office:word" xmlns:w14="http://schemas.microsoft.com/office/word/2010/wordml" xmlns:w="http://schemas.openxmlformats.org/wordprocessingml/2006/main" xmlns:wne="http://schemas.microsoft.com/office/word/2006/wordml" xmlns:wp14="http://schemas.microsoft.com/office/word/2010/wordprocessingDrawing" xmlns:wp="http://schemas.openxmlformats.org/drawingml/2006/wordprocessingDrawing" xmlns:wpc="http://schemas.microsoft.com/office/word/2010/wordprocessingCanvas" xmlns:wpg="http://schemas.microsoft.com/office/word/2010/wordprocessingGroup" xmlns:wpi="http://schemas.microsoft.com/office/word/2010/wordprocessingInk" xmlns:wps="http://schemas.microsoft.com/office/word/2010/wordprocessingShape" mc:Ignorable="w14 wp14">
+  <w:p>
+    <w:pPr>
+      <w:pStyle w:val="Footer"/>
+      <w:spacing w:before="40"/>
+      <w:jc w:val="left"/>
+      <w:pBdr>
+        <w:top w:val="single" w:sz="4" w:space="2" w:color="808080"/>
+      </w:pBdr>
+    </w:pPr>
+    <w:r/>
+    <w:r>
+      <w:rPr>
+        <w:rFonts w:ascii="Arial" w:hAnsi="Arial"/>
+        <w:color w:val="555555"/>
+        <w:sz w:val="20"/>
+      </w:rPr>
+      <w:t>Revision 5 — October 2026</w:t>
+    </w:r>
+    <w:r>
+      <w:rPr>
+        <w:rFonts w:ascii="Arial" w:hAnsi="Arial"/>
+      </w:rPr>
+      <w:tab/>
+      <w:tab/>
+    </w:r>
+    <w:r>
+      <w:rPr>
+        <w:rFonts w:ascii="Arial" w:hAnsi="Arial"/>
+        <w:color w:val="555555"/>
+        <w:sz w:val="20"/>
+      </w:rPr>
+      <w:t>12-</w:t>
+    </w:r>
+    <w:r>
+      <w:rPr>
+        <w:rFonts w:ascii="Arial" w:hAnsi="Arial"/>
+        <w:color w:val="555555"/>
+        <w:sz w:val="20"/>
+      </w:rPr>
+      <w:fldChar w:fldCharType="begin"/>
+      <w:instrText xml:space="preserve"> PAGE </w:instrText>
+      <w:fldChar w:fldCharType="separate"/>
+      <w:t>1</w:t>
+      <w:fldChar w:fldCharType="end"/>
+    </w:r>
+  </w:p>
+</w:ftr>
+</file>
+
+<file path=word/footer142.xml><?xml version="1.0" encoding="utf-8"?>
+<w:ftr xmlns:m="http://schemas.openxmlformats.org/officeDocument/2006/math" xmlns:mc="http://schemas.openxmlformats.org/markup-compatibility/2006" xmlns:mo="http://schemas.microsoft.com/office/mac/office/2008/main" xmlns:mv="urn:schemas-microsoft-com:mac:vml" xmlns:o="urn:schemas-microsoft-com:office:office" xmlns:r="http://schemas.openxmlformats.org/officeDocument/2006/relationships" xmlns:v="urn:schemas-microsoft-com:vml" xmlns:w10="urn:schemas-microsoft-com:office:word" xmlns:w14="http://schemas.microsoft.com/office/word/2010/wordml" xmlns:w="http://schemas.openxmlformats.org/wordprocessingml/2006/main" xmlns:wne="http://schemas.microsoft.com/office/word/2006/wordml" xmlns:wp14="http://schemas.microsoft.com/office/word/2010/wordprocessingDrawing" xmlns:wp="http://schemas.openxmlformats.org/drawingml/2006/wordprocessingDrawing" xmlns:wpc="http://schemas.microsoft.com/office/word/2010/wordprocessingCanvas" xmlns:wpg="http://schemas.microsoft.com/office/word/2010/wordprocessingGroup" xmlns:wpi="http://schemas.microsoft.com/office/word/2010/wordprocessingInk" xmlns:wps="http://schemas.microsoft.com/office/word/2010/wordprocessingShape" mc:Ignorable="w14 wp14">
+  <w:p>
+    <w:pPr>
+      <w:pStyle w:val="Footer"/>
+      <w:spacing w:before="40"/>
+      <w:jc w:val="left"/>
+      <w:pBdr>
+        <w:top w:val="single" w:sz="4" w:space="2" w:color="808080"/>
+      </w:pBdr>
+    </w:pPr>
+    <w:r/>
+    <w:r>
+      <w:rPr>
+        <w:rFonts w:ascii="Arial" w:hAnsi="Arial"/>
+        <w:color w:val="555555"/>
+        <w:sz w:val="20"/>
+      </w:rPr>
+      <w:t>Revision 5 — October 2026</w:t>
+    </w:r>
+    <w:r>
+      <w:rPr>
+        <w:rFonts w:ascii="Arial" w:hAnsi="Arial"/>
+      </w:rPr>
+      <w:tab/>
+      <w:tab/>
+    </w:r>
+    <w:r>
+      <w:rPr>
+        <w:rFonts w:ascii="Arial" w:hAnsi="Arial"/>
+        <w:color w:val="555555"/>
+        <w:sz w:val="20"/>
+      </w:rPr>
+      <w:t>13-</w:t>
+    </w:r>
+    <w:r>
+      <w:rPr>
+        <w:rFonts w:ascii="Arial" w:hAnsi="Arial"/>
+        <w:color w:val="555555"/>
+        <w:sz w:val="20"/>
+      </w:rPr>
+      <w:fldChar w:fldCharType="begin"/>
+      <w:instrText xml:space="preserve"> PAGE </w:instrText>
+      <w:fldChar w:fldCharType="separate"/>
+      <w:t>1</w:t>
+      <w:fldChar w:fldCharType="end"/>
+    </w:r>
+  </w:p>
+</w:ftr>
+</file>
+
+<file path=word/footer143.xml><?xml version="1.0" encoding="utf-8"?>
+<w:ftr xmlns:m="http://schemas.openxmlformats.org/officeDocument/2006/math" xmlns:mc="http://schemas.openxmlformats.org/markup-compatibility/2006" xmlns:mo="http://schemas.microsoft.com/office/mac/office/2008/main" xmlns:mv="urn:schemas-microsoft-com:mac:vml" xmlns:o="urn:schemas-microsoft-com:office:office" xmlns:r="http://schemas.openxmlformats.org/officeDocument/2006/relationships" xmlns:v="urn:schemas-microsoft-com:vml" xmlns:w10="urn:schemas-microsoft-com:office:word" xmlns:w14="http://schemas.microsoft.com/office/word/2010/wordml" xmlns:w="http://schemas.openxmlformats.org/wordprocessingml/2006/main" xmlns:wne="http://schemas.microsoft.com/office/word/2006/wordml" xmlns:wp14="http://schemas.microsoft.com/office/word/2010/wordprocessingDrawing" xmlns:wp="http://schemas.openxmlformats.org/drawingml/2006/wordprocessingDrawing" xmlns:wpc="http://schemas.microsoft.com/office/word/2010/wordprocessingCanvas" xmlns:wpg="http://schemas.microsoft.com/office/word/2010/wordprocessingGroup" xmlns:wpi="http://schemas.microsoft.com/office/word/2010/wordprocessingInk" xmlns:wps="http://schemas.microsoft.com/office/word/2010/wordprocessingShape" mc:Ignorable="w14 wp14">
+  <w:p>
+    <w:pPr>
+      <w:pStyle w:val="Footer"/>
+      <w:spacing w:before="40"/>
+      <w:jc w:val="left"/>
+      <w:pBdr>
+        <w:top w:val="single" w:sz="4" w:space="2" w:color="808080"/>
+      </w:pBdr>
+    </w:pPr>
+    <w:r/>
+    <w:r>
+      <w:rPr>
+        <w:rFonts w:ascii="Arial" w:hAnsi="Arial"/>
+        <w:color w:val="555555"/>
+        <w:sz w:val="20"/>
+      </w:rPr>
+      <w:t>Revision 5 — October 2026</w:t>
+    </w:r>
+    <w:r>
+      <w:rPr>
+        <w:rFonts w:ascii="Arial" w:hAnsi="Arial"/>
+      </w:rPr>
+      <w:tab/>
+      <w:tab/>
+    </w:r>
+    <w:r>
+      <w:rPr>
+        <w:rFonts w:ascii="Arial" w:hAnsi="Arial"/>
+        <w:color w:val="555555"/>
+        <w:sz w:val="20"/>
+      </w:rPr>
+      <w:t>14-</w:t>
+    </w:r>
+    <w:r>
+      <w:rPr>
+        <w:rFonts w:ascii="Arial" w:hAnsi="Arial"/>
+        <w:color w:val="555555"/>
+        <w:sz w:val="20"/>
+      </w:rPr>
+      <w:fldChar w:fldCharType="begin"/>
+      <w:instrText xml:space="preserve"> PAGE </w:instrText>
+      <w:fldChar w:fldCharType="separate"/>
+      <w:t>1</w:t>
+      <w:fldChar w:fldCharType="end"/>
+    </w:r>
+  </w:p>
+</w:ftr>
+</file>
+
+<file path=word/footer144.xml><?xml version="1.0" encoding="utf-8"?>
+<w:ftr xmlns:m="http://schemas.openxmlformats.org/officeDocument/2006/math" xmlns:mc="http://schemas.openxmlformats.org/markup-compatibility/2006" xmlns:mo="http://schemas.microsoft.com/office/mac/office/2008/main" xmlns:mv="urn:schemas-microsoft-com:mac:vml" xmlns:o="urn:schemas-microsoft-com:office:office" xmlns:r="http://schemas.openxmlformats.org/officeDocument/2006/relationships" xmlns:v="urn:schemas-microsoft-com:vml" xmlns:w10="urn:schemas-microsoft-com:office:word" xmlns:w14="http://schemas.microsoft.com/office/word/2010/wordml" xmlns:w="http://schemas.openxmlformats.org/wordprocessingml/2006/main" xmlns:wne="http://schemas.microsoft.com/office/word/2006/wordml" xmlns:wp14="http://schemas.microsoft.com/office/word/2010/wordprocessingDrawing" xmlns:wp="http://schemas.openxmlformats.org/drawingml/2006/wordprocessingDrawing" xmlns:wpc="http://schemas.microsoft.com/office/word/2010/wordprocessingCanvas" xmlns:wpg="http://schemas.microsoft.com/office/word/2010/wordprocessingGroup" xmlns:wpi="http://schemas.microsoft.com/office/word/2010/wordprocessingInk" xmlns:wps="http://schemas.microsoft.com/office/word/2010/wordprocessingShape" mc:Ignorable="w14 wp14">
+  <w:p>
+    <w:pPr>
+      <w:pStyle w:val="Footer"/>
+      <w:spacing w:before="40"/>
+      <w:jc w:val="left"/>
+      <w:pBdr>
+        <w:top w:val="single" w:sz="4" w:space="2" w:color="808080"/>
+      </w:pBdr>
+    </w:pPr>
+    <w:r/>
+    <w:r>
+      <w:rPr>
+        <w:rFonts w:ascii="Arial" w:hAnsi="Arial"/>
+        <w:color w:val="555555"/>
+        <w:sz w:val="20"/>
+      </w:rPr>
+      <w:t>Revision 5 — October 2026</w:t>
+    </w:r>
+    <w:r>
+      <w:rPr>
+        <w:rFonts w:ascii="Arial" w:hAnsi="Arial"/>
+      </w:rPr>
+      <w:tab/>
+      <w:tab/>
+    </w:r>
+    <w:r>
+      <w:rPr>
+        <w:rFonts w:ascii="Arial" w:hAnsi="Arial"/>
+        <w:color w:val="555555"/>
+        <w:sz w:val="20"/>
+      </w:rPr>
+      <w:t>15-</w:t>
+    </w:r>
+    <w:r>
+      <w:rPr>
+        <w:rFonts w:ascii="Arial" w:hAnsi="Arial"/>
+        <w:color w:val="555555"/>
+        <w:sz w:val="20"/>
+      </w:rPr>
+      <w:fldChar w:fldCharType="begin"/>
+      <w:instrText xml:space="preserve"> PAGE </w:instrText>
+      <w:fldChar w:fldCharType="separate"/>
+      <w:t>1</w:t>
+      <w:fldChar w:fldCharType="end"/>
+    </w:r>
+  </w:p>
+</w:ftr>
+</file>
+
+<file path=word/footer145.xml><?xml version="1.0" encoding="utf-8"?>
+<w:ftr xmlns:m="http://schemas.openxmlformats.org/officeDocument/2006/math" xmlns:mc="http://schemas.openxmlformats.org/markup-compatibility/2006" xmlns:mo="http://schemas.microsoft.com/office/mac/office/2008/main" xmlns:mv="urn:schemas-microsoft-com:mac:vml" xmlns:o="urn:schemas-microsoft-com:office:office" xmlns:r="http://schemas.openxmlformats.org/officeDocument/2006/relationships" xmlns:v="urn:schemas-microsoft-com:vml" xmlns:w10="urn:schemas-microsoft-com:office:word" xmlns:w14="http://schemas.microsoft.com/office/word/2010/wordml" xmlns:w="http://schemas.openxmlformats.org/wordprocessingml/2006/main" xmlns:wne="http://schemas.microsoft.com/office/word/2006/wordml" xmlns:wp14="http://schemas.microsoft.com/office/word/2010/wordprocessingDrawing" xmlns:wp="http://schemas.openxmlformats.org/drawingml/2006/wordprocessingDrawing" xmlns:wpc="http://schemas.microsoft.com/office/word/2010/wordprocessingCanvas" xmlns:wpg="http://schemas.microsoft.com/office/word/2010/wordprocessingGroup" xmlns:wpi="http://schemas.microsoft.com/office/word/2010/wordprocessingInk" xmlns:wps="http://schemas.microsoft.com/office/word/2010/wordprocessingShape" mc:Ignorable="w14 wp14">
+  <w:p>
+    <w:pPr>
+      <w:pStyle w:val="Footer"/>
+      <w:spacing w:before="40"/>
+      <w:jc w:val="left"/>
+      <w:pBdr>
+        <w:top w:val="single" w:sz="4" w:space="2" w:color="808080"/>
+      </w:pBdr>
+    </w:pPr>
+    <w:r/>
+    <w:r>
+      <w:rPr>
+        <w:rFonts w:ascii="Arial" w:hAnsi="Arial"/>
+        <w:color w:val="555555"/>
+        <w:sz w:val="20"/>
+      </w:rPr>
+      <w:t>Revision 5 — October 2026</w:t>
+    </w:r>
+    <w:r>
+      <w:rPr>
+        <w:rFonts w:ascii="Arial" w:hAnsi="Arial"/>
+      </w:rPr>
+      <w:tab/>
+      <w:tab/>
+    </w:r>
+    <w:r>
+      <w:rPr>
+        <w:rFonts w:ascii="Arial" w:hAnsi="Arial"/>
+        <w:color w:val="555555"/>
+        <w:sz w:val="20"/>
+      </w:rPr>
+      <w:t>16-</w:t>
+    </w:r>
+    <w:r>
+      <w:rPr>
+        <w:rFonts w:ascii="Arial" w:hAnsi="Arial"/>
+        <w:color w:val="555555"/>
+        <w:sz w:val="20"/>
+      </w:rPr>
+      <w:fldChar w:fldCharType="begin"/>
+      <w:instrText xml:space="preserve"> PAGE </w:instrText>
+      <w:fldChar w:fldCharType="separate"/>
+      <w:t>1</w:t>
+      <w:fldChar w:fldCharType="end"/>
+    </w:r>
+  </w:p>
+</w:ftr>
+</file>
+
+<file path=word/footer146.xml><?xml version="1.0" encoding="utf-8"?>
+<w:ftr xmlns:m="http://schemas.openxmlformats.org/officeDocument/2006/math" xmlns:mc="http://schemas.openxmlformats.org/markup-compatibility/2006" xmlns:mo="http://schemas.microsoft.com/office/mac/office/2008/main" xmlns:mv="urn:schemas-microsoft-com:mac:vml" xmlns:o="urn:schemas-microsoft-com:office:office" xmlns:r="http://schemas.openxmlformats.org/officeDocument/2006/relationships" xmlns:v="urn:schemas-microsoft-com:vml" xmlns:w10="urn:schemas-microsoft-com:office:word" xmlns:w14="http://schemas.microsoft.com/office/word/2010/wordml" xmlns:w="http://schemas.openxmlformats.org/wordprocessingml/2006/main" xmlns:wne="http://schemas.microsoft.com/office/word/2006/wordml" xmlns:wp14="http://schemas.microsoft.com/office/word/2010/wordprocessingDrawing" xmlns:wp="http://schemas.openxmlformats.org/drawingml/2006/wordprocessingDrawing" xmlns:wpc="http://schemas.microsoft.com/office/word/2010/wordprocessingCanvas" xmlns:wpg="http://schemas.microsoft.com/office/word/2010/wordprocessingGroup" xmlns:wpi="http://schemas.microsoft.com/office/word/2010/wordprocessingInk" xmlns:wps="http://schemas.microsoft.com/office/word/2010/wordprocessingShape" mc:Ignorable="w14 wp14">
+  <w:p>
+    <w:pPr>
+      <w:pStyle w:val="Footer"/>
+      <w:spacing w:before="40"/>
+      <w:jc w:val="left"/>
+      <w:pBdr>
+        <w:top w:val="single" w:sz="4" w:space="2" w:color="808080"/>
+      </w:pBdr>
+    </w:pPr>
+    <w:r/>
+    <w:r>
+      <w:rPr>
+        <w:rFonts w:ascii="Arial" w:hAnsi="Arial"/>
+        <w:color w:val="555555"/>
+        <w:sz w:val="20"/>
+      </w:rPr>
+      <w:t>Revision 5 — October 2026</w:t>
+    </w:r>
+    <w:r>
+      <w:rPr>
+        <w:rFonts w:ascii="Arial" w:hAnsi="Arial"/>
+      </w:rPr>
+      <w:tab/>
+      <w:tab/>
+    </w:r>
+    <w:r>
+      <w:rPr>
+        <w:rFonts w:ascii="Arial" w:hAnsi="Arial"/>
+        <w:color w:val="555555"/>
+        <w:sz w:val="20"/>
+      </w:rPr>
+      <w:t>17-</w:t>
+    </w:r>
+    <w:r>
+      <w:rPr>
+        <w:rFonts w:ascii="Arial" w:hAnsi="Arial"/>
+        <w:color w:val="555555"/>
+        <w:sz w:val="20"/>
+      </w:rPr>
+      <w:fldChar w:fldCharType="begin"/>
+      <w:instrText xml:space="preserve"> PAGE </w:instrText>
+      <w:fldChar w:fldCharType="separate"/>
+      <w:t>1</w:t>
+      <w:fldChar w:fldCharType="end"/>
+    </w:r>
+  </w:p>
+</w:ftr>
+</file>
+
+<file path=word/footer147.xml><?xml version="1.0" encoding="utf-8"?>
+<w:ftr xmlns:m="http://schemas.openxmlformats.org/officeDocument/2006/math" xmlns:mc="http://schemas.openxmlformats.org/markup-compatibility/2006" xmlns:mo="http://schemas.microsoft.com/office/mac/office/2008/main" xmlns:mv="urn:schemas-microsoft-com:mac:vml" xmlns:o="urn:schemas-microsoft-com:office:office" xmlns:r="http://schemas.openxmlformats.org/officeDocument/2006/relationships" xmlns:v="urn:schemas-microsoft-com:vml" xmlns:w10="urn:schemas-microsoft-com:office:word" xmlns:w14="http://schemas.microsoft.com/office/word/2010/wordml" xmlns:w="http://schemas.openxmlformats.org/wordprocessingml/2006/main" xmlns:wne="http://schemas.microsoft.com/office/word/2006/wordml" xmlns:wp14="http://schemas.microsoft.com/office/word/2010/wordprocessingDrawing" xmlns:wp="http://schemas.openxmlformats.org/drawingml/2006/wordprocessingDrawing" xmlns:wpc="http://schemas.microsoft.com/office/word/2010/wordprocessingCanvas" xmlns:wpg="http://schemas.microsoft.com/office/word/2010/wordprocessingGroup" xmlns:wpi="http://schemas.microsoft.com/office/word/2010/wordprocessingInk" xmlns:wps="http://schemas.microsoft.com/office/word/2010/wordprocessingShape" mc:Ignorable="w14 wp14">
+  <w:p>
+    <w:pPr>
+      <w:pStyle w:val="Footer"/>
+      <w:spacing w:before="40"/>
+      <w:jc w:val="left"/>
+      <w:pBdr>
+        <w:top w:val="single" w:sz="4" w:space="2" w:color="808080"/>
+      </w:pBdr>
+    </w:pPr>
+    <w:r/>
+    <w:r>
+      <w:rPr>
+        <w:rFonts w:ascii="Arial" w:hAnsi="Arial"/>
+        <w:color w:val="555555"/>
+        <w:sz w:val="20"/>
+      </w:rPr>
+      <w:t>Revision 5 — October 2026</w:t>
+    </w:r>
+    <w:r>
+      <w:rPr>
+        <w:rFonts w:ascii="Arial" w:hAnsi="Arial"/>
+      </w:rPr>
+      <w:tab/>
+      <w:tab/>
+    </w:r>
+    <w:r>
+      <w:rPr>
+        <w:rFonts w:ascii="Arial" w:hAnsi="Arial"/>
+        <w:color w:val="555555"/>
+        <w:sz w:val="20"/>
+      </w:rPr>
+      <w:t>18-</w:t>
+    </w:r>
+    <w:r>
+      <w:rPr>
+        <w:rFonts w:ascii="Arial" w:hAnsi="Arial"/>
+        <w:color w:val="555555"/>
+        <w:sz w:val="20"/>
+      </w:rPr>
+      <w:fldChar w:fldCharType="begin"/>
+      <w:instrText xml:space="preserve"> PAGE </w:instrText>
+      <w:fldChar w:fldCharType="separate"/>
+      <w:t>1</w:t>
+      <w:fldChar w:fldCharType="end"/>
+    </w:r>
+  </w:p>
+</w:ftr>
+</file>
+
+<file path=word/footer148.xml><?xml version="1.0" encoding="utf-8"?>
+<w:ftr xmlns:m="http://schemas.openxmlformats.org/officeDocument/2006/math" xmlns:mc="http://schemas.openxmlformats.org/markup-compatibility/2006" xmlns:mo="http://schemas.microsoft.com/office/mac/office/2008/main" xmlns:mv="urn:schemas-microsoft-com:mac:vml" xmlns:o="urn:schemas-microsoft-com:office:office" xmlns:r="http://schemas.openxmlformats.org/officeDocument/2006/relationships" xmlns:v="urn:schemas-microsoft-com:vml" xmlns:w10="urn:schemas-microsoft-com:office:word" xmlns:w14="http://schemas.microsoft.com/office/word/2010/wordml" xmlns:w="http://schemas.openxmlformats.org/wordprocessingml/2006/main" xmlns:wne="http://schemas.microsoft.com/office/word/2006/wordml" xmlns:wp14="http://schemas.microsoft.com/office/word/2010/wordprocessingDrawing" xmlns:wp="http://schemas.openxmlformats.org/drawingml/2006/wordprocessingDrawing" xmlns:wpc="http://schemas.microsoft.com/office/word/2010/wordprocessingCanvas" xmlns:wpg="http://schemas.microsoft.com/office/word/2010/wordprocessingGroup" xmlns:wpi="http://schemas.microsoft.com/office/word/2010/wordprocessingInk" xmlns:wps="http://schemas.microsoft.com/office/word/2010/wordprocessingShape" mc:Ignorable="w14 wp14">
+  <w:p>
+    <w:pPr>
+      <w:pStyle w:val="Footer"/>
+      <w:spacing w:before="40"/>
+      <w:jc w:val="left"/>
+      <w:pBdr>
+        <w:top w:val="single" w:sz="4" w:space="2" w:color="808080"/>
+      </w:pBdr>
+    </w:pPr>
+    <w:r/>
+    <w:r>
+      <w:rPr>
+        <w:rFonts w:ascii="Arial" w:hAnsi="Arial"/>
+        <w:color w:val="555555"/>
+        <w:sz w:val="20"/>
+      </w:rPr>
+      <w:t>Revision 5 — October 2026</w:t>
     </w:r>
   </w:p>
 </w:ftr>
@@ -19997,14 +21025,55 @@
       </w:pBdr>
     </w:pPr>
     <w:r/>
-    <w:r>
-      <w:rPr>
-        <w:rFonts w:ascii="Arial" w:hAnsi="Arial"/>
-        <w:b/>
-        <w:color w:val="555555"/>
-        <w:sz w:val="20"/>
-      </w:rPr>
-      <w:t>Copyright and Disclaimer</w:t>
+  </w:p>
+</w:hdr>
+</file>
+
+<file path=word/header128.xml><?xml version="1.0" encoding="utf-8"?>
+<w:hdr xmlns:m="http://schemas.openxmlformats.org/officeDocument/2006/math" xmlns:mc="http://schemas.openxmlformats.org/markup-compatibility/2006" xmlns:mo="http://schemas.microsoft.com/office/mac/office/2008/main" xmlns:mv="urn:schemas-microsoft-com:mac:vml" xmlns:o="urn:schemas-microsoft-com:office:office" xmlns:r="http://schemas.openxmlformats.org/officeDocument/2006/relationships" xmlns:v="urn:schemas-microsoft-com:vml" xmlns:w10="urn:schemas-microsoft-com:office:word" xmlns:w14="http://schemas.microsoft.com/office/word/2010/wordml" xmlns:w="http://schemas.openxmlformats.org/wordprocessingml/2006/main" xmlns:wne="http://schemas.microsoft.com/office/word/2006/wordml" xmlns:wp14="http://schemas.microsoft.com/office/word/2010/wordprocessingDrawing" xmlns:wp="http://schemas.openxmlformats.org/drawingml/2006/wordprocessingDrawing" xmlns:wpc="http://schemas.microsoft.com/office/word/2010/wordprocessingCanvas" xmlns:wpg="http://schemas.microsoft.com/office/word/2010/wordprocessingGroup" xmlns:wpi="http://schemas.microsoft.com/office/word/2010/wordprocessingInk" xmlns:wps="http://schemas.microsoft.com/office/word/2010/wordprocessingShape" mc:Ignorable="w14 wp14">
+  <w:p>
+    <w:pPr>
+      <w:pStyle w:val="Header"/>
+      <w:spacing w:after="40"/>
+      <w:jc w:val="right"/>
+      <w:pBdr>
+        <w:bottom w:val="single" w:sz="4" w:space="2" w:color="808080"/>
+      </w:pBdr>
+    </w:pPr>
+    <w:r/>
+    <w:r>
+      <w:rPr>
+        <w:rFonts w:ascii="Arial" w:hAnsi="Arial"/>
+        <w:b/>
+        <w:color w:val="555555"/>
+        <w:sz w:val="20"/>
+      </w:rPr>
+      <w:t>Table of Contents</w:t>
+    </w:r>
+  </w:p>
+</w:hdr>
+</file>
+
+<file path=word/header129.xml><?xml version="1.0" encoding="utf-8"?>
+<w:hdr xmlns:m="http://schemas.openxmlformats.org/officeDocument/2006/math" xmlns:mc="http://schemas.openxmlformats.org/markup-compatibility/2006" xmlns:mo="http://schemas.microsoft.com/office/mac/office/2008/main" xmlns:mv="urn:schemas-microsoft-com:mac:vml" xmlns:o="urn:schemas-microsoft-com:office:office" xmlns:r="http://schemas.openxmlformats.org/officeDocument/2006/relationships" xmlns:v="urn:schemas-microsoft-com:vml" xmlns:w10="urn:schemas-microsoft-com:office:word" xmlns:w14="http://schemas.microsoft.com/office/word/2010/wordml" xmlns:w="http://schemas.openxmlformats.org/wordprocessingml/2006/main" xmlns:wne="http://schemas.microsoft.com/office/word/2006/wordml" xmlns:wp14="http://schemas.microsoft.com/office/word/2010/wordprocessingDrawing" xmlns:wp="http://schemas.openxmlformats.org/drawingml/2006/wordprocessingDrawing" xmlns:wpc="http://schemas.microsoft.com/office/word/2010/wordprocessingCanvas" xmlns:wpg="http://schemas.microsoft.com/office/word/2010/wordprocessingGroup" xmlns:wpi="http://schemas.microsoft.com/office/word/2010/wordprocessingInk" xmlns:wps="http://schemas.microsoft.com/office/word/2010/wordprocessingShape" mc:Ignorable="w14 wp14">
+  <w:p>
+    <w:pPr>
+      <w:pStyle w:val="Header"/>
+      <w:spacing w:after="40"/>
+      <w:jc w:val="right"/>
+      <w:pBdr>
+        <w:bottom w:val="single" w:sz="4" w:space="2" w:color="808080"/>
+      </w:pBdr>
+    </w:pPr>
+    <w:r/>
+    <w:r>
+      <w:rPr>
+        <w:rFonts w:ascii="Arial" w:hAnsi="Arial"/>
+        <w:b/>
+        <w:color w:val="555555"/>
+        <w:sz w:val="20"/>
+      </w:rPr>
+      <w:t>Quick Start</w:t>
     </w:r>
   </w:p>
 </w:hdr>
@@ -20035,7 +21104,7 @@
 </w:hdr>
 </file>
 
-<file path=word/header14.xml><?xml version="1.0" encoding="utf-8"?>
+<file path=word/header130.xml><?xml version="1.0" encoding="utf-8"?>
 <w:hdr xmlns:m="http://schemas.openxmlformats.org/officeDocument/2006/math" xmlns:mc="http://schemas.openxmlformats.org/markup-compatibility/2006" xmlns:mo="http://schemas.microsoft.com/office/mac/office/2008/main" xmlns:mv="urn:schemas-microsoft-com:mac:vml" xmlns:o="urn:schemas-microsoft-com:office:office" xmlns:r="http://schemas.openxmlformats.org/officeDocument/2006/relationships" xmlns:v="urn:schemas-microsoft-com:vml" xmlns:w10="urn:schemas-microsoft-com:office:word" xmlns:w14="http://schemas.microsoft.com/office/word/2010/wordml" xmlns:w="http://schemas.openxmlformats.org/wordprocessingml/2006/main" xmlns:wne="http://schemas.microsoft.com/office/word/2006/wordml" xmlns:wp14="http://schemas.microsoft.com/office/word/2010/wordprocessingDrawing" xmlns:wp="http://schemas.openxmlformats.org/drawingml/2006/wordprocessingDrawing" xmlns:wpc="http://schemas.microsoft.com/office/word/2010/wordprocessingCanvas" xmlns:wpg="http://schemas.microsoft.com/office/word/2010/wordprocessingGroup" xmlns:wpi="http://schemas.microsoft.com/office/word/2010/wordprocessingInk" xmlns:wps="http://schemas.microsoft.com/office/word/2010/wordprocessingShape" mc:Ignorable="w14 wp14">
   <w:p>
     <w:pPr>
@@ -20054,7 +21123,482 @@
         <w:color w:val="555555"/>
         <w:sz w:val="20"/>
       </w:rPr>
+      <w:t>1. Overview</w:t>
+    </w:r>
+  </w:p>
+</w:hdr>
+</file>
+
+<file path=word/header131.xml><?xml version="1.0" encoding="utf-8"?>
+<w:hdr xmlns:m="http://schemas.openxmlformats.org/officeDocument/2006/math" xmlns:mc="http://schemas.openxmlformats.org/markup-compatibility/2006" xmlns:mo="http://schemas.microsoft.com/office/mac/office/2008/main" xmlns:mv="urn:schemas-microsoft-com:mac:vml" xmlns:o="urn:schemas-microsoft-com:office:office" xmlns:r="http://schemas.openxmlformats.org/officeDocument/2006/relationships" xmlns:v="urn:schemas-microsoft-com:vml" xmlns:w10="urn:schemas-microsoft-com:office:word" xmlns:w14="http://schemas.microsoft.com/office/word/2010/wordml" xmlns:w="http://schemas.openxmlformats.org/wordprocessingml/2006/main" xmlns:wne="http://schemas.microsoft.com/office/word/2006/wordml" xmlns:wp14="http://schemas.microsoft.com/office/word/2010/wordprocessingDrawing" xmlns:wp="http://schemas.openxmlformats.org/drawingml/2006/wordprocessingDrawing" xmlns:wpc="http://schemas.microsoft.com/office/word/2010/wordprocessingCanvas" xmlns:wpg="http://schemas.microsoft.com/office/word/2010/wordprocessingGroup" xmlns:wpi="http://schemas.microsoft.com/office/word/2010/wordprocessingInk" xmlns:wps="http://schemas.microsoft.com/office/word/2010/wordprocessingShape" mc:Ignorable="w14 wp14">
+  <w:p>
+    <w:pPr>
+      <w:pStyle w:val="Header"/>
+      <w:spacing w:after="40"/>
+      <w:jc w:val="right"/>
+      <w:pBdr>
+        <w:bottom w:val="single" w:sz="4" w:space="2" w:color="808080"/>
+      </w:pBdr>
+    </w:pPr>
+    <w:r/>
+    <w:r>
+      <w:rPr>
+        <w:rFonts w:ascii="Arial" w:hAnsi="Arial"/>
+        <w:b/>
+        <w:color w:val="555555"/>
+        <w:sz w:val="20"/>
+      </w:rPr>
+      <w:t>2. Models</w:t>
+    </w:r>
+  </w:p>
+</w:hdr>
+</file>
+
+<file path=word/header132.xml><?xml version="1.0" encoding="utf-8"?>
+<w:hdr xmlns:m="http://schemas.openxmlformats.org/officeDocument/2006/math" xmlns:mc="http://schemas.openxmlformats.org/markup-compatibility/2006" xmlns:mo="http://schemas.microsoft.com/office/mac/office/2008/main" xmlns:mv="urn:schemas-microsoft-com:mac:vml" xmlns:o="urn:schemas-microsoft-com:office:office" xmlns:r="http://schemas.openxmlformats.org/officeDocument/2006/relationships" xmlns:v="urn:schemas-microsoft-com:vml" xmlns:w10="urn:schemas-microsoft-com:office:word" xmlns:w14="http://schemas.microsoft.com/office/word/2010/wordml" xmlns:w="http://schemas.openxmlformats.org/wordprocessingml/2006/main" xmlns:wne="http://schemas.microsoft.com/office/word/2006/wordml" xmlns:wp14="http://schemas.microsoft.com/office/word/2010/wordprocessingDrawing" xmlns:wp="http://schemas.openxmlformats.org/drawingml/2006/wordprocessingDrawing" xmlns:wpc="http://schemas.microsoft.com/office/word/2010/wordprocessingCanvas" xmlns:wpg="http://schemas.microsoft.com/office/word/2010/wordprocessingGroup" xmlns:wpi="http://schemas.microsoft.com/office/word/2010/wordprocessingInk" xmlns:wps="http://schemas.microsoft.com/office/word/2010/wordprocessingShape" mc:Ignorable="w14 wp14">
+  <w:p>
+    <w:pPr>
+      <w:pStyle w:val="Header"/>
+      <w:spacing w:after="40"/>
+      <w:jc w:val="right"/>
+      <w:pBdr>
+        <w:bottom w:val="single" w:sz="4" w:space="2" w:color="808080"/>
+      </w:pBdr>
+    </w:pPr>
+    <w:r/>
+    <w:r>
+      <w:rPr>
+        <w:rFonts w:ascii="Arial" w:hAnsi="Arial"/>
+        <w:b/>
+        <w:color w:val="555555"/>
+        <w:sz w:val="20"/>
+      </w:rPr>
+      <w:t>3. Display</w:t>
+    </w:r>
+  </w:p>
+</w:hdr>
+</file>
+
+<file path=word/header133.xml><?xml version="1.0" encoding="utf-8"?>
+<w:hdr xmlns:m="http://schemas.openxmlformats.org/officeDocument/2006/math" xmlns:mc="http://schemas.openxmlformats.org/markup-compatibility/2006" xmlns:mo="http://schemas.microsoft.com/office/mac/office/2008/main" xmlns:mv="urn:schemas-microsoft-com:mac:vml" xmlns:o="urn:schemas-microsoft-com:office:office" xmlns:r="http://schemas.openxmlformats.org/officeDocument/2006/relationships" xmlns:v="urn:schemas-microsoft-com:vml" xmlns:w10="urn:schemas-microsoft-com:office:word" xmlns:w14="http://schemas.microsoft.com/office/word/2010/wordml" xmlns:w="http://schemas.openxmlformats.org/wordprocessingml/2006/main" xmlns:wne="http://schemas.microsoft.com/office/word/2006/wordml" xmlns:wp14="http://schemas.microsoft.com/office/word/2010/wordprocessingDrawing" xmlns:wp="http://schemas.openxmlformats.org/drawingml/2006/wordprocessingDrawing" xmlns:wpc="http://schemas.microsoft.com/office/word/2010/wordprocessingCanvas" xmlns:wpg="http://schemas.microsoft.com/office/word/2010/wordprocessingGroup" xmlns:wpi="http://schemas.microsoft.com/office/word/2010/wordprocessingInk" xmlns:wps="http://schemas.microsoft.com/office/word/2010/wordprocessingShape" mc:Ignorable="w14 wp14">
+  <w:p>
+    <w:pPr>
+      <w:pStyle w:val="Header"/>
+      <w:spacing w:after="40"/>
+      <w:jc w:val="right"/>
+      <w:pBdr>
+        <w:bottom w:val="single" w:sz="4" w:space="2" w:color="808080"/>
+      </w:pBdr>
+    </w:pPr>
+    <w:r/>
+    <w:r>
+      <w:rPr>
+        <w:rFonts w:ascii="Arial" w:hAnsi="Arial"/>
+        <w:b/>
+        <w:color w:val="555555"/>
+        <w:sz w:val="20"/>
+      </w:rPr>
+      <w:t>4. Buttons</w:t>
+    </w:r>
+  </w:p>
+</w:hdr>
+</file>
+
+<file path=word/header134.xml><?xml version="1.0" encoding="utf-8"?>
+<w:hdr xmlns:m="http://schemas.openxmlformats.org/officeDocument/2006/math" xmlns:mc="http://schemas.openxmlformats.org/markup-compatibility/2006" xmlns:mo="http://schemas.microsoft.com/office/mac/office/2008/main" xmlns:mv="urn:schemas-microsoft-com:mac:vml" xmlns:o="urn:schemas-microsoft-com:office:office" xmlns:r="http://schemas.openxmlformats.org/officeDocument/2006/relationships" xmlns:v="urn:schemas-microsoft-com:vml" xmlns:w10="urn:schemas-microsoft-com:office:word" xmlns:w14="http://schemas.microsoft.com/office/word/2010/wordml" xmlns:w="http://schemas.openxmlformats.org/wordprocessingml/2006/main" xmlns:wne="http://schemas.microsoft.com/office/word/2006/wordml" xmlns:wp14="http://schemas.microsoft.com/office/word/2010/wordprocessingDrawing" xmlns:wp="http://schemas.openxmlformats.org/drawingml/2006/wordprocessingDrawing" xmlns:wpc="http://schemas.microsoft.com/office/word/2010/wordprocessingCanvas" xmlns:wpg="http://schemas.microsoft.com/office/word/2010/wordprocessingGroup" xmlns:wpi="http://schemas.microsoft.com/office/word/2010/wordprocessingInk" xmlns:wps="http://schemas.microsoft.com/office/word/2010/wordprocessingShape" mc:Ignorable="w14 wp14">
+  <w:p>
+    <w:pPr>
+      <w:pStyle w:val="Header"/>
+      <w:spacing w:after="40"/>
+      <w:jc w:val="right"/>
+      <w:pBdr>
+        <w:bottom w:val="single" w:sz="4" w:space="2" w:color="808080"/>
+      </w:pBdr>
+    </w:pPr>
+    <w:r/>
+    <w:r>
+      <w:rPr>
+        <w:rFonts w:ascii="Arial" w:hAnsi="Arial"/>
+        <w:b/>
+        <w:color w:val="555555"/>
+        <w:sz w:val="20"/>
+      </w:rPr>
+      <w:t>5. Power-On Functions</w:t>
+    </w:r>
+  </w:p>
+</w:hdr>
+</file>
+
+<file path=word/header135.xml><?xml version="1.0" encoding="utf-8"?>
+<w:hdr xmlns:m="http://schemas.openxmlformats.org/officeDocument/2006/math" xmlns:mc="http://schemas.openxmlformats.org/markup-compatibility/2006" xmlns:mo="http://schemas.microsoft.com/office/mac/office/2008/main" xmlns:mv="urn:schemas-microsoft-com:mac:vml" xmlns:o="urn:schemas-microsoft-com:office:office" xmlns:r="http://schemas.openxmlformats.org/officeDocument/2006/relationships" xmlns:v="urn:schemas-microsoft-com:vml" xmlns:w10="urn:schemas-microsoft-com:office:word" xmlns:w14="http://schemas.microsoft.com/office/word/2010/wordml" xmlns:w="http://schemas.openxmlformats.org/wordprocessingml/2006/main" xmlns:wne="http://schemas.microsoft.com/office/word/2006/wordml" xmlns:wp14="http://schemas.microsoft.com/office/word/2010/wordprocessingDrawing" xmlns:wp="http://schemas.openxmlformats.org/drawingml/2006/wordprocessingDrawing" xmlns:wpc="http://schemas.microsoft.com/office/word/2010/wordprocessingCanvas" xmlns:wpg="http://schemas.microsoft.com/office/word/2010/wordprocessingGroup" xmlns:wpi="http://schemas.microsoft.com/office/word/2010/wordprocessingInk" xmlns:wps="http://schemas.microsoft.com/office/word/2010/wordprocessingShape" mc:Ignorable="w14 wp14">
+  <w:p>
+    <w:pPr>
+      <w:pStyle w:val="Header"/>
+      <w:spacing w:after="40"/>
+      <w:jc w:val="right"/>
+      <w:pBdr>
+        <w:bottom w:val="single" w:sz="4" w:space="2" w:color="808080"/>
+      </w:pBdr>
+    </w:pPr>
+    <w:r/>
+    <w:r>
+      <w:rPr>
+        <w:rFonts w:ascii="Arial" w:hAnsi="Arial"/>
+        <w:b/>
+        <w:color w:val="555555"/>
+        <w:sz w:val="20"/>
+      </w:rPr>
+      <w:t>6. AP Configuration Mode</w:t>
+    </w:r>
+  </w:p>
+</w:hdr>
+</file>
+
+<file path=word/header136.xml><?xml version="1.0" encoding="utf-8"?>
+<w:hdr xmlns:m="http://schemas.openxmlformats.org/officeDocument/2006/math" xmlns:mc="http://schemas.openxmlformats.org/markup-compatibility/2006" xmlns:mo="http://schemas.microsoft.com/office/mac/office/2008/main" xmlns:mv="urn:schemas-microsoft-com:mac:vml" xmlns:o="urn:schemas-microsoft-com:office:office" xmlns:r="http://schemas.openxmlformats.org/officeDocument/2006/relationships" xmlns:v="urn:schemas-microsoft-com:vml" xmlns:w10="urn:schemas-microsoft-com:office:word" xmlns:w14="http://schemas.microsoft.com/office/word/2010/wordml" xmlns:w="http://schemas.openxmlformats.org/wordprocessingml/2006/main" xmlns:wne="http://schemas.microsoft.com/office/word/2006/wordml" xmlns:wp14="http://schemas.microsoft.com/office/word/2010/wordprocessingDrawing" xmlns:wp="http://schemas.openxmlformats.org/drawingml/2006/wordprocessingDrawing" xmlns:wpc="http://schemas.microsoft.com/office/word/2010/wordprocessingCanvas" xmlns:wpg="http://schemas.microsoft.com/office/word/2010/wordprocessingGroup" xmlns:wpi="http://schemas.microsoft.com/office/word/2010/wordprocessingInk" xmlns:wps="http://schemas.microsoft.com/office/word/2010/wordprocessingShape" mc:Ignorable="w14 wp14">
+  <w:p>
+    <w:pPr>
+      <w:pStyle w:val="Header"/>
+      <w:spacing w:after="40"/>
+      <w:jc w:val="right"/>
+      <w:pBdr>
+        <w:bottom w:val="single" w:sz="4" w:space="2" w:color="808080"/>
+      </w:pBdr>
+    </w:pPr>
+    <w:r/>
+    <w:r>
+      <w:rPr>
+        <w:rFonts w:ascii="Arial" w:hAnsi="Arial"/>
+        <w:b/>
+        <w:color w:val="555555"/>
+        <w:sz w:val="20"/>
+      </w:rPr>
+      <w:t>7. Live Settings Web Interface</w:t>
+    </w:r>
+  </w:p>
+</w:hdr>
+</file>
+
+<file path=word/header137.xml><?xml version="1.0" encoding="utf-8"?>
+<w:hdr xmlns:m="http://schemas.openxmlformats.org/officeDocument/2006/math" xmlns:mc="http://schemas.openxmlformats.org/markup-compatibility/2006" xmlns:mo="http://schemas.microsoft.com/office/mac/office/2008/main" xmlns:mv="urn:schemas-microsoft-com:mac:vml" xmlns:o="urn:schemas-microsoft-com:office:office" xmlns:r="http://schemas.openxmlformats.org/officeDocument/2006/relationships" xmlns:v="urn:schemas-microsoft-com:vml" xmlns:w10="urn:schemas-microsoft-com:office:word" xmlns:w14="http://schemas.microsoft.com/office/word/2010/wordml" xmlns:w="http://schemas.openxmlformats.org/wordprocessingml/2006/main" xmlns:wne="http://schemas.microsoft.com/office/word/2006/wordml" xmlns:wp14="http://schemas.microsoft.com/office/word/2010/wordprocessingDrawing" xmlns:wp="http://schemas.openxmlformats.org/drawingml/2006/wordprocessingDrawing" xmlns:wpc="http://schemas.microsoft.com/office/word/2010/wordprocessingCanvas" xmlns:wpg="http://schemas.microsoft.com/office/word/2010/wordprocessingGroup" xmlns:wpi="http://schemas.microsoft.com/office/word/2010/wordprocessingInk" xmlns:wps="http://schemas.microsoft.com/office/word/2010/wordprocessingShape" mc:Ignorable="w14 wp14">
+  <w:p>
+    <w:pPr>
+      <w:pStyle w:val="Header"/>
+      <w:spacing w:after="40"/>
+      <w:jc w:val="right"/>
+      <w:pBdr>
+        <w:bottom w:val="single" w:sz="4" w:space="2" w:color="808080"/>
+      </w:pBdr>
+    </w:pPr>
+    <w:r/>
+    <w:r>
+      <w:rPr>
+        <w:rFonts w:ascii="Arial" w:hAnsi="Arial"/>
+        <w:b/>
+        <w:color w:val="555555"/>
+        <w:sz w:val="20"/>
+      </w:rPr>
+      <w:t>8. Rule Scheduler</w:t>
+    </w:r>
+  </w:p>
+</w:hdr>
+</file>
+
+<file path=word/header138.xml><?xml version="1.0" encoding="utf-8"?>
+<w:hdr xmlns:m="http://schemas.openxmlformats.org/officeDocument/2006/math" xmlns:mc="http://schemas.openxmlformats.org/markup-compatibility/2006" xmlns:mo="http://schemas.microsoft.com/office/mac/office/2008/main" xmlns:mv="urn:schemas-microsoft-com:mac:vml" xmlns:o="urn:schemas-microsoft-com:office:office" xmlns:r="http://schemas.openxmlformats.org/officeDocument/2006/relationships" xmlns:v="urn:schemas-microsoft-com:vml" xmlns:w10="urn:schemas-microsoft-com:office:word" xmlns:w14="http://schemas.microsoft.com/office/word/2010/wordml" xmlns:w="http://schemas.openxmlformats.org/wordprocessingml/2006/main" xmlns:wne="http://schemas.microsoft.com/office/word/2006/wordml" xmlns:wp14="http://schemas.microsoft.com/office/word/2010/wordprocessingDrawing" xmlns:wp="http://schemas.openxmlformats.org/drawingml/2006/wordprocessingDrawing" xmlns:wpc="http://schemas.microsoft.com/office/word/2010/wordprocessingCanvas" xmlns:wpg="http://schemas.microsoft.com/office/word/2010/wordprocessingGroup" xmlns:wpi="http://schemas.microsoft.com/office/word/2010/wordprocessingInk" xmlns:wps="http://schemas.microsoft.com/office/word/2010/wordprocessingShape" mc:Ignorable="w14 wp14">
+  <w:p>
+    <w:pPr>
+      <w:pStyle w:val="Header"/>
+      <w:spacing w:after="40"/>
+      <w:jc w:val="right"/>
+      <w:pBdr>
+        <w:bottom w:val="single" w:sz="4" w:space="2" w:color="808080"/>
+      </w:pBdr>
+    </w:pPr>
+    <w:r/>
+    <w:r>
+      <w:rPr>
+        <w:rFonts w:ascii="Arial" w:hAnsi="Arial"/>
+        <w:b/>
+        <w:color w:val="555555"/>
+        <w:sz w:val="20"/>
+      </w:rPr>
+      <w:t>9. Backlight (LED) Effects</w:t>
+    </w:r>
+  </w:p>
+</w:hdr>
+</file>
+
+<file path=word/header139.xml><?xml version="1.0" encoding="utf-8"?>
+<w:hdr xmlns:m="http://schemas.openxmlformats.org/officeDocument/2006/math" xmlns:mc="http://schemas.openxmlformats.org/markup-compatibility/2006" xmlns:mo="http://schemas.microsoft.com/office/mac/office/2008/main" xmlns:mv="urn:schemas-microsoft-com:mac:vml" xmlns:o="urn:schemas-microsoft-com:office:office" xmlns:r="http://schemas.openxmlformats.org/officeDocument/2006/relationships" xmlns:v="urn:schemas-microsoft-com:vml" xmlns:w10="urn:schemas-microsoft-com:office:word" xmlns:w14="http://schemas.microsoft.com/office/word/2010/wordml" xmlns:w="http://schemas.openxmlformats.org/wordprocessingml/2006/main" xmlns:wne="http://schemas.microsoft.com/office/word/2006/wordml" xmlns:wp14="http://schemas.microsoft.com/office/word/2010/wordprocessingDrawing" xmlns:wp="http://schemas.openxmlformats.org/drawingml/2006/wordprocessingDrawing" xmlns:wpc="http://schemas.microsoft.com/office/word/2010/wordprocessingCanvas" xmlns:wpg="http://schemas.microsoft.com/office/word/2010/wordprocessingGroup" xmlns:wpi="http://schemas.microsoft.com/office/word/2010/wordprocessingInk" xmlns:wps="http://schemas.microsoft.com/office/word/2010/wordprocessingShape" mc:Ignorable="w14 wp14">
+  <w:p>
+    <w:pPr>
+      <w:pStyle w:val="Header"/>
+      <w:spacing w:after="40"/>
+      <w:jc w:val="right"/>
+      <w:pBdr>
+        <w:bottom w:val="single" w:sz="4" w:space="2" w:color="808080"/>
+      </w:pBdr>
+    </w:pPr>
+    <w:r/>
+    <w:r>
+      <w:rPr>
+        <w:rFonts w:ascii="Arial" w:hAnsi="Arial"/>
+        <w:b/>
+        <w:color w:val="555555"/>
+        <w:sz w:val="20"/>
+      </w:rPr>
+      <w:t>10. Word Change Effect</w:t>
+    </w:r>
+  </w:p>
+</w:hdr>
+</file>
+
+<file path=word/header14.xml><?xml version="1.0" encoding="utf-8"?>
+<w:hdr xmlns:m="http://schemas.openxmlformats.org/officeDocument/2006/math" xmlns:mc="http://schemas.openxmlformats.org/markup-compatibility/2006" xmlns:mo="http://schemas.microsoft.com/office/mac/office/2008/main" xmlns:mv="urn:schemas-microsoft-com:mac:vml" xmlns:o="urn:schemas-microsoft-com:office:office" xmlns:r="http://schemas.openxmlformats.org/officeDocument/2006/relationships" xmlns:v="urn:schemas-microsoft-com:vml" xmlns:w10="urn:schemas-microsoft-com:office:word" xmlns:w14="http://schemas.microsoft.com/office/word/2010/wordml" xmlns:w="http://schemas.openxmlformats.org/wordprocessingml/2006/main" xmlns:wne="http://schemas.microsoft.com/office/word/2006/wordml" xmlns:wp14="http://schemas.microsoft.com/office/word/2010/wordprocessingDrawing" xmlns:wp="http://schemas.openxmlformats.org/drawingml/2006/wordprocessingDrawing" xmlns:wpc="http://schemas.microsoft.com/office/word/2010/wordprocessingCanvas" xmlns:wpg="http://schemas.microsoft.com/office/word/2010/wordprocessingGroup" xmlns:wpi="http://schemas.microsoft.com/office/word/2010/wordprocessingInk" xmlns:wps="http://schemas.microsoft.com/office/word/2010/wordprocessingShape" mc:Ignorable="w14 wp14">
+  <w:p>
+    <w:pPr>
+      <w:pStyle w:val="Header"/>
+      <w:spacing w:after="40"/>
+      <w:jc w:val="right"/>
+      <w:pBdr>
+        <w:bottom w:val="single" w:sz="4" w:space="2" w:color="808080"/>
+      </w:pBdr>
+    </w:pPr>
+    <w:r/>
+    <w:r>
+      <w:rPr>
+        <w:rFonts w:ascii="Arial" w:hAnsi="Arial"/>
+        <w:b/>
+        <w:color w:val="555555"/>
+        <w:sz w:val="20"/>
+      </w:rPr>
       <w:t>11. Info Display Cycle</w:t>
+    </w:r>
+  </w:p>
+</w:hdr>
+</file>
+
+<file path=word/header140.xml><?xml version="1.0" encoding="utf-8"?>
+<w:hdr xmlns:m="http://schemas.openxmlformats.org/officeDocument/2006/math" xmlns:mc="http://schemas.openxmlformats.org/markup-compatibility/2006" xmlns:mo="http://schemas.microsoft.com/office/mac/office/2008/main" xmlns:mv="urn:schemas-microsoft-com:mac:vml" xmlns:o="urn:schemas-microsoft-com:office:office" xmlns:r="http://schemas.openxmlformats.org/officeDocument/2006/relationships" xmlns:v="urn:schemas-microsoft-com:vml" xmlns:w10="urn:schemas-microsoft-com:office:word" xmlns:w14="http://schemas.microsoft.com/office/word/2010/wordml" xmlns:w="http://schemas.openxmlformats.org/wordprocessingml/2006/main" xmlns:wne="http://schemas.microsoft.com/office/word/2006/wordml" xmlns:wp14="http://schemas.microsoft.com/office/word/2010/wordprocessingDrawing" xmlns:wp="http://schemas.openxmlformats.org/drawingml/2006/wordprocessingDrawing" xmlns:wpc="http://schemas.microsoft.com/office/word/2010/wordprocessingCanvas" xmlns:wpg="http://schemas.microsoft.com/office/word/2010/wordprocessingGroup" xmlns:wpi="http://schemas.microsoft.com/office/word/2010/wordprocessingInk" xmlns:wps="http://schemas.microsoft.com/office/word/2010/wordprocessingShape" mc:Ignorable="w14 wp14">
+  <w:p>
+    <w:pPr>
+      <w:pStyle w:val="Header"/>
+      <w:spacing w:after="40"/>
+      <w:jc w:val="right"/>
+      <w:pBdr>
+        <w:bottom w:val="single" w:sz="4" w:space="2" w:color="808080"/>
+      </w:pBdr>
+    </w:pPr>
+    <w:r/>
+    <w:r>
+      <w:rPr>
+        <w:rFonts w:ascii="Arial" w:hAnsi="Arial"/>
+        <w:b/>
+        <w:color w:val="555555"/>
+        <w:sz w:val="20"/>
+      </w:rPr>
+      <w:t>11. Date, Weather, and Announcements</w:t>
+    </w:r>
+  </w:p>
+</w:hdr>
+</file>
+
+<file path=word/header141.xml><?xml version="1.0" encoding="utf-8"?>
+<w:hdr xmlns:m="http://schemas.openxmlformats.org/officeDocument/2006/math" xmlns:mc="http://schemas.openxmlformats.org/markup-compatibility/2006" xmlns:mo="http://schemas.microsoft.com/office/mac/office/2008/main" xmlns:mv="urn:schemas-microsoft-com:mac:vml" xmlns:o="urn:schemas-microsoft-com:office:office" xmlns:r="http://schemas.openxmlformats.org/officeDocument/2006/relationships" xmlns:v="urn:schemas-microsoft-com:vml" xmlns:w10="urn:schemas-microsoft-com:office:word" xmlns:w14="http://schemas.microsoft.com/office/word/2010/wordml" xmlns:w="http://schemas.openxmlformats.org/wordprocessingml/2006/main" xmlns:wne="http://schemas.microsoft.com/office/word/2006/wordml" xmlns:wp14="http://schemas.microsoft.com/office/word/2010/wordprocessingDrawing" xmlns:wp="http://schemas.openxmlformats.org/drawingml/2006/wordprocessingDrawing" xmlns:wpc="http://schemas.microsoft.com/office/word/2010/wordprocessingCanvas" xmlns:wpg="http://schemas.microsoft.com/office/word/2010/wordprocessingGroup" xmlns:wpi="http://schemas.microsoft.com/office/word/2010/wordprocessingInk" xmlns:wps="http://schemas.microsoft.com/office/word/2010/wordprocessingShape" mc:Ignorable="w14 wp14">
+  <w:p>
+    <w:pPr>
+      <w:pStyle w:val="Header"/>
+      <w:spacing w:after="40"/>
+      <w:jc w:val="right"/>
+      <w:pBdr>
+        <w:bottom w:val="single" w:sz="4" w:space="2" w:color="808080"/>
+      </w:pBdr>
+    </w:pPr>
+    <w:r/>
+    <w:r>
+      <w:rPr>
+        <w:rFonts w:ascii="Arial" w:hAnsi="Arial"/>
+        <w:b/>
+        <w:color w:val="555555"/>
+        <w:sz w:val="20"/>
+      </w:rPr>
+      <w:t>12. Word Libraries</w:t>
+    </w:r>
+  </w:p>
+</w:hdr>
+</file>
+
+<file path=word/header142.xml><?xml version="1.0" encoding="utf-8"?>
+<w:hdr xmlns:m="http://schemas.openxmlformats.org/officeDocument/2006/math" xmlns:mc="http://schemas.openxmlformats.org/markup-compatibility/2006" xmlns:mo="http://schemas.microsoft.com/office/mac/office/2008/main" xmlns:mv="urn:schemas-microsoft-com:mac:vml" xmlns:o="urn:schemas-microsoft-com:office:office" xmlns:r="http://schemas.openxmlformats.org/officeDocument/2006/relationships" xmlns:v="urn:schemas-microsoft-com:vml" xmlns:w10="urn:schemas-microsoft-com:office:word" xmlns:w14="http://schemas.microsoft.com/office/word/2010/wordml" xmlns:w="http://schemas.openxmlformats.org/wordprocessingml/2006/main" xmlns:wne="http://schemas.microsoft.com/office/word/2006/wordml" xmlns:wp14="http://schemas.microsoft.com/office/word/2010/wordprocessingDrawing" xmlns:wp="http://schemas.openxmlformats.org/drawingml/2006/wordprocessingDrawing" xmlns:wpc="http://schemas.microsoft.com/office/word/2010/wordprocessingCanvas" xmlns:wpg="http://schemas.microsoft.com/office/word/2010/wordprocessingGroup" xmlns:wpi="http://schemas.microsoft.com/office/word/2010/wordprocessingInk" xmlns:wps="http://schemas.microsoft.com/office/word/2010/wordprocessingShape" mc:Ignorable="w14 wp14">
+  <w:p>
+    <w:pPr>
+      <w:pStyle w:val="Header"/>
+      <w:spacing w:after="40"/>
+      <w:jc w:val="right"/>
+      <w:pBdr>
+        <w:bottom w:val="single" w:sz="4" w:space="2" w:color="808080"/>
+      </w:pBdr>
+    </w:pPr>
+    <w:r/>
+    <w:r>
+      <w:rPr>
+        <w:rFonts w:ascii="Arial" w:hAnsi="Arial"/>
+        <w:b/>
+        <w:color w:val="555555"/>
+        <w:sz w:val="20"/>
+      </w:rPr>
+      <w:t>13. Sensors</w:t>
+    </w:r>
+  </w:p>
+</w:hdr>
+</file>
+
+<file path=word/header143.xml><?xml version="1.0" encoding="utf-8"?>
+<w:hdr xmlns:m="http://schemas.openxmlformats.org/officeDocument/2006/math" xmlns:mc="http://schemas.openxmlformats.org/markup-compatibility/2006" xmlns:mo="http://schemas.microsoft.com/office/mac/office/2008/main" xmlns:mv="urn:schemas-microsoft-com:mac:vml" xmlns:o="urn:schemas-microsoft-com:office:office" xmlns:r="http://schemas.openxmlformats.org/officeDocument/2006/relationships" xmlns:v="urn:schemas-microsoft-com:vml" xmlns:w10="urn:schemas-microsoft-com:office:word" xmlns:w14="http://schemas.microsoft.com/office/word/2010/wordml" xmlns:w="http://schemas.openxmlformats.org/wordprocessingml/2006/main" xmlns:wne="http://schemas.microsoft.com/office/word/2006/wordml" xmlns:wp14="http://schemas.microsoft.com/office/word/2010/wordprocessingDrawing" xmlns:wp="http://schemas.openxmlformats.org/drawingml/2006/wordprocessingDrawing" xmlns:wpc="http://schemas.microsoft.com/office/word/2010/wordprocessingCanvas" xmlns:wpg="http://schemas.microsoft.com/office/word/2010/wordprocessingGroup" xmlns:wpi="http://schemas.microsoft.com/office/word/2010/wordprocessingInk" xmlns:wps="http://schemas.microsoft.com/office/word/2010/wordprocessingShape" mc:Ignorable="w14 wp14">
+  <w:p>
+    <w:pPr>
+      <w:pStyle w:val="Header"/>
+      <w:spacing w:after="40"/>
+      <w:jc w:val="right"/>
+      <w:pBdr>
+        <w:bottom w:val="single" w:sz="4" w:space="2" w:color="808080"/>
+      </w:pBdr>
+    </w:pPr>
+    <w:r/>
+    <w:r>
+      <w:rPr>
+        <w:rFonts w:ascii="Arial" w:hAnsi="Arial"/>
+        <w:b/>
+        <w:color w:val="555555"/>
+        <w:sz w:val="20"/>
+      </w:rPr>
+      <w:t>14. Time Synchronization</w:t>
+    </w:r>
+  </w:p>
+</w:hdr>
+</file>
+
+<file path=word/header144.xml><?xml version="1.0" encoding="utf-8"?>
+<w:hdr xmlns:m="http://schemas.openxmlformats.org/officeDocument/2006/math" xmlns:mc="http://schemas.openxmlformats.org/markup-compatibility/2006" xmlns:mo="http://schemas.microsoft.com/office/mac/office/2008/main" xmlns:mv="urn:schemas-microsoft-com:mac:vml" xmlns:o="urn:schemas-microsoft-com:office:office" xmlns:r="http://schemas.openxmlformats.org/officeDocument/2006/relationships" xmlns:v="urn:schemas-microsoft-com:vml" xmlns:w10="urn:schemas-microsoft-com:office:word" xmlns:w14="http://schemas.microsoft.com/office/word/2010/wordml" xmlns:w="http://schemas.openxmlformats.org/wordprocessingml/2006/main" xmlns:wne="http://schemas.microsoft.com/office/word/2006/wordml" xmlns:wp14="http://schemas.microsoft.com/office/word/2010/wordprocessingDrawing" xmlns:wp="http://schemas.openxmlformats.org/drawingml/2006/wordprocessingDrawing" xmlns:wpc="http://schemas.microsoft.com/office/word/2010/wordprocessingCanvas" xmlns:wpg="http://schemas.microsoft.com/office/word/2010/wordprocessingGroup" xmlns:wpi="http://schemas.microsoft.com/office/word/2010/wordprocessingInk" xmlns:wps="http://schemas.microsoft.com/office/word/2010/wordprocessingShape" mc:Ignorable="w14 wp14">
+  <w:p>
+    <w:pPr>
+      <w:pStyle w:val="Header"/>
+      <w:spacing w:after="40"/>
+      <w:jc w:val="right"/>
+      <w:pBdr>
+        <w:bottom w:val="single" w:sz="4" w:space="2" w:color="808080"/>
+      </w:pBdr>
+    </w:pPr>
+    <w:r/>
+    <w:r>
+      <w:rPr>
+        <w:rFonts w:ascii="Arial" w:hAnsi="Arial"/>
+        <w:b/>
+        <w:color w:val="555555"/>
+        <w:sz w:val="20"/>
+      </w:rPr>
+      <w:t>15. Firmware Updates</w:t>
+    </w:r>
+  </w:p>
+</w:hdr>
+</file>
+
+<file path=word/header145.xml><?xml version="1.0" encoding="utf-8"?>
+<w:hdr xmlns:m="http://schemas.openxmlformats.org/officeDocument/2006/math" xmlns:mc="http://schemas.openxmlformats.org/markup-compatibility/2006" xmlns:mo="http://schemas.microsoft.com/office/mac/office/2008/main" xmlns:mv="urn:schemas-microsoft-com:mac:vml" xmlns:o="urn:schemas-microsoft-com:office:office" xmlns:r="http://schemas.openxmlformats.org/officeDocument/2006/relationships" xmlns:v="urn:schemas-microsoft-com:vml" xmlns:w10="urn:schemas-microsoft-com:office:word" xmlns:w14="http://schemas.microsoft.com/office/word/2010/wordml" xmlns:w="http://schemas.openxmlformats.org/wordprocessingml/2006/main" xmlns:wne="http://schemas.microsoft.com/office/word/2006/wordml" xmlns:wp14="http://schemas.microsoft.com/office/word/2010/wordprocessingDrawing" xmlns:wp="http://schemas.openxmlformats.org/drawingml/2006/wordprocessingDrawing" xmlns:wpc="http://schemas.microsoft.com/office/word/2010/wordprocessingCanvas" xmlns:wpg="http://schemas.microsoft.com/office/word/2010/wordprocessingGroup" xmlns:wpi="http://schemas.microsoft.com/office/word/2010/wordprocessingInk" xmlns:wps="http://schemas.microsoft.com/office/word/2010/wordprocessingShape" mc:Ignorable="w14 wp14">
+  <w:p>
+    <w:pPr>
+      <w:pStyle w:val="Header"/>
+      <w:spacing w:after="40"/>
+      <w:jc w:val="right"/>
+      <w:pBdr>
+        <w:bottom w:val="single" w:sz="4" w:space="2" w:color="808080"/>
+      </w:pBdr>
+    </w:pPr>
+    <w:r/>
+    <w:r>
+      <w:rPr>
+        <w:rFonts w:ascii="Arial" w:hAnsi="Arial"/>
+        <w:b/>
+        <w:color w:val="555555"/>
+        <w:sz w:val="20"/>
+      </w:rPr>
+      <w:t>16. Factory Reset</w:t>
+    </w:r>
+  </w:p>
+</w:hdr>
+</file>
+
+<file path=word/header146.xml><?xml version="1.0" encoding="utf-8"?>
+<w:hdr xmlns:m="http://schemas.openxmlformats.org/officeDocument/2006/math" xmlns:mc="http://schemas.openxmlformats.org/markup-compatibility/2006" xmlns:mo="http://schemas.microsoft.com/office/mac/office/2008/main" xmlns:mv="urn:schemas-microsoft-com:mac:vml" xmlns:o="urn:schemas-microsoft-com:office:office" xmlns:r="http://schemas.openxmlformats.org/officeDocument/2006/relationships" xmlns:v="urn:schemas-microsoft-com:vml" xmlns:w10="urn:schemas-microsoft-com:office:word" xmlns:w14="http://schemas.microsoft.com/office/word/2010/wordml" xmlns:w="http://schemas.openxmlformats.org/wordprocessingml/2006/main" xmlns:wne="http://schemas.microsoft.com/office/word/2006/wordml" xmlns:wp14="http://schemas.microsoft.com/office/word/2010/wordprocessingDrawing" xmlns:wp="http://schemas.openxmlformats.org/drawingml/2006/wordprocessingDrawing" xmlns:wpc="http://schemas.microsoft.com/office/word/2010/wordprocessingCanvas" xmlns:wpg="http://schemas.microsoft.com/office/word/2010/wordprocessingGroup" xmlns:wpi="http://schemas.microsoft.com/office/word/2010/wordprocessingInk" xmlns:wps="http://schemas.microsoft.com/office/word/2010/wordprocessingShape" mc:Ignorable="w14 wp14">
+  <w:p>
+    <w:pPr>
+      <w:pStyle w:val="Header"/>
+      <w:spacing w:after="40"/>
+      <w:jc w:val="right"/>
+      <w:pBdr>
+        <w:bottom w:val="single" w:sz="4" w:space="2" w:color="808080"/>
+      </w:pBdr>
+    </w:pPr>
+    <w:r/>
+    <w:r>
+      <w:rPr>
+        <w:rFonts w:ascii="Arial" w:hAnsi="Arial"/>
+        <w:b/>
+        <w:color w:val="555555"/>
+        <w:sz w:val="20"/>
+      </w:rPr>
+      <w:t>17. Display Messages</w:t>
+    </w:r>
+  </w:p>
+</w:hdr>
+</file>
+
+<file path=word/header147.xml><?xml version="1.0" encoding="utf-8"?>
+<w:hdr xmlns:m="http://schemas.openxmlformats.org/officeDocument/2006/math" xmlns:mc="http://schemas.openxmlformats.org/markup-compatibility/2006" xmlns:mo="http://schemas.microsoft.com/office/mac/office/2008/main" xmlns:mv="urn:schemas-microsoft-com:mac:vml" xmlns:o="urn:schemas-microsoft-com:office:office" xmlns:r="http://schemas.openxmlformats.org/officeDocument/2006/relationships" xmlns:v="urn:schemas-microsoft-com:vml" xmlns:w10="urn:schemas-microsoft-com:office:word" xmlns:w14="http://schemas.microsoft.com/office/word/2010/wordml" xmlns:w="http://schemas.openxmlformats.org/wordprocessingml/2006/main" xmlns:wne="http://schemas.microsoft.com/office/word/2006/wordml" xmlns:wp14="http://schemas.microsoft.com/office/word/2010/wordprocessingDrawing" xmlns:wp="http://schemas.openxmlformats.org/drawingml/2006/wordprocessingDrawing" xmlns:wpc="http://schemas.microsoft.com/office/word/2010/wordprocessingCanvas" xmlns:wpg="http://schemas.microsoft.com/office/word/2010/wordprocessingGroup" xmlns:wpi="http://schemas.microsoft.com/office/word/2010/wordprocessingInk" xmlns:wps="http://schemas.microsoft.com/office/word/2010/wordprocessingShape" mc:Ignorable="w14 wp14">
+  <w:p>
+    <w:pPr>
+      <w:pStyle w:val="Header"/>
+      <w:spacing w:after="40"/>
+      <w:jc w:val="right"/>
+      <w:pBdr>
+        <w:bottom w:val="single" w:sz="4" w:space="2" w:color="808080"/>
+      </w:pBdr>
+    </w:pPr>
+    <w:r/>
+    <w:r>
+      <w:rPr>
+        <w:rFonts w:ascii="Arial" w:hAnsi="Arial"/>
+        <w:b/>
+        <w:color w:val="555555"/>
+        <w:sz w:val="20"/>
+      </w:rPr>
+      <w:t>18. Troubleshooting</w:t>
+    </w:r>
+  </w:p>
+</w:hdr>
+</file>
+
+<file path=word/header148.xml><?xml version="1.0" encoding="utf-8"?>
+<w:hdr xmlns:m="http://schemas.openxmlformats.org/officeDocument/2006/math" xmlns:mc="http://schemas.openxmlformats.org/markup-compatibility/2006" xmlns:mo="http://schemas.microsoft.com/office/mac/office/2008/main" xmlns:mv="urn:schemas-microsoft-com:mac:vml" xmlns:o="urn:schemas-microsoft-com:office:office" xmlns:r="http://schemas.openxmlformats.org/officeDocument/2006/relationships" xmlns:v="urn:schemas-microsoft-com:vml" xmlns:w10="urn:schemas-microsoft-com:office:word" xmlns:w14="http://schemas.microsoft.com/office/word/2010/wordml" xmlns:w="http://schemas.openxmlformats.org/wordprocessingml/2006/main" xmlns:wne="http://schemas.microsoft.com/office/word/2006/wordml" xmlns:wp14="http://schemas.microsoft.com/office/word/2010/wordprocessingDrawing" xmlns:wp="http://schemas.openxmlformats.org/drawingml/2006/wordprocessingDrawing" xmlns:wpc="http://schemas.microsoft.com/office/word/2010/wordprocessingCanvas" xmlns:wpg="http://schemas.microsoft.com/office/word/2010/wordprocessingGroup" xmlns:wpi="http://schemas.microsoft.com/office/word/2010/wordprocessingInk" xmlns:wps="http://schemas.microsoft.com/office/word/2010/wordprocessingShape" mc:Ignorable="w14 wp14">
+  <w:p>
+    <w:pPr>
+      <w:pStyle w:val="Header"/>
+      <w:spacing w:after="40"/>
+      <w:jc w:val="right"/>
+      <w:pBdr>
+        <w:bottom w:val="single" w:sz="4" w:space="2" w:color="808080"/>
+      </w:pBdr>
+    </w:pPr>
+    <w:r/>
+    <w:r>
+      <w:rPr>
+        <w:rFonts w:ascii="Arial" w:hAnsi="Arial"/>
+        <w:b/>
+        <w:color w:val="555555"/>
+        <w:sz w:val="20"/>
+      </w:rPr>
+      <w:t>Copyright and Disclaimer</w:t>
     </w:r>
   </w:p>
 </w:hdr>

</xml_diff>